<commit_message>
Test react commit ofc
</commit_message>
<xml_diff>
--- a/Commands.docx
+++ b/Commands.docx
@@ -1,6 +1,6 @@
 
 <file path=word/document.xml><?xml version="1.0" encoding="utf-8"?>
-<w:document xmlns:wpc="http://schemas.microsoft.com/office/word/2010/wordprocessingCanvas" xmlns:cx="http://schemas.microsoft.com/office/drawing/2014/chartex" xmlns:cx1="http://schemas.microsoft.com/office/drawing/2015/9/8/chartex" xmlns:mc="http://schemas.openxmlformats.org/markup-compatibility/2006" xmlns:o="urn:schemas-microsoft-com:office:office" xmlns:r="http://schemas.openxmlformats.org/officeDocument/2006/relationships" xmlns:m="http://schemas.openxmlformats.org/officeDocument/2006/math" xmlns:v="urn:schemas-microsoft-com:vml" xmlns:wp14="http://schemas.microsoft.com/office/word/2010/wordprocessingDrawing" xmlns:wp="http://schemas.openxmlformats.org/drawingml/2006/wordprocessingDrawing" xmlns:w10="urn:schemas-microsoft-com:office:word" xmlns:w="http://schemas.openxmlformats.org/wordprocessingml/2006/main" xmlns:w14="http://schemas.microsoft.com/office/word/2010/wordml" xmlns:w15="http://schemas.microsoft.com/office/word/2012/wordml" xmlns:w16se="http://schemas.microsoft.com/office/word/2015/wordml/symex" xmlns:wpg="http://schemas.microsoft.com/office/word/2010/wordprocessingGroup" xmlns:wpi="http://schemas.microsoft.com/office/word/2010/wordprocessingInk" xmlns:wne="http://schemas.microsoft.com/office/word/2006/wordml" xmlns:wps="http://schemas.microsoft.com/office/word/2010/wordprocessingShape" mc:Ignorable="w14 w15 w16se wp14">
+<w:document xmlns:wpc="http://schemas.microsoft.com/office/word/2010/wordprocessingCanvas" xmlns:cx="http://schemas.microsoft.com/office/drawing/2014/chartex" xmlns:cx1="http://schemas.microsoft.com/office/drawing/2015/9/8/chartex" xmlns:cx2="http://schemas.microsoft.com/office/drawing/2015/10/21/chartex" xmlns:cx3="http://schemas.microsoft.com/office/drawing/2016/5/9/chartex" xmlns:cx4="http://schemas.microsoft.com/office/drawing/2016/5/10/chartex" xmlns:cx5="http://schemas.microsoft.com/office/drawing/2016/5/11/chartex" xmlns:cx6="http://schemas.microsoft.com/office/drawing/2016/5/12/chartex" xmlns:cx7="http://schemas.microsoft.com/office/drawing/2016/5/13/chartex" xmlns:cx8="http://schemas.microsoft.com/office/drawing/2016/5/14/chartex" xmlns:mc="http://schemas.openxmlformats.org/markup-compatibility/2006" xmlns:aink="http://schemas.microsoft.com/office/drawing/2016/ink" xmlns:am3d="http://schemas.microsoft.com/office/drawing/2017/model3d" xmlns:o="urn:schemas-microsoft-com:office:office" xmlns:oel="http://schemas.microsoft.com/office/2019/extlst" xmlns:r="http://schemas.openxmlformats.org/officeDocument/2006/relationships" xmlns:m="http://schemas.openxmlformats.org/officeDocument/2006/math" xmlns:v="urn:schemas-microsoft-com:vml" xmlns:wp14="http://schemas.microsoft.com/office/word/2010/wordprocessingDrawing" xmlns:wp="http://schemas.openxmlformats.org/drawingml/2006/wordprocessingDrawing" xmlns:w10="urn:schemas-microsoft-com:office:word" xmlns:w="http://schemas.openxmlformats.org/wordprocessingml/2006/main" xmlns:w14="http://schemas.microsoft.com/office/word/2010/wordml" xmlns:w15="http://schemas.microsoft.com/office/word/2012/wordml" xmlns:w16cex="http://schemas.microsoft.com/office/word/2018/wordml/cex" xmlns:w16cid="http://schemas.microsoft.com/office/word/2016/wordml/cid" xmlns:w16="http://schemas.microsoft.com/office/word/2018/wordml" xmlns:w16du="http://schemas.microsoft.com/office/word/2023/wordml/word16du" xmlns:w16sdtdh="http://schemas.microsoft.com/office/word/2020/wordml/sdtdatahash" xmlns:w16sdtfl="http://schemas.microsoft.com/office/word/2024/wordml/sdtformatlock" xmlns:w16se="http://schemas.microsoft.com/office/word/2015/wordml/symex" xmlns:wpg="http://schemas.microsoft.com/office/word/2010/wordprocessingGroup" xmlns:wpi="http://schemas.microsoft.com/office/word/2010/wordprocessingInk" xmlns:wne="http://schemas.microsoft.com/office/word/2006/wordml" xmlns:wps="http://schemas.microsoft.com/office/word/2010/wordprocessingShape" mc:Ignorable="w14 w15 w16se w16cid w16 w16cex w16sdtdh w16sdtfl w16du wp14">
   <w:body>
     <w:p>
       <w:pPr>
@@ -54,7 +54,6 @@
           <w:lang w:val="en-US"/>
         </w:rPr>
       </w:pPr>
-      <w:proofErr w:type="spellStart"/>
       <w:r>
         <w:rPr>
           <w:rFonts w:cstheme="minorHAnsi"/>
@@ -67,15 +66,7 @@
           <w:rFonts w:cstheme="minorHAnsi"/>
           <w:lang w:val="en-US"/>
         </w:rPr>
-        <w:t>pm</w:t>
-      </w:r>
-      <w:proofErr w:type="spellEnd"/>
-      <w:r>
-        <w:rPr>
-          <w:rFonts w:cstheme="minorHAnsi"/>
-          <w:lang w:val="en-US"/>
-        </w:rPr>
-        <w:t xml:space="preserve"> </w:t>
+        <w:t xml:space="preserve">pm </w:t>
       </w:r>
       <w:r>
         <w:rPr>
@@ -145,33 +136,8 @@
           <w:rFonts w:cstheme="minorHAnsi"/>
           <w:lang w:val="en-US"/>
         </w:rPr>
-        <w:t xml:space="preserve"> node </w:t>
-      </w:r>
-      <w:proofErr w:type="spellStart"/>
-      <w:r>
-        <w:rPr>
-          <w:rFonts w:cstheme="minorHAnsi"/>
-          <w:lang w:val="en-US"/>
-        </w:rPr>
-        <w:t>vue</w:t>
-      </w:r>
-      <w:proofErr w:type="spellEnd"/>
-      <w:r>
-        <w:rPr>
-          <w:rFonts w:cstheme="minorHAnsi"/>
-          <w:lang w:val="en-US"/>
-        </w:rPr>
-        <w:t xml:space="preserve"> </w:t>
-      </w:r>
-      <w:proofErr w:type="spellStart"/>
-      <w:r>
-        <w:rPr>
-          <w:rFonts w:cstheme="minorHAnsi"/>
-          <w:lang w:val="en-US"/>
-        </w:rPr>
-        <w:t>js</w:t>
-      </w:r>
-      <w:proofErr w:type="spellEnd"/>
+        <w:t xml:space="preserve"> node vue js</w:t>
+      </w:r>
     </w:p>
     <w:p>
       <w:pPr>
@@ -185,22 +151,13 @@
           <w:lang w:val="en-US"/>
         </w:rPr>
       </w:pPr>
-      <w:proofErr w:type="spellStart"/>
       <w:proofErr w:type="gramStart"/>
       <w:r>
         <w:rPr>
           <w:rFonts w:cstheme="minorHAnsi"/>
           <w:lang w:val="en-US"/>
         </w:rPr>
-        <w:t>npm</w:t>
-      </w:r>
-      <w:proofErr w:type="spellEnd"/>
-      <w:r>
-        <w:rPr>
-          <w:rFonts w:cstheme="minorHAnsi"/>
-          <w:lang w:val="en-US"/>
-        </w:rPr>
-        <w:t xml:space="preserve">  create</w:t>
+        <w:t>npm  create</w:t>
       </w:r>
       <w:proofErr w:type="gramEnd"/>
       <w:r>
@@ -208,7 +165,23 @@
           <w:rFonts w:cstheme="minorHAnsi"/>
           <w:lang w:val="en-US"/>
         </w:rPr>
-        <w:t xml:space="preserve"> React-Blog(Create new project_</w:t>
+        <w:t xml:space="preserve"> React-</w:t>
+      </w:r>
+      <w:proofErr w:type="gramStart"/>
+      <w:r>
+        <w:rPr>
+          <w:rFonts w:cstheme="minorHAnsi"/>
+          <w:lang w:val="en-US"/>
+        </w:rPr>
+        <w:t>Blog(</w:t>
+      </w:r>
+      <w:proofErr w:type="gramEnd"/>
+      <w:r>
+        <w:rPr>
+          <w:rFonts w:cstheme="minorHAnsi"/>
+          <w:lang w:val="en-US"/>
+        </w:rPr>
+        <w:t>Create new project_</w:t>
       </w:r>
     </w:p>
     <w:p>
@@ -289,7 +262,6 @@
           <w:lang w:val="en-US"/>
         </w:rPr>
       </w:pPr>
-      <w:proofErr w:type="spellStart"/>
       <w:r>
         <w:rPr>
           <w:rFonts w:cstheme="minorHAnsi"/>
@@ -298,18 +270,7 @@
           <w:szCs w:val="21"/>
           <w:shd w:val="clear" w:color="auto" w:fill="FFFFFF"/>
         </w:rPr>
-        <w:t>npm</w:t>
-      </w:r>
-      <w:proofErr w:type="spellEnd"/>
-      <w:r>
-        <w:rPr>
-          <w:rFonts w:cstheme="minorHAnsi"/>
-          <w:color w:val="0F0F0F"/>
-          <w:sz w:val="21"/>
-          <w:szCs w:val="21"/>
-          <w:shd w:val="clear" w:color="auto" w:fill="FFFFFF"/>
-        </w:rPr>
-        <w:t xml:space="preserve"> run dev</w:t>
+        <w:t>npm run dev</w:t>
       </w:r>
     </w:p>
     <w:p>
@@ -384,17 +345,8 @@
           <w:rFonts w:cstheme="minorHAnsi"/>
           <w:lang w:val="en-US"/>
         </w:rPr>
-        <w:t xml:space="preserve">Minimize file in </w:t>
-      </w:r>
-      <w:proofErr w:type="spellStart"/>
-      <w:r>
-        <w:rPr>
-          <w:rFonts w:cstheme="minorHAnsi"/>
-          <w:lang w:val="en-US"/>
-        </w:rPr>
-        <w:t>buid</w:t>
-      </w:r>
-      <w:proofErr w:type="spellEnd"/>
+        <w:t>Minimize file in buid</w:t>
+      </w:r>
     </w:p>
     <w:p>
       <w:pPr>
@@ -751,7 +703,6 @@
         </w:rPr>
         <w:t xml:space="preserve"> </w:t>
       </w:r>
-      <w:proofErr w:type="spellStart"/>
       <w:r>
         <w:rPr>
           <w:rFonts w:ascii="Consolas" w:eastAsia="Times New Roman" w:hAnsi="Consolas" w:cs="Times New Roman"/>
@@ -762,7 +713,6 @@
         </w:rPr>
         <w:t>src</w:t>
       </w:r>
-      <w:proofErr w:type="spellEnd"/>
       <w:r>
         <w:rPr>
           <w:rFonts w:ascii="Consolas" w:eastAsia="Times New Roman" w:hAnsi="Consolas" w:cs="Times New Roman"/>
@@ -781,51 +731,7 @@
           <w:szCs w:val="21"/>
           <w:lang w:eastAsia="en-IN"/>
         </w:rPr>
-        <w:t>"/</w:t>
-      </w:r>
-      <w:proofErr w:type="spellStart"/>
-      <w:r>
-        <w:rPr>
-          <w:rFonts w:ascii="Consolas" w:eastAsia="Times New Roman" w:hAnsi="Consolas" w:cs="Times New Roman"/>
-          <w:color w:val="CE9178"/>
-          <w:sz w:val="21"/>
-          <w:szCs w:val="21"/>
-          <w:lang w:eastAsia="en-IN"/>
-        </w:rPr>
-        <w:t>src</w:t>
-      </w:r>
-      <w:proofErr w:type="spellEnd"/>
-      <w:r>
-        <w:rPr>
-          <w:rFonts w:ascii="Consolas" w:eastAsia="Times New Roman" w:hAnsi="Consolas" w:cs="Times New Roman"/>
-          <w:color w:val="CE9178"/>
-          <w:sz w:val="21"/>
-          <w:szCs w:val="21"/>
-          <w:lang w:eastAsia="en-IN"/>
-        </w:rPr>
-        <w:t>/</w:t>
-      </w:r>
-      <w:proofErr w:type="spellStart"/>
-      <w:r>
-        <w:rPr>
-          <w:rFonts w:ascii="Consolas" w:eastAsia="Times New Roman" w:hAnsi="Consolas" w:cs="Times New Roman"/>
-          <w:color w:val="CE9178"/>
-          <w:sz w:val="21"/>
-          <w:szCs w:val="21"/>
-          <w:lang w:eastAsia="en-IN"/>
-        </w:rPr>
-        <w:t>main.jsx</w:t>
-      </w:r>
-      <w:proofErr w:type="spellEnd"/>
-      <w:r>
-        <w:rPr>
-          <w:rFonts w:ascii="Consolas" w:eastAsia="Times New Roman" w:hAnsi="Consolas" w:cs="Times New Roman"/>
-          <w:color w:val="CE9178"/>
-          <w:sz w:val="21"/>
-          <w:szCs w:val="21"/>
-          <w:lang w:eastAsia="en-IN"/>
-        </w:rPr>
-        <w:t>"</w:t>
+        <w:t>"/src/main.jsx"</w:t>
       </w:r>
       <w:r>
         <w:rPr>
@@ -928,17 +834,8 @@
           <w:rFonts w:cstheme="minorHAnsi"/>
           <w:lang w:val="en-US"/>
         </w:rPr>
-        <w:t xml:space="preserve">     2. </w:t>
-      </w:r>
-      <w:proofErr w:type="spellStart"/>
-      <w:r>
-        <w:rPr>
-          <w:rFonts w:cstheme="minorHAnsi"/>
-          <w:lang w:val="en-US"/>
-        </w:rPr>
-        <w:t>main.jsx</w:t>
-      </w:r>
-      <w:proofErr w:type="spellEnd"/>
+        <w:t xml:space="preserve">     2. main.jsx</w:t>
+      </w:r>
     </w:p>
     <w:p>
       <w:pPr>
@@ -1020,29 +917,7 @@
           <w:szCs w:val="21"/>
           <w:lang w:eastAsia="en-IN"/>
         </w:rPr>
-        <w:t>'./</w:t>
-      </w:r>
-      <w:proofErr w:type="spellStart"/>
-      <w:r>
-        <w:rPr>
-          <w:rFonts w:ascii="Consolas" w:eastAsia="Times New Roman" w:hAnsi="Consolas" w:cs="Times New Roman"/>
-          <w:color w:val="CE9178"/>
-          <w:sz w:val="21"/>
-          <w:szCs w:val="21"/>
-          <w:lang w:eastAsia="en-IN"/>
-        </w:rPr>
-        <w:t>App.jsx</w:t>
-      </w:r>
-      <w:proofErr w:type="spellEnd"/>
-      <w:r>
-        <w:rPr>
-          <w:rFonts w:ascii="Consolas" w:eastAsia="Times New Roman" w:hAnsi="Consolas" w:cs="Times New Roman"/>
-          <w:color w:val="CE9178"/>
-          <w:sz w:val="21"/>
-          <w:szCs w:val="21"/>
-          <w:lang w:eastAsia="en-IN"/>
-        </w:rPr>
-        <w:t>'</w:t>
+        <w:t>'./App.jsx'</w:t>
       </w:r>
     </w:p>
     <w:p>
@@ -1070,7 +945,6 @@
           <w:lang w:eastAsia="en-IN"/>
         </w:rPr>
       </w:pPr>
-      <w:proofErr w:type="spellStart"/>
       <w:r>
         <w:rPr>
           <w:rFonts w:ascii="Consolas" w:eastAsia="Times New Roman" w:hAnsi="Consolas" w:cs="Times New Roman"/>
@@ -1081,7 +955,6 @@
         </w:rPr>
         <w:t>createRoot</w:t>
       </w:r>
-      <w:proofErr w:type="spellEnd"/>
       <w:r>
         <w:rPr>
           <w:rFonts w:ascii="Consolas" w:eastAsia="Times New Roman" w:hAnsi="Consolas" w:cs="Times New Roman"/>
@@ -1092,7 +965,6 @@
         </w:rPr>
         <w:t>(</w:t>
       </w:r>
-      <w:proofErr w:type="spellStart"/>
       <w:proofErr w:type="gramStart"/>
       <w:r>
         <w:rPr>
@@ -1124,7 +996,6 @@
         </w:rPr>
         <w:t>getElementById</w:t>
       </w:r>
-      <w:proofErr w:type="spellEnd"/>
       <w:proofErr w:type="gramEnd"/>
       <w:r>
         <w:rPr>
@@ -1154,7 +1025,18 @@
           <w:szCs w:val="21"/>
           <w:lang w:eastAsia="en-IN"/>
         </w:rPr>
-        <w:t>)).</w:t>
+        <w:t>)</w:t>
+      </w:r>
+      <w:proofErr w:type="gramStart"/>
+      <w:r>
+        <w:rPr>
+          <w:rFonts w:ascii="Consolas" w:eastAsia="Times New Roman" w:hAnsi="Consolas" w:cs="Times New Roman"/>
+          <w:color w:val="CCCCCC"/>
+          <w:sz w:val="21"/>
+          <w:szCs w:val="21"/>
+          <w:lang w:eastAsia="en-IN"/>
+        </w:rPr>
+        <w:t>).</w:t>
       </w:r>
       <w:r>
         <w:rPr>
@@ -1166,6 +1048,7 @@
         </w:rPr>
         <w:t>render</w:t>
       </w:r>
+      <w:proofErr w:type="gramEnd"/>
       <w:r>
         <w:rPr>
           <w:rFonts w:ascii="Consolas" w:eastAsia="Times New Roman" w:hAnsi="Consolas" w:cs="Times New Roman"/>
@@ -1209,7 +1092,6 @@
         </w:rPr>
         <w:t>&lt;</w:t>
       </w:r>
-      <w:proofErr w:type="spellStart"/>
       <w:r>
         <w:rPr>
           <w:rFonts w:ascii="Consolas" w:eastAsia="Times New Roman" w:hAnsi="Consolas" w:cs="Times New Roman"/>
@@ -1220,7 +1102,6 @@
         </w:rPr>
         <w:t>StrictMode</w:t>
       </w:r>
-      <w:proofErr w:type="spellEnd"/>
       <w:r>
         <w:rPr>
           <w:rFonts w:ascii="Consolas" w:eastAsia="Times New Roman" w:hAnsi="Consolas" w:cs="Times New Roman"/>
@@ -1327,7 +1208,6 @@
         </w:rPr>
         <w:t>&lt;/</w:t>
       </w:r>
-      <w:proofErr w:type="spellStart"/>
       <w:r>
         <w:rPr>
           <w:rFonts w:ascii="Consolas" w:eastAsia="Times New Roman" w:hAnsi="Consolas" w:cs="Times New Roman"/>
@@ -1338,7 +1218,6 @@
         </w:rPr>
         <w:t>StrictMode</w:t>
       </w:r>
-      <w:proofErr w:type="spellEnd"/>
       <w:r>
         <w:rPr>
           <w:rFonts w:ascii="Consolas" w:eastAsia="Times New Roman" w:hAnsi="Consolas" w:cs="Times New Roman"/>
@@ -1486,7 +1365,6 @@
         </w:rPr>
         <w:t xml:space="preserve"> </w:t>
       </w:r>
-      <w:proofErr w:type="spellStart"/>
       <w:proofErr w:type="gramStart"/>
       <w:r>
         <w:rPr>
@@ -1498,7 +1376,6 @@
         </w:rPr>
         <w:t>FirstModule</w:t>
       </w:r>
-      <w:proofErr w:type="spellEnd"/>
       <w:r>
         <w:rPr>
           <w:rFonts w:ascii="Consolas" w:eastAsia="Times New Roman" w:hAnsi="Consolas" w:cs="Times New Roman"/>
@@ -1543,7 +1420,6 @@
         </w:rPr>
         <w:t xml:space="preserve">  </w:t>
       </w:r>
-      <w:proofErr w:type="spellStart"/>
       <w:r>
         <w:rPr>
           <w:rFonts w:ascii="Consolas" w:eastAsia="Times New Roman" w:hAnsi="Consolas" w:cs="Times New Roman"/>
@@ -1554,7 +1430,6 @@
         </w:rPr>
         <w:t>const</w:t>
       </w:r>
-      <w:proofErr w:type="spellEnd"/>
       <w:r>
         <w:rPr>
           <w:rFonts w:ascii="Consolas" w:eastAsia="Times New Roman" w:hAnsi="Consolas" w:cs="Times New Roman"/>
@@ -1585,7 +1460,6 @@
         </w:rPr>
         <w:t xml:space="preserve">, </w:t>
       </w:r>
-      <w:proofErr w:type="spellStart"/>
       <w:r>
         <w:rPr>
           <w:rFonts w:ascii="Consolas" w:eastAsia="Times New Roman" w:hAnsi="Consolas" w:cs="Times New Roman"/>
@@ -1596,7 +1470,6 @@
         </w:rPr>
         <w:t>setCount</w:t>
       </w:r>
-      <w:proofErr w:type="spellEnd"/>
       <w:r>
         <w:rPr>
           <w:rFonts w:ascii="Consolas" w:eastAsia="Times New Roman" w:hAnsi="Consolas" w:cs="Times New Roman"/>
@@ -1627,7 +1500,6 @@
         </w:rPr>
         <w:t xml:space="preserve"> </w:t>
       </w:r>
-      <w:proofErr w:type="spellStart"/>
       <w:proofErr w:type="gramStart"/>
       <w:r>
         <w:rPr>
@@ -1639,7 +1511,6 @@
         </w:rPr>
         <w:t>useState</w:t>
       </w:r>
-      <w:proofErr w:type="spellEnd"/>
       <w:r>
         <w:rPr>
           <w:rFonts w:ascii="Consolas" w:eastAsia="Times New Roman" w:hAnsi="Consolas" w:cs="Times New Roman"/>
@@ -2008,7 +1879,6 @@
         </w:rPr>
         <w:t xml:space="preserve"> </w:t>
       </w:r>
-      <w:proofErr w:type="spellStart"/>
       <w:r>
         <w:rPr>
           <w:rFonts w:ascii="Consolas" w:eastAsia="Times New Roman" w:hAnsi="Consolas" w:cs="Times New Roman"/>
@@ -2019,7 +1889,6 @@
         </w:rPr>
         <w:t>FirstModule</w:t>
       </w:r>
-      <w:proofErr w:type="spellEnd"/>
     </w:p>
     <w:p>
       <w:pPr>
@@ -2050,33 +1919,8 @@
           <w:lang w:val="en-US"/>
         </w:rPr>
         <w:lastRenderedPageBreak/>
-        <w:t xml:space="preserve">JSX: </w:t>
-      </w:r>
-      <w:proofErr w:type="spellStart"/>
-      <w:r>
-        <w:rPr>
-          <w:rFonts w:cstheme="minorHAnsi"/>
-          <w:lang w:val="en-US"/>
-        </w:rPr>
-        <w:t>javaScript</w:t>
-      </w:r>
-      <w:proofErr w:type="spellEnd"/>
-      <w:r>
-        <w:rPr>
-          <w:rFonts w:cstheme="minorHAnsi"/>
-          <w:lang w:val="en-US"/>
-        </w:rPr>
-        <w:t xml:space="preserve"> </w:t>
-      </w:r>
-      <w:proofErr w:type="spellStart"/>
-      <w:r>
-        <w:rPr>
-          <w:rFonts w:cstheme="minorHAnsi"/>
-          <w:lang w:val="en-US"/>
-        </w:rPr>
-        <w:t>Extention</w:t>
-      </w:r>
-      <w:proofErr w:type="spellEnd"/>
+        <w:t>JSX: javaScript Extention</w:t>
+      </w:r>
     </w:p>
     <w:p>
       <w:pPr>
@@ -2107,23 +1951,7 @@
           <w:rFonts w:cstheme="minorHAnsi"/>
           <w:lang w:val="en-US"/>
         </w:rPr>
-        <w:t xml:space="preserve"> </w:t>
-      </w:r>
-      <w:proofErr w:type="spellStart"/>
-      <w:r>
-        <w:rPr>
-          <w:rFonts w:cstheme="minorHAnsi"/>
-          <w:lang w:val="en-US"/>
-        </w:rPr>
-        <w:t>libray</w:t>
-      </w:r>
-      <w:proofErr w:type="spellEnd"/>
-      <w:r>
-        <w:rPr>
-          <w:rFonts w:cstheme="minorHAnsi"/>
-          <w:lang w:val="en-US"/>
-        </w:rPr>
-        <w:t>: we can decide its flow</w:t>
+        <w:t xml:space="preserve"> libray: we can decide its flow</w:t>
       </w:r>
     </w:p>
     <w:p>
@@ -2139,23 +1967,7 @@
           <w:rFonts w:cstheme="minorHAnsi"/>
           <w:lang w:val="en-US"/>
         </w:rPr>
-        <w:t xml:space="preserve">For </w:t>
-      </w:r>
-      <w:proofErr w:type="gramStart"/>
-      <w:r>
-        <w:rPr>
-          <w:rFonts w:cstheme="minorHAnsi"/>
-          <w:lang w:val="en-US"/>
-        </w:rPr>
-        <w:t>framework :</w:t>
-      </w:r>
-      <w:proofErr w:type="gramEnd"/>
-      <w:r>
-        <w:rPr>
-          <w:rFonts w:cstheme="minorHAnsi"/>
-          <w:lang w:val="en-US"/>
-        </w:rPr>
-        <w:t xml:space="preserve"> it has its fixed type</w:t>
+        <w:t>For framework : it has its fixed type</w:t>
       </w:r>
     </w:p>
     <w:p>
@@ -2219,8 +2031,6 @@
           <w:lang w:val="en-US"/>
         </w:rPr>
       </w:pPr>
-      <w:proofErr w:type="spellStart"/>
-      <w:proofErr w:type="gramStart"/>
       <w:r>
         <w:rPr>
           <w:rFonts w:cstheme="minorHAnsi"/>
@@ -2228,8 +2038,6 @@
         </w:rPr>
         <w:t>package.json</w:t>
       </w:r>
-      <w:proofErr w:type="spellEnd"/>
-      <w:proofErr w:type="gramEnd"/>
     </w:p>
     <w:p>
       <w:pPr>
@@ -2303,7 +2111,6 @@
         </w:rPr>
         <w:t xml:space="preserve"> </w:t>
       </w:r>
-      <w:proofErr w:type="spellStart"/>
       <w:r>
         <w:rPr>
           <w:rFonts w:ascii="Consolas" w:eastAsia="Times New Roman" w:hAnsi="Consolas" w:cs="Times New Roman"/>
@@ -2314,7 +2121,6 @@
         </w:rPr>
         <w:t>devDependencies</w:t>
       </w:r>
-      <w:proofErr w:type="spellEnd"/>
       <w:r>
         <w:rPr>
           <w:rFonts w:ascii="Consolas" w:eastAsia="Times New Roman" w:hAnsi="Consolas" w:cs="Times New Roman"/>
@@ -2333,10 +2139,8 @@
           <w:szCs w:val="21"/>
           <w:lang w:eastAsia="en-IN"/>
         </w:rPr>
-        <w:t xml:space="preserve"> development </w:t>
-      </w:r>
-      <w:proofErr w:type="spellStart"/>
-      <w:proofErr w:type="gramStart"/>
+        <w:t xml:space="preserve"> development dependancies.</w:t>
+      </w:r>
       <w:r>
         <w:rPr>
           <w:rFonts w:ascii="Consolas" w:eastAsia="Times New Roman" w:hAnsi="Consolas" w:cs="Times New Roman"/>
@@ -2345,7 +2149,7 @@
           <w:szCs w:val="21"/>
           <w:lang w:eastAsia="en-IN"/>
         </w:rPr>
-        <w:t>dependancies.</w:t>
+        <w:t>because which we can do development</w:t>
       </w:r>
       <w:r>
         <w:rPr>
@@ -2355,28 +2159,6 @@
           <w:szCs w:val="21"/>
           <w:lang w:eastAsia="en-IN"/>
         </w:rPr>
-        <w:t>because</w:t>
-      </w:r>
-      <w:proofErr w:type="spellEnd"/>
-      <w:proofErr w:type="gramEnd"/>
-      <w:r>
-        <w:rPr>
-          <w:rFonts w:ascii="Consolas" w:eastAsia="Times New Roman" w:hAnsi="Consolas" w:cs="Times New Roman"/>
-          <w:color w:val="9CDCFE"/>
-          <w:sz w:val="21"/>
-          <w:szCs w:val="21"/>
-          <w:lang w:eastAsia="en-IN"/>
-        </w:rPr>
-        <w:t xml:space="preserve"> which we can do development</w:t>
-      </w:r>
-      <w:r>
-        <w:rPr>
-          <w:rFonts w:ascii="Consolas" w:eastAsia="Times New Roman" w:hAnsi="Consolas" w:cs="Times New Roman"/>
-          <w:color w:val="9CDCFE"/>
-          <w:sz w:val="21"/>
-          <w:szCs w:val="21"/>
-          <w:lang w:eastAsia="en-IN"/>
-        </w:rPr>
         <w:t>.</w:t>
       </w:r>
     </w:p>
@@ -2389,21 +2171,12 @@
           <w:lang w:val="en-US"/>
         </w:rPr>
       </w:pPr>
-      <w:proofErr w:type="spellStart"/>
-      <w:r>
-        <w:rPr>
-          <w:rFonts w:cstheme="minorHAnsi"/>
-          <w:lang w:val="en-US"/>
-        </w:rPr>
-        <w:t>node_module</w:t>
-      </w:r>
-      <w:proofErr w:type="spellEnd"/>
-      <w:r>
-        <w:rPr>
-          <w:rFonts w:cstheme="minorHAnsi"/>
-          <w:lang w:val="en-US"/>
-        </w:rPr>
-        <w:t>:</w:t>
+      <w:r>
+        <w:rPr>
+          <w:rFonts w:cstheme="minorHAnsi"/>
+          <w:lang w:val="en-US"/>
+        </w:rPr>
+        <w:t>node_module:</w:t>
       </w:r>
     </w:p>
     <w:p>
@@ -2427,39 +2200,7 @@
           <w:rFonts w:cstheme="minorHAnsi"/>
           <w:lang w:val="en-US"/>
         </w:rPr>
-        <w:t xml:space="preserve">all mentioned </w:t>
-      </w:r>
-      <w:proofErr w:type="spellStart"/>
-      <w:r>
-        <w:rPr>
-          <w:rFonts w:cstheme="minorHAnsi"/>
-          <w:lang w:val="en-US"/>
-        </w:rPr>
-        <w:t>dependancies</w:t>
-      </w:r>
-      <w:proofErr w:type="spellEnd"/>
-      <w:r>
-        <w:rPr>
-          <w:rFonts w:cstheme="minorHAnsi"/>
-          <w:lang w:val="en-US"/>
-        </w:rPr>
-        <w:t xml:space="preserve"> w r t their version, that code in exist in </w:t>
-      </w:r>
-      <w:proofErr w:type="spellStart"/>
-      <w:r>
-        <w:rPr>
-          <w:rFonts w:cstheme="minorHAnsi"/>
-          <w:lang w:val="en-US"/>
-        </w:rPr>
-        <w:t>node_module</w:t>
-      </w:r>
-      <w:proofErr w:type="spellEnd"/>
-      <w:r>
-        <w:rPr>
-          <w:rFonts w:cstheme="minorHAnsi"/>
-          <w:lang w:val="en-US"/>
-        </w:rPr>
-        <w:t xml:space="preserve"> folder</w:t>
+        <w:t>all mentioned dependancies w r t their version, that code in exist in node_module folder</w:t>
       </w:r>
     </w:p>
     <w:p>
@@ -2506,33 +2247,8 @@
           <w:rFonts w:cstheme="minorHAnsi"/>
           <w:lang w:val="en-US"/>
         </w:rPr>
-        <w:t>package</w:t>
-      </w:r>
-      <w:r>
-        <w:rPr>
-          <w:rFonts w:cstheme="minorHAnsi"/>
-          <w:lang w:val="en-US"/>
-        </w:rPr>
-        <w:t>-</w:t>
-      </w:r>
-      <w:proofErr w:type="spellStart"/>
-      <w:proofErr w:type="gramStart"/>
-      <w:r>
-        <w:rPr>
-          <w:rFonts w:cstheme="minorHAnsi"/>
-          <w:lang w:val="en-US"/>
-        </w:rPr>
-        <w:t>lock</w:t>
-      </w:r>
-      <w:r>
-        <w:rPr>
-          <w:rFonts w:cstheme="minorHAnsi"/>
-          <w:lang w:val="en-US"/>
-        </w:rPr>
-        <w:t>.json</w:t>
-      </w:r>
-      <w:proofErr w:type="spellEnd"/>
-      <w:proofErr w:type="gramEnd"/>
+        <w:t>package-lock.json</w:t>
+      </w:r>
     </w:p>
     <w:p>
       <w:pPr>
@@ -2644,50 +2360,30 @@
           <w:lang w:val="en-US"/>
         </w:rPr>
       </w:pPr>
-      <w:proofErr w:type="spellStart"/>
-      <w:proofErr w:type="gramStart"/>
-      <w:r>
-        <w:rPr>
-          <w:rFonts w:cstheme="minorHAnsi"/>
-          <w:lang w:val="en-US"/>
-        </w:rPr>
-        <w:t>vite.confige</w:t>
-      </w:r>
-      <w:proofErr w:type="gramEnd"/>
-      <w:r>
-        <w:rPr>
-          <w:rFonts w:cstheme="minorHAnsi"/>
-          <w:lang w:val="en-US"/>
-        </w:rPr>
-        <w:t>,s</w:t>
-      </w:r>
-      <w:proofErr w:type="spellEnd"/>
-    </w:p>
-    <w:p>
-      <w:pPr>
-        <w:pStyle w:val="ListParagraph"/>
-        <w:ind w:left="1080"/>
-        <w:rPr>
-          <w:rFonts w:cstheme="minorHAnsi"/>
-          <w:lang w:val="en-US"/>
-        </w:rPr>
-      </w:pPr>
-      <w:r>
-        <w:rPr>
-          <w:rFonts w:cstheme="minorHAnsi"/>
-          <w:lang w:val="en-US"/>
-        </w:rPr>
-        <w:t xml:space="preserve">-Used in configuration of </w:t>
-      </w:r>
-      <w:proofErr w:type="spellStart"/>
-      <w:r>
-        <w:rPr>
-          <w:rFonts w:cstheme="minorHAnsi"/>
-          <w:lang w:val="en-US"/>
-        </w:rPr>
-        <w:t>vite</w:t>
-      </w:r>
-      <w:proofErr w:type="spellEnd"/>
+      <w:r>
+        <w:rPr>
+          <w:rFonts w:cstheme="minorHAnsi"/>
+          <w:lang w:val="en-US"/>
+        </w:rPr>
+        <w:t>vite.confige,s</w:t>
+      </w:r>
+    </w:p>
+    <w:p>
+      <w:pPr>
+        <w:pStyle w:val="ListParagraph"/>
+        <w:ind w:left="1080"/>
+        <w:rPr>
+          <w:rFonts w:cstheme="minorHAnsi"/>
+          <w:lang w:val="en-US"/>
+        </w:rPr>
+      </w:pPr>
+      <w:r>
+        <w:rPr>
+          <w:rFonts w:cstheme="minorHAnsi"/>
+          <w:lang w:val="en-US"/>
+        </w:rPr>
+        <w:t>-Used in configuration of vite</w:t>
+      </w:r>
     </w:p>
     <w:p>
       <w:pPr>
@@ -2795,39 +2491,7 @@
           <w:rFonts w:cstheme="minorHAnsi"/>
           <w:lang w:val="en-US"/>
         </w:rPr>
-        <w:t xml:space="preserve">-can make </w:t>
-      </w:r>
-      <w:proofErr w:type="gramStart"/>
-      <w:r>
-        <w:rPr>
-          <w:rFonts w:cstheme="minorHAnsi"/>
-          <w:lang w:val="en-US"/>
-        </w:rPr>
-        <w:t>rules ,</w:t>
-      </w:r>
-      <w:proofErr w:type="gramEnd"/>
-      <w:r>
-        <w:rPr>
-          <w:rFonts w:cstheme="minorHAnsi"/>
-          <w:lang w:val="en-US"/>
-        </w:rPr>
-        <w:t xml:space="preserve"> like </w:t>
-      </w:r>
-      <w:proofErr w:type="spellStart"/>
-      <w:r>
-        <w:rPr>
-          <w:rFonts w:cstheme="minorHAnsi"/>
-          <w:lang w:val="en-US"/>
-        </w:rPr>
-        <w:t>maxLength</w:t>
-      </w:r>
-      <w:proofErr w:type="spellEnd"/>
-      <w:r>
-        <w:rPr>
-          <w:rFonts w:cstheme="minorHAnsi"/>
-          <w:lang w:val="en-US"/>
-        </w:rPr>
-        <w:t xml:space="preserve"> of a function</w:t>
+        <w:t>-can make rules , like maxLength of a function</w:t>
       </w:r>
     </w:p>
     <w:p>
@@ -2848,17 +2512,8 @@
           <w:rFonts w:cstheme="minorHAnsi"/>
           <w:lang w:val="en-US"/>
         </w:rPr>
-        <w:t>-</w:t>
-      </w:r>
-      <w:proofErr w:type="gramStart"/>
-      <w:r>
-        <w:rPr>
-          <w:rFonts w:cstheme="minorHAnsi"/>
-          <w:lang w:val="en-US"/>
-        </w:rPr>
-        <w:t xml:space="preserve">which  </w:t>
-      </w:r>
-      <w:proofErr w:type="spellStart"/>
+        <w:t xml:space="preserve">-which  </w:t>
+      </w:r>
       <w:r>
         <w:rPr>
           <w:rFonts w:ascii="Consolas" w:eastAsia="Times New Roman" w:hAnsi="Consolas" w:cs="Times New Roman"/>
@@ -2869,8 +2524,6 @@
         </w:rPr>
         <w:t>ecmaVersion</w:t>
       </w:r>
-      <w:proofErr w:type="spellEnd"/>
-      <w:proofErr w:type="gramEnd"/>
       <w:r>
         <w:rPr>
           <w:rFonts w:ascii="Consolas" w:eastAsia="Times New Roman" w:hAnsi="Consolas" w:cs="Times New Roman"/>
@@ -2911,65 +2564,29 @@
           <w:lang w:val="en-US"/>
         </w:rPr>
       </w:pPr>
-      <w:proofErr w:type="gramStart"/>
-      <w:r>
-        <w:rPr>
-          <w:rFonts w:cstheme="minorHAnsi"/>
-          <w:lang w:val="en-US"/>
-        </w:rPr>
-        <w:t>.</w:t>
-      </w:r>
-      <w:proofErr w:type="spellStart"/>
-      <w:r>
-        <w:rPr>
-          <w:rFonts w:cstheme="minorHAnsi"/>
-          <w:lang w:val="en-US"/>
-        </w:rPr>
-        <w:t>gitignore</w:t>
-      </w:r>
-      <w:proofErr w:type="spellEnd"/>
-      <w:proofErr w:type="gramEnd"/>
-    </w:p>
-    <w:p>
-      <w:pPr>
-        <w:pStyle w:val="ListParagraph"/>
-        <w:ind w:left="1080"/>
-        <w:rPr>
-          <w:rFonts w:cstheme="minorHAnsi"/>
-          <w:lang w:val="en-US"/>
-        </w:rPr>
-      </w:pPr>
-      <w:proofErr w:type="spellStart"/>
-      <w:r>
-        <w:rPr>
-          <w:rFonts w:cstheme="minorHAnsi"/>
-          <w:lang w:val="en-US"/>
-        </w:rPr>
-        <w:t>Node_modules</w:t>
-      </w:r>
-      <w:proofErr w:type="spellEnd"/>
-      <w:r>
-        <w:rPr>
-          <w:rFonts w:cstheme="minorHAnsi"/>
-          <w:lang w:val="en-US"/>
-        </w:rPr>
-        <w:t xml:space="preserve"> we </w:t>
-      </w:r>
-      <w:proofErr w:type="spellStart"/>
-      <w:r>
-        <w:rPr>
-          <w:rFonts w:cstheme="minorHAnsi"/>
-          <w:lang w:val="en-US"/>
-        </w:rPr>
-        <w:t>wont</w:t>
-      </w:r>
-      <w:proofErr w:type="spellEnd"/>
-      <w:r>
-        <w:rPr>
-          <w:rFonts w:cstheme="minorHAnsi"/>
-          <w:lang w:val="en-US"/>
-        </w:rPr>
-        <w:t xml:space="preserve"> push</w:t>
+      <w:r>
+        <w:rPr>
+          <w:rFonts w:cstheme="minorHAnsi"/>
+          <w:lang w:val="en-US"/>
+        </w:rPr>
+        <w:t>.gitignore</w:t>
+      </w:r>
+    </w:p>
+    <w:p>
+      <w:pPr>
+        <w:pStyle w:val="ListParagraph"/>
+        <w:ind w:left="1080"/>
+        <w:rPr>
+          <w:rFonts w:cstheme="minorHAnsi"/>
+          <w:lang w:val="en-US"/>
+        </w:rPr>
+      </w:pPr>
+      <w:r>
+        <w:rPr>
+          <w:rFonts w:cstheme="minorHAnsi"/>
+          <w:lang w:val="en-US"/>
+        </w:rPr>
+        <w:t>Node_modules we wont push</w:t>
       </w:r>
     </w:p>
     <w:p>
@@ -3033,23 +2650,7 @@
           <w:rFonts w:cstheme="minorHAnsi"/>
           <w:lang w:val="en-US"/>
         </w:rPr>
-        <w:t>-</w:t>
-      </w:r>
-      <w:proofErr w:type="spellStart"/>
-      <w:r>
-        <w:rPr>
-          <w:rFonts w:cstheme="minorHAnsi"/>
-          <w:lang w:val="en-US"/>
-        </w:rPr>
-        <w:t>its</w:t>
-      </w:r>
-      <w:proofErr w:type="spellEnd"/>
-      <w:r>
-        <w:rPr>
-          <w:rFonts w:cstheme="minorHAnsi"/>
-          <w:lang w:val="en-US"/>
-        </w:rPr>
-        <w:t xml:space="preserve"> an entry file of project</w:t>
+        <w:t>-its an entry file of project</w:t>
       </w:r>
     </w:p>
     <w:p>
@@ -3074,21 +2675,12 @@
           <w:lang w:val="en-US"/>
         </w:rPr>
       </w:pPr>
-      <w:proofErr w:type="spellStart"/>
-      <w:r>
-        <w:rPr>
-          <w:rFonts w:cstheme="minorHAnsi"/>
-          <w:lang w:val="en-US"/>
-        </w:rPr>
-        <w:t>Rset</w:t>
-      </w:r>
-      <w:proofErr w:type="spellEnd"/>
-      <w:r>
-        <w:rPr>
-          <w:rFonts w:cstheme="minorHAnsi"/>
-          <w:lang w:val="en-US"/>
-        </w:rPr>
-        <w:t xml:space="preserve"> basic work flow will be same as “Work Flow”</w:t>
+      <w:r>
+        <w:rPr>
+          <w:rFonts w:cstheme="minorHAnsi"/>
+          <w:lang w:val="en-US"/>
+        </w:rPr>
+        <w:t>Rset basic work flow will be same as “Work Flow”</w:t>
       </w:r>
     </w:p>
     <w:p>
@@ -3135,72 +2727,24 @@
           <w:rFonts w:cstheme="minorHAnsi"/>
           <w:lang w:val="en-US"/>
         </w:rPr>
-        <w:t xml:space="preserve">-all actual development done </w:t>
-      </w:r>
-      <w:proofErr w:type="spellStart"/>
-      <w:r>
-        <w:rPr>
-          <w:rFonts w:cstheme="minorHAnsi"/>
-          <w:lang w:val="en-US"/>
-        </w:rPr>
-        <w:t>src</w:t>
-      </w:r>
-      <w:proofErr w:type="spellEnd"/>
-      <w:r>
-        <w:rPr>
-          <w:rFonts w:cstheme="minorHAnsi"/>
-          <w:lang w:val="en-US"/>
-        </w:rPr>
-        <w:t xml:space="preserve"> folder only</w:t>
-      </w:r>
-    </w:p>
-    <w:p>
-      <w:pPr>
-        <w:pStyle w:val="ListParagraph"/>
-        <w:ind w:left="1080"/>
-        <w:rPr>
-          <w:rFonts w:cstheme="minorHAnsi"/>
-          <w:lang w:val="en-US"/>
-        </w:rPr>
-      </w:pPr>
-      <w:r>
-        <w:rPr>
-          <w:rFonts w:cstheme="minorHAnsi"/>
-          <w:lang w:val="en-US"/>
-        </w:rPr>
-        <w:t xml:space="preserve">-write project </w:t>
-      </w:r>
-      <w:proofErr w:type="gramStart"/>
-      <w:r>
-        <w:rPr>
-          <w:rFonts w:cstheme="minorHAnsi"/>
-          <w:lang w:val="en-US"/>
-        </w:rPr>
-        <w:t>files .outside</w:t>
-      </w:r>
-      <w:proofErr w:type="gramEnd"/>
-      <w:r>
-        <w:rPr>
-          <w:rFonts w:cstheme="minorHAnsi"/>
-          <w:lang w:val="en-US"/>
-        </w:rPr>
-        <w:t xml:space="preserve"> of </w:t>
-      </w:r>
-      <w:proofErr w:type="spellStart"/>
-      <w:r>
-        <w:rPr>
-          <w:rFonts w:cstheme="minorHAnsi"/>
-          <w:lang w:val="en-US"/>
-        </w:rPr>
-        <w:t>src</w:t>
-      </w:r>
-      <w:proofErr w:type="spellEnd"/>
-      <w:r>
-        <w:rPr>
-          <w:rFonts w:cstheme="minorHAnsi"/>
-          <w:lang w:val="en-US"/>
-        </w:rPr>
-        <w:t xml:space="preserve">  can also work but not </w:t>
+        <w:t>-all actual development done src folder only</w:t>
+      </w:r>
+    </w:p>
+    <w:p>
+      <w:pPr>
+        <w:pStyle w:val="ListParagraph"/>
+        <w:ind w:left="1080"/>
+        <w:rPr>
+          <w:rFonts w:cstheme="minorHAnsi"/>
+          <w:lang w:val="en-US"/>
+        </w:rPr>
+      </w:pPr>
+      <w:r>
+        <w:rPr>
+          <w:rFonts w:cstheme="minorHAnsi"/>
+          <w:lang w:val="en-US"/>
+        </w:rPr>
+        <w:t xml:space="preserve">-write project files .outside of src  can also work but not </w:t>
       </w:r>
       <w:r>
         <w:rPr>
@@ -3261,23 +2805,7 @@
           <w:rFonts w:cstheme="minorHAnsi"/>
           <w:lang w:val="en-US"/>
         </w:rPr>
-        <w:t xml:space="preserve">Can be same as assets folder in </w:t>
-      </w:r>
-      <w:proofErr w:type="spellStart"/>
-      <w:r>
-        <w:rPr>
-          <w:rFonts w:cstheme="minorHAnsi"/>
-          <w:lang w:val="en-US"/>
-        </w:rPr>
-        <w:t>src</w:t>
-      </w:r>
-      <w:proofErr w:type="spellEnd"/>
-      <w:r>
-        <w:rPr>
-          <w:rFonts w:cstheme="minorHAnsi"/>
-          <w:lang w:val="en-US"/>
-        </w:rPr>
-        <w:t xml:space="preserve"> folder</w:t>
+        <w:t>Can be same as assets folder in src folder</w:t>
       </w:r>
     </w:p>
     <w:p>
@@ -3319,21 +2847,12 @@
           <w:lang w:val="en-US"/>
         </w:rPr>
       </w:pPr>
-      <w:proofErr w:type="spellStart"/>
-      <w:r>
-        <w:rPr>
-          <w:rFonts w:cstheme="minorHAnsi"/>
-          <w:lang w:val="en-US"/>
-        </w:rPr>
-        <w:t>Node_module</w:t>
-      </w:r>
-      <w:proofErr w:type="spellEnd"/>
-      <w:r>
-        <w:rPr>
-          <w:rFonts w:cstheme="minorHAnsi"/>
-          <w:lang w:val="en-US"/>
-        </w:rPr>
-        <w:t xml:space="preserve"> folder</w:t>
+      <w:r>
+        <w:rPr>
+          <w:rFonts w:cstheme="minorHAnsi"/>
+          <w:lang w:val="en-US"/>
+        </w:rPr>
+        <w:t>Node_module folder</w:t>
       </w:r>
     </w:p>
     <w:p>
@@ -3367,39 +2886,7 @@
           <w:rFonts w:cstheme="minorHAnsi"/>
           <w:lang w:val="en-US"/>
         </w:rPr>
-        <w:t xml:space="preserve">-we </w:t>
-      </w:r>
-      <w:proofErr w:type="spellStart"/>
-      <w:r>
-        <w:rPr>
-          <w:rFonts w:cstheme="minorHAnsi"/>
-          <w:lang w:val="en-US"/>
-        </w:rPr>
-        <w:t>wont</w:t>
-      </w:r>
-      <w:proofErr w:type="spellEnd"/>
-      <w:r>
-        <w:rPr>
-          <w:rFonts w:cstheme="minorHAnsi"/>
-          <w:lang w:val="en-US"/>
-        </w:rPr>
-        <w:t xml:space="preserve"> push it on </w:t>
-      </w:r>
-      <w:proofErr w:type="spellStart"/>
-      <w:r>
-        <w:rPr>
-          <w:rFonts w:cstheme="minorHAnsi"/>
-          <w:lang w:val="en-US"/>
-        </w:rPr>
-        <w:t>git</w:t>
-      </w:r>
-      <w:proofErr w:type="spellEnd"/>
-      <w:r>
-        <w:rPr>
-          <w:rFonts w:cstheme="minorHAnsi"/>
-          <w:lang w:val="en-US"/>
-        </w:rPr>
-        <w:t xml:space="preserve"> because,</w:t>
+        <w:t>-we wont push it on git because,</w:t>
       </w:r>
     </w:p>
     <w:p>
@@ -3417,56 +2904,24 @@
           <w:lang w:val="en-US"/>
         </w:rPr>
         <w:tab/>
-        <w:t>-</w:t>
-      </w:r>
-      <w:proofErr w:type="spellStart"/>
-      <w:r>
-        <w:rPr>
-          <w:rFonts w:cstheme="minorHAnsi"/>
-          <w:lang w:val="en-US"/>
-        </w:rPr>
-        <w:t>its</w:t>
-      </w:r>
-      <w:proofErr w:type="spellEnd"/>
-      <w:r>
-        <w:rPr>
-          <w:rFonts w:cstheme="minorHAnsi"/>
-          <w:lang w:val="en-US"/>
-        </w:rPr>
-        <w:t xml:space="preserve"> too heavy, sometimes in GB</w:t>
-      </w:r>
-    </w:p>
-    <w:p>
-      <w:pPr>
-        <w:pStyle w:val="ListParagraph"/>
-        <w:ind w:left="1080"/>
-        <w:rPr>
-          <w:rFonts w:cstheme="minorHAnsi"/>
-          <w:lang w:val="en-US"/>
-        </w:rPr>
-      </w:pPr>
-      <w:r>
-        <w:rPr>
-          <w:rFonts w:cstheme="minorHAnsi"/>
-          <w:lang w:val="en-US"/>
-        </w:rPr>
-        <w:t xml:space="preserve">-when new developer </w:t>
-      </w:r>
-      <w:proofErr w:type="gramStart"/>
-      <w:r>
-        <w:rPr>
-          <w:rFonts w:cstheme="minorHAnsi"/>
-          <w:lang w:val="en-US"/>
-        </w:rPr>
-        <w:t>want</w:t>
-      </w:r>
-      <w:proofErr w:type="gramEnd"/>
-      <w:r>
-        <w:rPr>
-          <w:rFonts w:cstheme="minorHAnsi"/>
-          <w:lang w:val="en-US"/>
-        </w:rPr>
-        <w:t xml:space="preserve"> to install he need to execute</w:t>
+        <w:t>-its too heavy, sometimes in GB</w:t>
+      </w:r>
+    </w:p>
+    <w:p>
+      <w:pPr>
+        <w:pStyle w:val="ListParagraph"/>
+        <w:ind w:left="1080"/>
+        <w:rPr>
+          <w:rFonts w:cstheme="minorHAnsi"/>
+          <w:lang w:val="en-US"/>
+        </w:rPr>
+      </w:pPr>
+      <w:r>
+        <w:rPr>
+          <w:rFonts w:cstheme="minorHAnsi"/>
+          <w:lang w:val="en-US"/>
+        </w:rPr>
+        <w:t>-when new developer want to install he need to execute</w:t>
       </w:r>
     </w:p>
     <w:p>
@@ -3484,22 +2939,7 @@
           <w:lang w:val="en-US"/>
         </w:rPr>
         <w:tab/>
-      </w:r>
-      <w:proofErr w:type="spellStart"/>
-      <w:r>
-        <w:rPr>
-          <w:rFonts w:cstheme="minorHAnsi"/>
-          <w:lang w:val="en-US"/>
-        </w:rPr>
-        <w:t>npm</w:t>
-      </w:r>
-      <w:proofErr w:type="spellEnd"/>
-      <w:r>
-        <w:rPr>
-          <w:rFonts w:cstheme="minorHAnsi"/>
-          <w:lang w:val="en-US"/>
-        </w:rPr>
-        <w:t xml:space="preserve"> install</w:t>
+        <w:t>npm install</w:t>
       </w:r>
     </w:p>
     <w:p>
@@ -3530,25 +2970,30 @@
           <w:lang w:val="en-US"/>
         </w:rPr>
       </w:pPr>
-      <w:bookmarkStart w:id="0" w:name="_GoBack"/>
-      <w:bookmarkEnd w:id="0"/>
-      <w:proofErr w:type="spellStart"/>
       <w:r>
         <w:rPr>
           <w:rFonts w:cstheme="minorHAnsi"/>
           <w:b/>
           <w:lang w:val="en-US"/>
         </w:rPr>
-        <w:t>Componets</w:t>
-      </w:r>
-      <w:proofErr w:type="spellEnd"/>
-      <w:r>
+        <w:t>Componets:</w:t>
+      </w:r>
+    </w:p>
+    <w:p>
+      <w:pPr>
         <w:rPr>
           <w:rFonts w:cstheme="minorHAnsi"/>
           <w:b/>
           <w:lang w:val="en-US"/>
         </w:rPr>
-        <w:t>:</w:t>
+      </w:pPr>
+      <w:r>
+        <w:rPr>
+          <w:rFonts w:cstheme="minorHAnsi"/>
+          <w:b/>
+          <w:lang w:val="en-US"/>
+        </w:rPr>
+        <w:t>In April test</w:t>
       </w:r>
     </w:p>
     <w:p>
@@ -3679,7 +3124,7 @@
 </file>
 
 <file path=word/numbering.xml><?xml version="1.0" encoding="utf-8"?>
-<w:numbering xmlns:wpc="http://schemas.microsoft.com/office/word/2010/wordprocessingCanvas" xmlns:cx="http://schemas.microsoft.com/office/drawing/2014/chartex" xmlns:cx1="http://schemas.microsoft.com/office/drawing/2015/9/8/chartex" xmlns:mc="http://schemas.openxmlformats.org/markup-compatibility/2006" xmlns:o="urn:schemas-microsoft-com:office:office" xmlns:r="http://schemas.openxmlformats.org/officeDocument/2006/relationships" xmlns:m="http://schemas.openxmlformats.org/officeDocument/2006/math" xmlns:v="urn:schemas-microsoft-com:vml" xmlns:wp14="http://schemas.microsoft.com/office/word/2010/wordprocessingDrawing" xmlns:wp="http://schemas.openxmlformats.org/drawingml/2006/wordprocessingDrawing" xmlns:w10="urn:schemas-microsoft-com:office:word" xmlns:w="http://schemas.openxmlformats.org/wordprocessingml/2006/main" xmlns:w14="http://schemas.microsoft.com/office/word/2010/wordml" xmlns:w15="http://schemas.microsoft.com/office/word/2012/wordml" xmlns:w16se="http://schemas.microsoft.com/office/word/2015/wordml/symex" xmlns:wpg="http://schemas.microsoft.com/office/word/2010/wordprocessingGroup" xmlns:wpi="http://schemas.microsoft.com/office/word/2010/wordprocessingInk" xmlns:wne="http://schemas.microsoft.com/office/word/2006/wordml" xmlns:wps="http://schemas.microsoft.com/office/word/2010/wordprocessingShape" mc:Ignorable="w14 w15 w16se wp14">
+<w:numbering xmlns:wpc="http://schemas.microsoft.com/office/word/2010/wordprocessingCanvas" xmlns:cx="http://schemas.microsoft.com/office/drawing/2014/chartex" xmlns:cx1="http://schemas.microsoft.com/office/drawing/2015/9/8/chartex" xmlns:cx2="http://schemas.microsoft.com/office/drawing/2015/10/21/chartex" xmlns:cx3="http://schemas.microsoft.com/office/drawing/2016/5/9/chartex" xmlns:cx4="http://schemas.microsoft.com/office/drawing/2016/5/10/chartex" xmlns:cx5="http://schemas.microsoft.com/office/drawing/2016/5/11/chartex" xmlns:cx6="http://schemas.microsoft.com/office/drawing/2016/5/12/chartex" xmlns:cx7="http://schemas.microsoft.com/office/drawing/2016/5/13/chartex" xmlns:cx8="http://schemas.microsoft.com/office/drawing/2016/5/14/chartex" xmlns:mc="http://schemas.openxmlformats.org/markup-compatibility/2006" xmlns:aink="http://schemas.microsoft.com/office/drawing/2016/ink" xmlns:am3d="http://schemas.microsoft.com/office/drawing/2017/model3d" xmlns:o="urn:schemas-microsoft-com:office:office" xmlns:oel="http://schemas.microsoft.com/office/2019/extlst" xmlns:r="http://schemas.openxmlformats.org/officeDocument/2006/relationships" xmlns:m="http://schemas.openxmlformats.org/officeDocument/2006/math" xmlns:v="urn:schemas-microsoft-com:vml" xmlns:wp14="http://schemas.microsoft.com/office/word/2010/wordprocessingDrawing" xmlns:wp="http://schemas.openxmlformats.org/drawingml/2006/wordprocessingDrawing" xmlns:w10="urn:schemas-microsoft-com:office:word" xmlns:w="http://schemas.openxmlformats.org/wordprocessingml/2006/main" xmlns:w14="http://schemas.microsoft.com/office/word/2010/wordml" xmlns:w15="http://schemas.microsoft.com/office/word/2012/wordml" xmlns:w16cex="http://schemas.microsoft.com/office/word/2018/wordml/cex" xmlns:w16cid="http://schemas.microsoft.com/office/word/2016/wordml/cid" xmlns:w16="http://schemas.microsoft.com/office/word/2018/wordml" xmlns:w16du="http://schemas.microsoft.com/office/word/2023/wordml/word16du" xmlns:w16sdtdh="http://schemas.microsoft.com/office/word/2020/wordml/sdtdatahash" xmlns:w16sdtfl="http://schemas.microsoft.com/office/word/2024/wordml/sdtformatlock" xmlns:w16se="http://schemas.microsoft.com/office/word/2015/wordml/symex" xmlns:wpg="http://schemas.microsoft.com/office/word/2010/wordprocessingGroup" xmlns:wpi="http://schemas.microsoft.com/office/word/2010/wordprocessingInk" xmlns:wne="http://schemas.microsoft.com/office/word/2006/wordml" xmlns:wps="http://schemas.microsoft.com/office/word/2010/wordprocessingShape" mc:Ignorable="w14 w15 w16se w16cid w16 w16cex w16sdtdh w16sdtfl w16du wp14">
   <w:abstractNum w:abstractNumId="0" w15:restartNumberingAfterBreak="0">
     <w:nsid w:val="04991D19"/>
     <w:multiLevelType w:val="hybridMultilevel"/>
@@ -3947,20 +3392,20 @@
       </w:pPr>
     </w:lvl>
   </w:abstractNum>
-  <w:num w:numId="1">
+  <w:num w:numId="1" w16cid:durableId="1390691755">
     <w:abstractNumId w:val="2"/>
   </w:num>
-  <w:num w:numId="2">
+  <w:num w:numId="2" w16cid:durableId="813595721">
     <w:abstractNumId w:val="1"/>
   </w:num>
-  <w:num w:numId="3">
+  <w:num w:numId="3" w16cid:durableId="1345744365">
     <w:abstractNumId w:val="0"/>
   </w:num>
 </w:numbering>
 </file>
 
 <file path=word/styles.xml><?xml version="1.0" encoding="utf-8"?>
-<w:styles xmlns:mc="http://schemas.openxmlformats.org/markup-compatibility/2006" xmlns:r="http://schemas.openxmlformats.org/officeDocument/2006/relationships" xmlns:w="http://schemas.openxmlformats.org/wordprocessingml/2006/main" xmlns:w14="http://schemas.microsoft.com/office/word/2010/wordml" xmlns:w15="http://schemas.microsoft.com/office/word/2012/wordml" xmlns:w16se="http://schemas.microsoft.com/office/word/2015/wordml/symex" mc:Ignorable="w14 w15 w16se">
+<w:styles xmlns:mc="http://schemas.openxmlformats.org/markup-compatibility/2006" xmlns:r="http://schemas.openxmlformats.org/officeDocument/2006/relationships" xmlns:w="http://schemas.openxmlformats.org/wordprocessingml/2006/main" xmlns:w14="http://schemas.microsoft.com/office/word/2010/wordml" xmlns:w15="http://schemas.microsoft.com/office/word/2012/wordml" xmlns:w16cex="http://schemas.microsoft.com/office/word/2018/wordml/cex" xmlns:w16cid="http://schemas.microsoft.com/office/word/2016/wordml/cid" xmlns:w16="http://schemas.microsoft.com/office/word/2018/wordml" xmlns:w16du="http://schemas.microsoft.com/office/word/2023/wordml/word16du" xmlns:w16sdtdh="http://schemas.microsoft.com/office/word/2020/wordml/sdtdatahash" xmlns:w16sdtfl="http://schemas.microsoft.com/office/word/2024/wordml/sdtformatlock" xmlns:w16se="http://schemas.microsoft.com/office/word/2015/wordml/symex" mc:Ignorable="w14 w15 w16se w16cid w16 w16cex w16sdtdh w16sdtfl w16du">
   <w:docDefaults>
     <w:rPrDefault>
       <w:rPr>
@@ -3976,7 +3421,7 @@
       </w:pPr>
     </w:pPrDefault>
   </w:docDefaults>
-  <w:latentStyles w:defLockedState="0" w:defUIPriority="99" w:defSemiHidden="0" w:defUnhideWhenUsed="0" w:defQFormat="0" w:count="371">
+  <w:latentStyles w:defLockedState="0" w:defUIPriority="99" w:defSemiHidden="0" w:defUnhideWhenUsed="0" w:defQFormat="0" w:count="376">
     <w:lsdException w:name="Normal" w:uiPriority="0" w:qFormat="1"/>
     <w:lsdException w:name="heading 1" w:uiPriority="9" w:qFormat="1"/>
     <w:lsdException w:name="heading 2" w:semiHidden="1" w:uiPriority="9" w:unhideWhenUsed="1" w:qFormat="1"/>
@@ -4348,6 +3793,11 @@
     <w:lsdException w:name="List Table 5 Dark Accent 6" w:uiPriority="50"/>
     <w:lsdException w:name="List Table 6 Colorful Accent 6" w:uiPriority="51"/>
     <w:lsdException w:name="List Table 7 Colorful Accent 6" w:uiPriority="52"/>
+    <w:lsdException w:name="Mention" w:semiHidden="1" w:unhideWhenUsed="1"/>
+    <w:lsdException w:name="Smart Hyperlink" w:semiHidden="1" w:unhideWhenUsed="1"/>
+    <w:lsdException w:name="Hashtag" w:semiHidden="1" w:unhideWhenUsed="1"/>
+    <w:lsdException w:name="Unresolved Mention" w:semiHidden="1" w:unhideWhenUsed="1"/>
+    <w:lsdException w:name="Smart Link" w:semiHidden="1" w:unhideWhenUsed="1"/>
   </w:latentStyles>
   <w:style w:type="paragraph" w:default="1" w:styleId="Normal">
     <w:name w:val="Normal"/>

</xml_diff>

<commit_message>
Some changes in Command file and footer test is added
</commit_message>
<xml_diff>
--- a/Commands.docx
+++ b/Commands.docx
@@ -9,6 +9,15 @@
           <w:lang w:val="en-US"/>
         </w:rPr>
       </w:pPr>
+      <w:r>
+        <w:rPr>
+          <w:rFonts w:cstheme="minorHAnsi"/>
+          <w:lang w:val="en-US"/>
+        </w:rPr>
+        <w:t xml:space="preserve"> </w:t>
+      </w:r>
+      <w:bookmarkStart w:id="0" w:name="_GoBack"/>
+      <w:bookmarkEnd w:id="0"/>
     </w:p>
     <w:p>
       <w:pPr>
@@ -493,8 +502,6 @@
         </w:rPr>
         <w:t xml:space="preserve">For first installation it will ask </w:t>
       </w:r>
-      <w:bookmarkStart w:id="0" w:name="_GoBack"/>
-      <w:bookmarkEnd w:id="0"/>
       <w:proofErr w:type="spellStart"/>
       <w:r>
         <w:rPr>

</xml_diff>

<commit_message>
React Changes: JSX, Function, Heading Changes
</commit_message>
<xml_diff>
--- a/Commands.docx
+++ b/Commands.docx
@@ -1,6 +1,6 @@
 
 <file path=word/document.xml><?xml version="1.0" encoding="utf-8"?>
-<w:document xmlns:wpc="http://schemas.microsoft.com/office/word/2010/wordprocessingCanvas" xmlns:cx="http://schemas.microsoft.com/office/drawing/2014/chartex" xmlns:cx1="http://schemas.microsoft.com/office/drawing/2015/9/8/chartex" xmlns:mc="http://schemas.openxmlformats.org/markup-compatibility/2006" xmlns:o="urn:schemas-microsoft-com:office:office" xmlns:r="http://schemas.openxmlformats.org/officeDocument/2006/relationships" xmlns:m="http://schemas.openxmlformats.org/officeDocument/2006/math" xmlns:v="urn:schemas-microsoft-com:vml" xmlns:wp14="http://schemas.microsoft.com/office/word/2010/wordprocessingDrawing" xmlns:wp="http://schemas.openxmlformats.org/drawingml/2006/wordprocessingDrawing" xmlns:w10="urn:schemas-microsoft-com:office:word" xmlns:w="http://schemas.openxmlformats.org/wordprocessingml/2006/main" xmlns:w14="http://schemas.microsoft.com/office/word/2010/wordml" xmlns:w15="http://schemas.microsoft.com/office/word/2012/wordml" xmlns:w16se="http://schemas.microsoft.com/office/word/2015/wordml/symex" xmlns:wpg="http://schemas.microsoft.com/office/word/2010/wordprocessingGroup" xmlns:wpi="http://schemas.microsoft.com/office/word/2010/wordprocessingInk" xmlns:wne="http://schemas.microsoft.com/office/word/2006/wordml" xmlns:wps="http://schemas.microsoft.com/office/word/2010/wordprocessingShape" mc:Ignorable="w14 w15 w16se wp14">
+<w:document xmlns:wpc="http://schemas.microsoft.com/office/word/2010/wordprocessingCanvas" xmlns:cx="http://schemas.microsoft.com/office/drawing/2014/chartex" xmlns:cx1="http://schemas.microsoft.com/office/drawing/2015/9/8/chartex" xmlns:cx2="http://schemas.microsoft.com/office/drawing/2015/10/21/chartex" xmlns:cx3="http://schemas.microsoft.com/office/drawing/2016/5/9/chartex" xmlns:cx4="http://schemas.microsoft.com/office/drawing/2016/5/10/chartex" xmlns:cx5="http://schemas.microsoft.com/office/drawing/2016/5/11/chartex" xmlns:cx6="http://schemas.microsoft.com/office/drawing/2016/5/12/chartex" xmlns:cx7="http://schemas.microsoft.com/office/drawing/2016/5/13/chartex" xmlns:cx8="http://schemas.microsoft.com/office/drawing/2016/5/14/chartex" xmlns:mc="http://schemas.openxmlformats.org/markup-compatibility/2006" xmlns:aink="http://schemas.microsoft.com/office/drawing/2016/ink" xmlns:am3d="http://schemas.microsoft.com/office/drawing/2017/model3d" xmlns:o="urn:schemas-microsoft-com:office:office" xmlns:oel="http://schemas.microsoft.com/office/2019/extlst" xmlns:r="http://schemas.openxmlformats.org/officeDocument/2006/relationships" xmlns:m="http://schemas.openxmlformats.org/officeDocument/2006/math" xmlns:v="urn:schemas-microsoft-com:vml" xmlns:wp14="http://schemas.microsoft.com/office/word/2010/wordprocessingDrawing" xmlns:wp="http://schemas.openxmlformats.org/drawingml/2006/wordprocessingDrawing" xmlns:w10="urn:schemas-microsoft-com:office:word" xmlns:w="http://schemas.openxmlformats.org/wordprocessingml/2006/main" xmlns:w14="http://schemas.microsoft.com/office/word/2010/wordml" xmlns:w15="http://schemas.microsoft.com/office/word/2012/wordml" xmlns:w16cex="http://schemas.microsoft.com/office/word/2018/wordml/cex" xmlns:w16cid="http://schemas.microsoft.com/office/word/2016/wordml/cid" xmlns:w16="http://schemas.microsoft.com/office/word/2018/wordml" xmlns:w16du="http://schemas.microsoft.com/office/word/2023/wordml/word16du" xmlns:w16sdtdh="http://schemas.microsoft.com/office/word/2020/wordml/sdtdatahash" xmlns:w16sdtfl="http://schemas.microsoft.com/office/word/2024/wordml/sdtformatlock" xmlns:w16se="http://schemas.microsoft.com/office/word/2015/wordml/symex" xmlns:wpg="http://schemas.microsoft.com/office/word/2010/wordprocessingGroup" xmlns:wpi="http://schemas.microsoft.com/office/word/2010/wordprocessingInk" xmlns:wne="http://schemas.microsoft.com/office/word/2006/wordml" xmlns:wps="http://schemas.microsoft.com/office/word/2010/wordprocessingShape" mc:Ignorable="w14 w15 w16se w16cid w16 w16cex w16sdtdh w16sdtfl w16du wp14">
   <w:body>
     <w:p>
       <w:pPr>
@@ -16,8 +16,6 @@
         </w:rPr>
         <w:t xml:space="preserve"> </w:t>
       </w:r>
-      <w:bookmarkStart w:id="0" w:name="_GoBack"/>
-      <w:bookmarkEnd w:id="0"/>
     </w:p>
     <w:p>
       <w:pPr>
@@ -71,7 +69,6 @@
           <w:lang w:val="en-US"/>
         </w:rPr>
       </w:pPr>
-      <w:proofErr w:type="spellStart"/>
       <w:r>
         <w:rPr>
           <w:rFonts w:cstheme="minorHAnsi"/>
@@ -84,15 +81,7 @@
           <w:rFonts w:cstheme="minorHAnsi"/>
           <w:lang w:val="en-US"/>
         </w:rPr>
-        <w:t>pm</w:t>
-      </w:r>
-      <w:proofErr w:type="spellEnd"/>
-      <w:r>
-        <w:rPr>
-          <w:rFonts w:cstheme="minorHAnsi"/>
-          <w:lang w:val="en-US"/>
-        </w:rPr>
-        <w:t xml:space="preserve"> </w:t>
+        <w:t xml:space="preserve">pm </w:t>
       </w:r>
       <w:r>
         <w:rPr>
@@ -146,49 +135,8 @@
           <w:rFonts w:cstheme="minorHAnsi"/>
           <w:lang w:val="en-US"/>
         </w:rPr>
-        <w:t xml:space="preserve">install VITE: install </w:t>
-      </w:r>
-      <w:proofErr w:type="gramStart"/>
-      <w:r>
-        <w:rPr>
-          <w:rFonts w:cstheme="minorHAnsi"/>
-          <w:lang w:val="en-US"/>
-        </w:rPr>
-        <w:t>react ,</w:t>
-      </w:r>
-      <w:proofErr w:type="gramEnd"/>
-      <w:r>
-        <w:rPr>
-          <w:rFonts w:cstheme="minorHAnsi"/>
-          <w:lang w:val="en-US"/>
-        </w:rPr>
-        <w:t xml:space="preserve"> node </w:t>
-      </w:r>
-      <w:proofErr w:type="spellStart"/>
-      <w:r>
-        <w:rPr>
-          <w:rFonts w:cstheme="minorHAnsi"/>
-          <w:lang w:val="en-US"/>
-        </w:rPr>
-        <w:t>vue</w:t>
-      </w:r>
-      <w:proofErr w:type="spellEnd"/>
-      <w:r>
-        <w:rPr>
-          <w:rFonts w:cstheme="minorHAnsi"/>
-          <w:lang w:val="en-US"/>
-        </w:rPr>
-        <w:t xml:space="preserve"> </w:t>
-      </w:r>
-      <w:proofErr w:type="spellStart"/>
-      <w:r>
-        <w:rPr>
-          <w:rFonts w:cstheme="minorHAnsi"/>
-          <w:lang w:val="en-US"/>
-        </w:rPr>
-        <w:t>js</w:t>
-      </w:r>
-      <w:proofErr w:type="spellEnd"/>
+        <w:t>install VITE: install react , node vue js</w:t>
+      </w:r>
     </w:p>
     <w:p>
       <w:pPr>
@@ -202,44 +150,22 @@
           <w:lang w:val="en-US"/>
         </w:rPr>
       </w:pPr>
-      <w:proofErr w:type="spellStart"/>
-      <w:proofErr w:type="gramStart"/>
       <w:r>
         <w:rPr>
           <w:rFonts w:cstheme="minorHAnsi"/>
           <w:highlight w:val="yellow"/>
           <w:lang w:val="en-US"/>
         </w:rPr>
-        <w:t>npm</w:t>
-      </w:r>
-      <w:proofErr w:type="spellEnd"/>
+        <w:t xml:space="preserve">npm  create </w:t>
+      </w:r>
       <w:r>
         <w:rPr>
           <w:rFonts w:cstheme="minorHAnsi"/>
           <w:highlight w:val="yellow"/>
           <w:lang w:val="en-US"/>
         </w:rPr>
-        <w:t xml:space="preserve">  create</w:t>
-      </w:r>
-      <w:proofErr w:type="gramEnd"/>
-      <w:r>
-        <w:rPr>
-          <w:rFonts w:cstheme="minorHAnsi"/>
-          <w:highlight w:val="yellow"/>
-          <w:lang w:val="en-US"/>
-        </w:rPr>
-        <w:t xml:space="preserve"> </w:t>
-      </w:r>
-      <w:proofErr w:type="spellStart"/>
-      <w:r>
-        <w:rPr>
-          <w:rFonts w:cstheme="minorHAnsi"/>
-          <w:highlight w:val="yellow"/>
-          <w:lang w:val="en-US"/>
-        </w:rPr>
         <w:t>vite</w:t>
       </w:r>
-      <w:proofErr w:type="spellEnd"/>
     </w:p>
     <w:p>
       <w:pPr>
@@ -276,27 +202,16 @@
           <w:highlight w:val="yellow"/>
           <w:lang w:val="en-US"/>
         </w:rPr>
-        <w:t>React-</w:t>
-      </w:r>
-      <w:proofErr w:type="gramStart"/>
-      <w:r>
-        <w:rPr>
-          <w:rFonts w:cstheme="minorHAnsi"/>
-          <w:b/>
+        <w:t>React-Blog</w:t>
+      </w:r>
+      <w:r>
+        <w:rPr>
+          <w:rFonts w:cstheme="minorHAnsi"/>
           <w:highlight w:val="yellow"/>
           <w:lang w:val="en-US"/>
         </w:rPr>
-        <w:t>Blog</w:t>
-      </w:r>
-      <w:r>
-        <w:rPr>
-          <w:rFonts w:cstheme="minorHAnsi"/>
-          <w:highlight w:val="yellow"/>
-          <w:lang w:val="en-US"/>
-        </w:rPr>
         <w:t>(</w:t>
       </w:r>
-      <w:proofErr w:type="gramEnd"/>
       <w:r>
         <w:rPr>
           <w:rFonts w:cstheme="minorHAnsi"/>
@@ -324,52 +239,14 @@
         </w:rPr>
         <w:t xml:space="preserve">when you create next/second project: use </w:t>
       </w:r>
-      <w:proofErr w:type="spellStart"/>
       <w:r>
         <w:rPr>
           <w:rFonts w:cstheme="minorHAnsi"/>
           <w:highlight w:val="yellow"/>
           <w:lang w:val="en-US"/>
         </w:rPr>
-        <w:t>npm</w:t>
-      </w:r>
-      <w:proofErr w:type="spellEnd"/>
-      <w:r>
-        <w:rPr>
-          <w:rFonts w:cstheme="minorHAnsi"/>
-          <w:highlight w:val="yellow"/>
-          <w:lang w:val="en-US"/>
-        </w:rPr>
-        <w:t xml:space="preserve"> create </w:t>
-      </w:r>
-      <w:proofErr w:type="spellStart"/>
-      <w:r>
-        <w:rPr>
-          <w:rFonts w:cstheme="minorHAnsi"/>
-          <w:highlight w:val="yellow"/>
-          <w:lang w:val="en-US"/>
-        </w:rPr>
-        <w:t>vite</w:t>
-      </w:r>
-      <w:proofErr w:type="spellEnd"/>
-      <w:r>
-        <w:rPr>
-          <w:rFonts w:cstheme="minorHAnsi"/>
-          <w:highlight w:val="yellow"/>
-          <w:lang w:val="en-US"/>
-        </w:rPr>
-        <w:t xml:space="preserve"> </w:t>
-      </w:r>
-      <w:proofErr w:type="spellStart"/>
-      <w:r>
-        <w:rPr>
-          <w:rFonts w:cstheme="minorHAnsi"/>
-          <w:highlight w:val="yellow"/>
-          <w:lang w:val="en-US"/>
-        </w:rPr>
-        <w:t>TestProjectName</w:t>
-      </w:r>
-      <w:proofErr w:type="spellEnd"/>
+        <w:t>npm create vite TestProjectName</w:t>
+      </w:r>
     </w:p>
     <w:p>
       <w:pPr>
@@ -502,7 +379,6 @@
         </w:rPr>
         <w:t xml:space="preserve">For first installation it will ask </w:t>
       </w:r>
-      <w:proofErr w:type="spellStart"/>
       <w:r>
         <w:rPr>
           <w:rFonts w:cstheme="minorHAnsi"/>
@@ -512,19 +388,7 @@
           <w:highlight w:val="yellow"/>
           <w:shd w:val="clear" w:color="auto" w:fill="FFFFFF"/>
         </w:rPr>
-        <w:t>npm</w:t>
-      </w:r>
-      <w:proofErr w:type="spellEnd"/>
-      <w:r>
-        <w:rPr>
-          <w:rFonts w:cstheme="minorHAnsi"/>
-          <w:color w:val="0F0F0F"/>
-          <w:sz w:val="21"/>
-          <w:szCs w:val="21"/>
-          <w:highlight w:val="yellow"/>
-          <w:shd w:val="clear" w:color="auto" w:fill="FFFFFF"/>
-        </w:rPr>
-        <w:t xml:space="preserve"> install</w:t>
+        <w:t>npm install</w:t>
       </w:r>
     </w:p>
     <w:p>
@@ -540,7 +404,6 @@
           <w:lang w:val="en-US"/>
         </w:rPr>
       </w:pPr>
-      <w:proofErr w:type="spellStart"/>
       <w:r>
         <w:rPr>
           <w:rFonts w:cstheme="minorHAnsi"/>
@@ -550,19 +413,7 @@
           <w:highlight w:val="yellow"/>
           <w:shd w:val="clear" w:color="auto" w:fill="FFFFFF"/>
         </w:rPr>
-        <w:t>npm</w:t>
-      </w:r>
-      <w:proofErr w:type="spellEnd"/>
-      <w:r>
-        <w:rPr>
-          <w:rFonts w:cstheme="minorHAnsi"/>
-          <w:color w:val="0F0F0F"/>
-          <w:sz w:val="21"/>
-          <w:szCs w:val="21"/>
-          <w:highlight w:val="yellow"/>
-          <w:shd w:val="clear" w:color="auto" w:fill="FFFFFF"/>
-        </w:rPr>
-        <w:t xml:space="preserve"> run dev</w:t>
+        <w:t>npm run dev</w:t>
       </w:r>
     </w:p>
     <w:p>
@@ -637,17 +488,8 @@
           <w:rFonts w:cstheme="minorHAnsi"/>
           <w:lang w:val="en-US"/>
         </w:rPr>
-        <w:t xml:space="preserve">Minimize file in </w:t>
-      </w:r>
-      <w:proofErr w:type="spellStart"/>
-      <w:r>
-        <w:rPr>
-          <w:rFonts w:cstheme="minorHAnsi"/>
-          <w:lang w:val="en-US"/>
-        </w:rPr>
-        <w:t>buid</w:t>
-      </w:r>
-      <w:proofErr w:type="spellEnd"/>
+        <w:t>Minimize file in buid</w:t>
+      </w:r>
     </w:p>
     <w:p>
       <w:pPr>
@@ -1004,7 +846,6 @@
         </w:rPr>
         <w:t xml:space="preserve"> </w:t>
       </w:r>
-      <w:proofErr w:type="spellStart"/>
       <w:r>
         <w:rPr>
           <w:rFonts w:ascii="Consolas" w:eastAsia="Times New Roman" w:hAnsi="Consolas" w:cs="Times New Roman"/>
@@ -1015,7 +856,6 @@
         </w:rPr>
         <w:t>src</w:t>
       </w:r>
-      <w:proofErr w:type="spellEnd"/>
       <w:r>
         <w:rPr>
           <w:rFonts w:ascii="Consolas" w:eastAsia="Times New Roman" w:hAnsi="Consolas" w:cs="Times New Roman"/>
@@ -1034,51 +874,7 @@
           <w:szCs w:val="21"/>
           <w:lang w:eastAsia="en-IN"/>
         </w:rPr>
-        <w:t>"/</w:t>
-      </w:r>
-      <w:proofErr w:type="spellStart"/>
-      <w:r>
-        <w:rPr>
-          <w:rFonts w:ascii="Consolas" w:eastAsia="Times New Roman" w:hAnsi="Consolas" w:cs="Times New Roman"/>
-          <w:color w:val="CE9178"/>
-          <w:sz w:val="21"/>
-          <w:szCs w:val="21"/>
-          <w:lang w:eastAsia="en-IN"/>
-        </w:rPr>
-        <w:t>src</w:t>
-      </w:r>
-      <w:proofErr w:type="spellEnd"/>
-      <w:r>
-        <w:rPr>
-          <w:rFonts w:ascii="Consolas" w:eastAsia="Times New Roman" w:hAnsi="Consolas" w:cs="Times New Roman"/>
-          <w:color w:val="CE9178"/>
-          <w:sz w:val="21"/>
-          <w:szCs w:val="21"/>
-          <w:lang w:eastAsia="en-IN"/>
-        </w:rPr>
-        <w:t>/</w:t>
-      </w:r>
-      <w:proofErr w:type="spellStart"/>
-      <w:r>
-        <w:rPr>
-          <w:rFonts w:ascii="Consolas" w:eastAsia="Times New Roman" w:hAnsi="Consolas" w:cs="Times New Roman"/>
-          <w:color w:val="CE9178"/>
-          <w:sz w:val="21"/>
-          <w:szCs w:val="21"/>
-          <w:lang w:eastAsia="en-IN"/>
-        </w:rPr>
-        <w:t>main.jsx</w:t>
-      </w:r>
-      <w:proofErr w:type="spellEnd"/>
-      <w:r>
-        <w:rPr>
-          <w:rFonts w:ascii="Consolas" w:eastAsia="Times New Roman" w:hAnsi="Consolas" w:cs="Times New Roman"/>
-          <w:color w:val="CE9178"/>
-          <w:sz w:val="21"/>
-          <w:szCs w:val="21"/>
-          <w:lang w:eastAsia="en-IN"/>
-        </w:rPr>
-        <w:t>"</w:t>
+        <w:t>"/src/main.jsx"</w:t>
       </w:r>
       <w:r>
         <w:rPr>
@@ -1181,17 +977,8 @@
           <w:rFonts w:cstheme="minorHAnsi"/>
           <w:lang w:val="en-US"/>
         </w:rPr>
-        <w:t xml:space="preserve">     2. </w:t>
-      </w:r>
-      <w:proofErr w:type="spellStart"/>
-      <w:r>
-        <w:rPr>
-          <w:rFonts w:cstheme="minorHAnsi"/>
-          <w:lang w:val="en-US"/>
-        </w:rPr>
-        <w:t>main.jsx</w:t>
-      </w:r>
-      <w:proofErr w:type="spellEnd"/>
+        <w:t xml:space="preserve">     2. main.jsx</w:t>
+      </w:r>
     </w:p>
     <w:p>
       <w:pPr>
@@ -1273,29 +1060,7 @@
           <w:szCs w:val="21"/>
           <w:lang w:eastAsia="en-IN"/>
         </w:rPr>
-        <w:t>'./</w:t>
-      </w:r>
-      <w:proofErr w:type="spellStart"/>
-      <w:r>
-        <w:rPr>
-          <w:rFonts w:ascii="Consolas" w:eastAsia="Times New Roman" w:hAnsi="Consolas" w:cs="Times New Roman"/>
-          <w:color w:val="CE9178"/>
-          <w:sz w:val="21"/>
-          <w:szCs w:val="21"/>
-          <w:lang w:eastAsia="en-IN"/>
-        </w:rPr>
-        <w:t>App.jsx</w:t>
-      </w:r>
-      <w:proofErr w:type="spellEnd"/>
-      <w:r>
-        <w:rPr>
-          <w:rFonts w:ascii="Consolas" w:eastAsia="Times New Roman" w:hAnsi="Consolas" w:cs="Times New Roman"/>
-          <w:color w:val="CE9178"/>
-          <w:sz w:val="21"/>
-          <w:szCs w:val="21"/>
-          <w:lang w:eastAsia="en-IN"/>
-        </w:rPr>
-        <w:t>'</w:t>
+        <w:t>'./App.jsx'</w:t>
       </w:r>
     </w:p>
     <w:p>
@@ -1323,7 +1088,6 @@
           <w:lang w:eastAsia="en-IN"/>
         </w:rPr>
       </w:pPr>
-      <w:proofErr w:type="spellStart"/>
       <w:r>
         <w:rPr>
           <w:rFonts w:ascii="Consolas" w:eastAsia="Times New Roman" w:hAnsi="Consolas" w:cs="Times New Roman"/>
@@ -1334,7 +1098,6 @@
         </w:rPr>
         <w:t>createRoot</w:t>
       </w:r>
-      <w:proofErr w:type="spellEnd"/>
       <w:r>
         <w:rPr>
           <w:rFonts w:ascii="Consolas" w:eastAsia="Times New Roman" w:hAnsi="Consolas" w:cs="Times New Roman"/>
@@ -1345,8 +1108,6 @@
         </w:rPr>
         <w:t>(</w:t>
       </w:r>
-      <w:proofErr w:type="spellStart"/>
-      <w:proofErr w:type="gramStart"/>
       <w:r>
         <w:rPr>
           <w:rFonts w:ascii="Consolas" w:eastAsia="Times New Roman" w:hAnsi="Consolas" w:cs="Times New Roman"/>
@@ -1377,8 +1138,6 @@
         </w:rPr>
         <w:t>getElementById</w:t>
       </w:r>
-      <w:proofErr w:type="spellEnd"/>
-      <w:proofErr w:type="gramEnd"/>
       <w:r>
         <w:rPr>
           <w:rFonts w:ascii="Consolas" w:eastAsia="Times New Roman" w:hAnsi="Consolas" w:cs="Times New Roman"/>
@@ -1462,7 +1221,6 @@
         </w:rPr>
         <w:t>&lt;</w:t>
       </w:r>
-      <w:proofErr w:type="spellStart"/>
       <w:r>
         <w:rPr>
           <w:rFonts w:ascii="Consolas" w:eastAsia="Times New Roman" w:hAnsi="Consolas" w:cs="Times New Roman"/>
@@ -1473,7 +1231,6 @@
         </w:rPr>
         <w:t>StrictMode</w:t>
       </w:r>
-      <w:proofErr w:type="spellEnd"/>
       <w:r>
         <w:rPr>
           <w:rFonts w:ascii="Consolas" w:eastAsia="Times New Roman" w:hAnsi="Consolas" w:cs="Times New Roman"/>
@@ -1580,7 +1337,6 @@
         </w:rPr>
         <w:t>&lt;/</w:t>
       </w:r>
-      <w:proofErr w:type="spellStart"/>
       <w:r>
         <w:rPr>
           <w:rFonts w:ascii="Consolas" w:eastAsia="Times New Roman" w:hAnsi="Consolas" w:cs="Times New Roman"/>
@@ -1591,7 +1347,6 @@
         </w:rPr>
         <w:t>StrictMode</w:t>
       </w:r>
-      <w:proofErr w:type="spellEnd"/>
       <w:r>
         <w:rPr>
           <w:rFonts w:ascii="Consolas" w:eastAsia="Times New Roman" w:hAnsi="Consolas" w:cs="Times New Roman"/>
@@ -1739,8 +1494,6 @@
         </w:rPr>
         <w:t xml:space="preserve"> </w:t>
       </w:r>
-      <w:proofErr w:type="spellStart"/>
-      <w:proofErr w:type="gramStart"/>
       <w:r>
         <w:rPr>
           <w:rFonts w:ascii="Consolas" w:eastAsia="Times New Roman" w:hAnsi="Consolas" w:cs="Times New Roman"/>
@@ -1751,27 +1504,15 @@
         </w:rPr>
         <w:t>FirstModule</w:t>
       </w:r>
-      <w:proofErr w:type="spellEnd"/>
-      <w:r>
-        <w:rPr>
-          <w:rFonts w:ascii="Consolas" w:eastAsia="Times New Roman" w:hAnsi="Consolas" w:cs="Times New Roman"/>
-          <w:color w:val="CCCCCC"/>
-          <w:sz w:val="21"/>
-          <w:szCs w:val="21"/>
-          <w:lang w:eastAsia="en-IN"/>
-        </w:rPr>
-        <w:t>(</w:t>
-      </w:r>
-      <w:proofErr w:type="gramEnd"/>
-      <w:r>
-        <w:rPr>
-          <w:rFonts w:ascii="Consolas" w:eastAsia="Times New Roman" w:hAnsi="Consolas" w:cs="Times New Roman"/>
-          <w:color w:val="CCCCCC"/>
-          <w:sz w:val="21"/>
-          <w:szCs w:val="21"/>
-          <w:lang w:eastAsia="en-IN"/>
-        </w:rPr>
-        <w:t>) {</w:t>
+      <w:r>
+        <w:rPr>
+          <w:rFonts w:ascii="Consolas" w:eastAsia="Times New Roman" w:hAnsi="Consolas" w:cs="Times New Roman"/>
+          <w:color w:val="CCCCCC"/>
+          <w:sz w:val="21"/>
+          <w:szCs w:val="21"/>
+          <w:lang w:eastAsia="en-IN"/>
+        </w:rPr>
+        <w:t>() {</w:t>
       </w:r>
     </w:p>
     <w:p>
@@ -1796,7 +1537,6 @@
         </w:rPr>
         <w:t xml:space="preserve">  </w:t>
       </w:r>
-      <w:proofErr w:type="spellStart"/>
       <w:r>
         <w:rPr>
           <w:rFonts w:ascii="Consolas" w:eastAsia="Times New Roman" w:hAnsi="Consolas" w:cs="Times New Roman"/>
@@ -1807,7 +1547,6 @@
         </w:rPr>
         <w:t>const</w:t>
       </w:r>
-      <w:proofErr w:type="spellEnd"/>
       <w:r>
         <w:rPr>
           <w:rFonts w:ascii="Consolas" w:eastAsia="Times New Roman" w:hAnsi="Consolas" w:cs="Times New Roman"/>
@@ -1838,7 +1577,6 @@
         </w:rPr>
         <w:t xml:space="preserve">, </w:t>
       </w:r>
-      <w:proofErr w:type="spellStart"/>
       <w:r>
         <w:rPr>
           <w:rFonts w:ascii="Consolas" w:eastAsia="Times New Roman" w:hAnsi="Consolas" w:cs="Times New Roman"/>
@@ -1849,7 +1587,6 @@
         </w:rPr>
         <w:t>setCount</w:t>
       </w:r>
-      <w:proofErr w:type="spellEnd"/>
       <w:r>
         <w:rPr>
           <w:rFonts w:ascii="Consolas" w:eastAsia="Times New Roman" w:hAnsi="Consolas" w:cs="Times New Roman"/>
@@ -1880,8 +1617,6 @@
         </w:rPr>
         <w:t xml:space="preserve"> </w:t>
       </w:r>
-      <w:proofErr w:type="spellStart"/>
-      <w:proofErr w:type="gramStart"/>
       <w:r>
         <w:rPr>
           <w:rFonts w:ascii="Consolas" w:eastAsia="Times New Roman" w:hAnsi="Consolas" w:cs="Times New Roman"/>
@@ -1892,7 +1627,6 @@
         </w:rPr>
         <w:t>useState</w:t>
       </w:r>
-      <w:proofErr w:type="spellEnd"/>
       <w:r>
         <w:rPr>
           <w:rFonts w:ascii="Consolas" w:eastAsia="Times New Roman" w:hAnsi="Consolas" w:cs="Times New Roman"/>
@@ -1903,7 +1637,6 @@
         </w:rPr>
         <w:t>(</w:t>
       </w:r>
-      <w:proofErr w:type="gramEnd"/>
       <w:r>
         <w:rPr>
           <w:rFonts w:ascii="Consolas" w:eastAsia="Times New Roman" w:hAnsi="Consolas" w:cs="Times New Roman"/>
@@ -2262,7 +1995,6 @@
         </w:rPr>
         <w:t xml:space="preserve"> </w:t>
       </w:r>
-      <w:proofErr w:type="spellStart"/>
       <w:r>
         <w:rPr>
           <w:rFonts w:ascii="Consolas" w:eastAsia="Times New Roman" w:hAnsi="Consolas" w:cs="Times New Roman"/>
@@ -2273,7 +2005,6 @@
         </w:rPr>
         <w:t>FirstModule</w:t>
       </w:r>
-      <w:proofErr w:type="spellEnd"/>
     </w:p>
     <w:p>
       <w:pPr>
@@ -2303,33 +2034,8 @@
           <w:rFonts w:cstheme="minorHAnsi"/>
           <w:lang w:val="en-US"/>
         </w:rPr>
-        <w:t xml:space="preserve">JSX: </w:t>
-      </w:r>
-      <w:proofErr w:type="spellStart"/>
-      <w:r>
-        <w:rPr>
-          <w:rFonts w:cstheme="minorHAnsi"/>
-          <w:lang w:val="en-US"/>
-        </w:rPr>
-        <w:t>javaScript</w:t>
-      </w:r>
-      <w:proofErr w:type="spellEnd"/>
-      <w:r>
-        <w:rPr>
-          <w:rFonts w:cstheme="minorHAnsi"/>
-          <w:lang w:val="en-US"/>
-        </w:rPr>
-        <w:t xml:space="preserve"> </w:t>
-      </w:r>
-      <w:proofErr w:type="spellStart"/>
-      <w:r>
-        <w:rPr>
-          <w:rFonts w:cstheme="minorHAnsi"/>
-          <w:lang w:val="en-US"/>
-        </w:rPr>
-        <w:t>Extention</w:t>
-      </w:r>
-      <w:proofErr w:type="spellEnd"/>
+        <w:t>JSX: javaScript Extention</w:t>
+      </w:r>
     </w:p>
     <w:p>
       <w:pPr>
@@ -2360,23 +2066,7 @@
           <w:rFonts w:cstheme="minorHAnsi"/>
           <w:lang w:val="en-US"/>
         </w:rPr>
-        <w:t xml:space="preserve"> </w:t>
-      </w:r>
-      <w:proofErr w:type="spellStart"/>
-      <w:r>
-        <w:rPr>
-          <w:rFonts w:cstheme="minorHAnsi"/>
-          <w:lang w:val="en-US"/>
-        </w:rPr>
-        <w:t>libray</w:t>
-      </w:r>
-      <w:proofErr w:type="spellEnd"/>
-      <w:r>
-        <w:rPr>
-          <w:rFonts w:cstheme="minorHAnsi"/>
-          <w:lang w:val="en-US"/>
-        </w:rPr>
-        <w:t>: we can decide its flow</w:t>
+        <w:t xml:space="preserve"> libray: we can decide its flow</w:t>
       </w:r>
     </w:p>
     <w:p>
@@ -2392,23 +2082,7 @@
           <w:rFonts w:cstheme="minorHAnsi"/>
           <w:lang w:val="en-US"/>
         </w:rPr>
-        <w:t xml:space="preserve">For </w:t>
-      </w:r>
-      <w:proofErr w:type="gramStart"/>
-      <w:r>
-        <w:rPr>
-          <w:rFonts w:cstheme="minorHAnsi"/>
-          <w:lang w:val="en-US"/>
-        </w:rPr>
-        <w:t>framework :</w:t>
-      </w:r>
-      <w:proofErr w:type="gramEnd"/>
-      <w:r>
-        <w:rPr>
-          <w:rFonts w:cstheme="minorHAnsi"/>
-          <w:lang w:val="en-US"/>
-        </w:rPr>
-        <w:t xml:space="preserve"> it has its fixed type</w:t>
+        <w:t>For framework : it has its fixed type</w:t>
       </w:r>
     </w:p>
     <w:p>
@@ -2472,8 +2146,6 @@
           <w:lang w:val="en-US"/>
         </w:rPr>
       </w:pPr>
-      <w:proofErr w:type="spellStart"/>
-      <w:proofErr w:type="gramStart"/>
       <w:r>
         <w:rPr>
           <w:rFonts w:cstheme="minorHAnsi"/>
@@ -2481,8 +2153,6 @@
         </w:rPr>
         <w:t>package.json</w:t>
       </w:r>
-      <w:proofErr w:type="spellEnd"/>
-      <w:proofErr w:type="gramEnd"/>
     </w:p>
     <w:p>
       <w:pPr>
@@ -2556,7 +2226,6 @@
         </w:rPr>
         <w:t xml:space="preserve"> </w:t>
       </w:r>
-      <w:proofErr w:type="spellStart"/>
       <w:r>
         <w:rPr>
           <w:rFonts w:ascii="Consolas" w:eastAsia="Times New Roman" w:hAnsi="Consolas" w:cs="Times New Roman"/>
@@ -2567,7 +2236,6 @@
         </w:rPr>
         <w:t>devDependencies</w:t>
       </w:r>
-      <w:proofErr w:type="spellEnd"/>
       <w:r>
         <w:rPr>
           <w:rFonts w:ascii="Consolas" w:eastAsia="Times New Roman" w:hAnsi="Consolas" w:cs="Times New Roman"/>
@@ -2586,10 +2254,8 @@
           <w:szCs w:val="21"/>
           <w:lang w:eastAsia="en-IN"/>
         </w:rPr>
-        <w:t xml:space="preserve"> development </w:t>
-      </w:r>
-      <w:proofErr w:type="spellStart"/>
-      <w:proofErr w:type="gramStart"/>
+        <w:t xml:space="preserve"> development dependancies.</w:t>
+      </w:r>
       <w:r>
         <w:rPr>
           <w:rFonts w:ascii="Consolas" w:eastAsia="Times New Roman" w:hAnsi="Consolas" w:cs="Times New Roman"/>
@@ -2598,7 +2264,7 @@
           <w:szCs w:val="21"/>
           <w:lang w:eastAsia="en-IN"/>
         </w:rPr>
-        <w:t>dependancies.</w:t>
+        <w:t xml:space="preserve">because </w:t>
       </w:r>
       <w:r>
         <w:rPr>
@@ -2608,10 +2274,8 @@
           <w:szCs w:val="21"/>
           <w:lang w:eastAsia="en-IN"/>
         </w:rPr>
-        <w:t>because</w:t>
-      </w:r>
-      <w:proofErr w:type="spellEnd"/>
-      <w:proofErr w:type="gramEnd"/>
+        <w:t xml:space="preserve">of </w:t>
+      </w:r>
       <w:r>
         <w:rPr>
           <w:rFonts w:ascii="Consolas" w:eastAsia="Times New Roman" w:hAnsi="Consolas" w:cs="Times New Roman"/>
@@ -2620,7 +2284,7 @@
           <w:szCs w:val="21"/>
           <w:lang w:eastAsia="en-IN"/>
         </w:rPr>
-        <w:t xml:space="preserve"> </w:t>
+        <w:t>which we can do development</w:t>
       </w:r>
       <w:r>
         <w:rPr>
@@ -2630,26 +2294,6 @@
           <w:szCs w:val="21"/>
           <w:lang w:eastAsia="en-IN"/>
         </w:rPr>
-        <w:t xml:space="preserve">of </w:t>
-      </w:r>
-      <w:r>
-        <w:rPr>
-          <w:rFonts w:ascii="Consolas" w:eastAsia="Times New Roman" w:hAnsi="Consolas" w:cs="Times New Roman"/>
-          <w:color w:val="9CDCFE"/>
-          <w:sz w:val="21"/>
-          <w:szCs w:val="21"/>
-          <w:lang w:eastAsia="en-IN"/>
-        </w:rPr>
-        <w:t>which we can do development</w:t>
-      </w:r>
-      <w:r>
-        <w:rPr>
-          <w:rFonts w:ascii="Consolas" w:eastAsia="Times New Roman" w:hAnsi="Consolas" w:cs="Times New Roman"/>
-          <w:color w:val="9CDCFE"/>
-          <w:sz w:val="21"/>
-          <w:szCs w:val="21"/>
-          <w:lang w:eastAsia="en-IN"/>
-        </w:rPr>
         <w:t>.</w:t>
       </w:r>
     </w:p>
@@ -2662,21 +2306,12 @@
           <w:lang w:val="en-US"/>
         </w:rPr>
       </w:pPr>
-      <w:proofErr w:type="spellStart"/>
-      <w:r>
-        <w:rPr>
-          <w:rFonts w:cstheme="minorHAnsi"/>
-          <w:lang w:val="en-US"/>
-        </w:rPr>
-        <w:t>node_module</w:t>
-      </w:r>
-      <w:proofErr w:type="spellEnd"/>
-      <w:r>
-        <w:rPr>
-          <w:rFonts w:cstheme="minorHAnsi"/>
-          <w:lang w:val="en-US"/>
-        </w:rPr>
-        <w:t>:</w:t>
+      <w:r>
+        <w:rPr>
+          <w:rFonts w:cstheme="minorHAnsi"/>
+          <w:lang w:val="en-US"/>
+        </w:rPr>
+        <w:t>node_module:</w:t>
       </w:r>
     </w:p>
     <w:p>
@@ -2700,39 +2335,7 @@
           <w:rFonts w:cstheme="minorHAnsi"/>
           <w:lang w:val="en-US"/>
         </w:rPr>
-        <w:t xml:space="preserve">all mentioned </w:t>
-      </w:r>
-      <w:proofErr w:type="spellStart"/>
-      <w:r>
-        <w:rPr>
-          <w:rFonts w:cstheme="minorHAnsi"/>
-          <w:lang w:val="en-US"/>
-        </w:rPr>
-        <w:t>dependancies</w:t>
-      </w:r>
-      <w:proofErr w:type="spellEnd"/>
-      <w:r>
-        <w:rPr>
-          <w:rFonts w:cstheme="minorHAnsi"/>
-          <w:lang w:val="en-US"/>
-        </w:rPr>
-        <w:t xml:space="preserve"> w r t their version, that code in exist in </w:t>
-      </w:r>
-      <w:proofErr w:type="spellStart"/>
-      <w:r>
-        <w:rPr>
-          <w:rFonts w:cstheme="minorHAnsi"/>
-          <w:lang w:val="en-US"/>
-        </w:rPr>
-        <w:t>node_module</w:t>
-      </w:r>
-      <w:proofErr w:type="spellEnd"/>
-      <w:r>
-        <w:rPr>
-          <w:rFonts w:cstheme="minorHAnsi"/>
-          <w:lang w:val="en-US"/>
-        </w:rPr>
-        <w:t xml:space="preserve"> folder</w:t>
+        <w:t>all mentioned dependancies w r t their version, that code in exist in node_module folder</w:t>
       </w:r>
     </w:p>
     <w:p>
@@ -2779,19 +2382,8 @@
           <w:rFonts w:cstheme="minorHAnsi"/>
           <w:lang w:val="en-US"/>
         </w:rPr>
-        <w:t>package-</w:t>
-      </w:r>
-      <w:proofErr w:type="spellStart"/>
-      <w:proofErr w:type="gramStart"/>
-      <w:r>
-        <w:rPr>
-          <w:rFonts w:cstheme="minorHAnsi"/>
-          <w:lang w:val="en-US"/>
-        </w:rPr>
-        <w:t>lock.json</w:t>
-      </w:r>
-      <w:proofErr w:type="spellEnd"/>
-      <w:proofErr w:type="gramEnd"/>
+        <w:t>package-lock.json</w:t>
+      </w:r>
     </w:p>
     <w:p>
       <w:pPr>
@@ -2903,24 +2495,13 @@
           <w:lang w:val="en-US"/>
         </w:rPr>
       </w:pPr>
-      <w:proofErr w:type="spellStart"/>
-      <w:proofErr w:type="gramStart"/>
-      <w:r>
-        <w:rPr>
-          <w:rFonts w:cstheme="minorHAnsi"/>
-          <w:lang w:val="en-US"/>
-        </w:rPr>
-        <w:t>vite.confige</w:t>
-      </w:r>
-      <w:proofErr w:type="gramEnd"/>
-      <w:r>
-        <w:rPr>
-          <w:rFonts w:cstheme="minorHAnsi"/>
-          <w:lang w:val="en-US"/>
-        </w:rPr>
-        <w:t>,s</w:t>
-      </w:r>
-      <w:proofErr w:type="spellEnd"/>
+      <w:r>
+        <w:rPr>
+          <w:rFonts w:cstheme="minorHAnsi"/>
+          <w:lang w:val="en-US"/>
+        </w:rPr>
+        <w:t>vite.confige,s</w:t>
+      </w:r>
     </w:p>
     <w:p>
       <w:pPr>
@@ -2936,17 +2517,8 @@
           <w:rFonts w:cstheme="minorHAnsi"/>
           <w:lang w:val="en-US"/>
         </w:rPr>
-        <w:t xml:space="preserve">-Used in configuration of </w:t>
-      </w:r>
-      <w:proofErr w:type="spellStart"/>
-      <w:r>
-        <w:rPr>
-          <w:rFonts w:cstheme="minorHAnsi"/>
-          <w:lang w:val="en-US"/>
-        </w:rPr>
-        <w:t>vite</w:t>
-      </w:r>
-      <w:proofErr w:type="spellEnd"/>
+        <w:t>-Used in configuration of vite</w:t>
+      </w:r>
     </w:p>
     <w:p>
       <w:pPr>
@@ -3054,39 +2626,7 @@
           <w:rFonts w:cstheme="minorHAnsi"/>
           <w:lang w:val="en-US"/>
         </w:rPr>
-        <w:t xml:space="preserve">-can make </w:t>
-      </w:r>
-      <w:proofErr w:type="gramStart"/>
-      <w:r>
-        <w:rPr>
-          <w:rFonts w:cstheme="minorHAnsi"/>
-          <w:lang w:val="en-US"/>
-        </w:rPr>
-        <w:t>rules ,</w:t>
-      </w:r>
-      <w:proofErr w:type="gramEnd"/>
-      <w:r>
-        <w:rPr>
-          <w:rFonts w:cstheme="minorHAnsi"/>
-          <w:lang w:val="en-US"/>
-        </w:rPr>
-        <w:t xml:space="preserve"> like </w:t>
-      </w:r>
-      <w:proofErr w:type="spellStart"/>
-      <w:r>
-        <w:rPr>
-          <w:rFonts w:cstheme="minorHAnsi"/>
-          <w:lang w:val="en-US"/>
-        </w:rPr>
-        <w:t>maxLength</w:t>
-      </w:r>
-      <w:proofErr w:type="spellEnd"/>
-      <w:r>
-        <w:rPr>
-          <w:rFonts w:cstheme="minorHAnsi"/>
-          <w:lang w:val="en-US"/>
-        </w:rPr>
-        <w:t xml:space="preserve"> of a function</w:t>
+        <w:t>-can make rules , like maxLength of a function</w:t>
       </w:r>
     </w:p>
     <w:p>
@@ -3107,17 +2647,8 @@
           <w:rFonts w:cstheme="minorHAnsi"/>
           <w:lang w:val="en-US"/>
         </w:rPr>
-        <w:t>-</w:t>
-      </w:r>
-      <w:proofErr w:type="gramStart"/>
-      <w:r>
-        <w:rPr>
-          <w:rFonts w:cstheme="minorHAnsi"/>
-          <w:lang w:val="en-US"/>
-        </w:rPr>
-        <w:t xml:space="preserve">which  </w:t>
-      </w:r>
-      <w:proofErr w:type="spellStart"/>
+        <w:t xml:space="preserve">-which  </w:t>
+      </w:r>
       <w:r>
         <w:rPr>
           <w:rFonts w:ascii="Consolas" w:eastAsia="Times New Roman" w:hAnsi="Consolas" w:cs="Times New Roman"/>
@@ -3128,8 +2659,6 @@
         </w:rPr>
         <w:t>ecmaVersion</w:t>
       </w:r>
-      <w:proofErr w:type="spellEnd"/>
-      <w:proofErr w:type="gramEnd"/>
       <w:r>
         <w:rPr>
           <w:rFonts w:ascii="Consolas" w:eastAsia="Times New Roman" w:hAnsi="Consolas" w:cs="Times New Roman"/>
@@ -3170,24 +2699,13 @@
           <w:lang w:val="en-US"/>
         </w:rPr>
       </w:pPr>
-      <w:proofErr w:type="gramStart"/>
-      <w:r>
-        <w:rPr>
-          <w:rFonts w:cstheme="minorHAnsi"/>
-          <w:lang w:val="en-US"/>
-        </w:rPr>
-        <w:t>.</w:t>
-      </w:r>
-      <w:proofErr w:type="spellStart"/>
-      <w:r>
-        <w:rPr>
-          <w:rFonts w:cstheme="minorHAnsi"/>
-          <w:lang w:val="en-US"/>
-        </w:rPr>
-        <w:t>gitignore</w:t>
-      </w:r>
-      <w:proofErr w:type="spellEnd"/>
-      <w:proofErr w:type="gramEnd"/>
+      <w:r>
+        <w:rPr>
+          <w:rFonts w:cstheme="minorHAnsi"/>
+          <w:lang w:val="en-US"/>
+        </w:rPr>
+        <w:t>.gitignore</w:t>
+      </w:r>
     </w:p>
     <w:p>
       <w:pPr>
@@ -3198,37 +2716,12 @@
           <w:lang w:val="en-US"/>
         </w:rPr>
       </w:pPr>
-      <w:proofErr w:type="spellStart"/>
-      <w:r>
-        <w:rPr>
-          <w:rFonts w:cstheme="minorHAnsi"/>
-          <w:lang w:val="en-US"/>
-        </w:rPr>
-        <w:t>Node_modules</w:t>
-      </w:r>
-      <w:proofErr w:type="spellEnd"/>
-      <w:r>
-        <w:rPr>
-          <w:rFonts w:cstheme="minorHAnsi"/>
-          <w:lang w:val="en-US"/>
-        </w:rPr>
-        <w:t xml:space="preserve"> we </w:t>
-      </w:r>
-      <w:proofErr w:type="spellStart"/>
-      <w:r>
-        <w:rPr>
-          <w:rFonts w:cstheme="minorHAnsi"/>
-          <w:lang w:val="en-US"/>
-        </w:rPr>
-        <w:t>wont</w:t>
-      </w:r>
-      <w:proofErr w:type="spellEnd"/>
-      <w:r>
-        <w:rPr>
-          <w:rFonts w:cstheme="minorHAnsi"/>
-          <w:lang w:val="en-US"/>
-        </w:rPr>
-        <w:t xml:space="preserve"> push</w:t>
+      <w:r>
+        <w:rPr>
+          <w:rFonts w:cstheme="minorHAnsi"/>
+          <w:lang w:val="en-US"/>
+        </w:rPr>
+        <w:t>Node_modules we wont push</w:t>
       </w:r>
     </w:p>
     <w:p>
@@ -3292,23 +2785,7 @@
           <w:rFonts w:cstheme="minorHAnsi"/>
           <w:lang w:val="en-US"/>
         </w:rPr>
-        <w:t>-</w:t>
-      </w:r>
-      <w:proofErr w:type="spellStart"/>
-      <w:r>
-        <w:rPr>
-          <w:rFonts w:cstheme="minorHAnsi"/>
-          <w:lang w:val="en-US"/>
-        </w:rPr>
-        <w:t>its</w:t>
-      </w:r>
-      <w:proofErr w:type="spellEnd"/>
-      <w:r>
-        <w:rPr>
-          <w:rFonts w:cstheme="minorHAnsi"/>
-          <w:lang w:val="en-US"/>
-        </w:rPr>
-        <w:t xml:space="preserve"> an entry file of project</w:t>
+        <w:t>-its an entry file of project</w:t>
       </w:r>
     </w:p>
     <w:p>
@@ -3406,23 +2883,7 @@
           <w:rFonts w:cstheme="minorHAnsi"/>
           <w:lang w:val="en-US"/>
         </w:rPr>
-        <w:t xml:space="preserve">-all actual development done </w:t>
-      </w:r>
-      <w:proofErr w:type="spellStart"/>
-      <w:r>
-        <w:rPr>
-          <w:rFonts w:cstheme="minorHAnsi"/>
-          <w:lang w:val="en-US"/>
-        </w:rPr>
-        <w:t>src</w:t>
-      </w:r>
-      <w:proofErr w:type="spellEnd"/>
-      <w:r>
-        <w:rPr>
-          <w:rFonts w:cstheme="minorHAnsi"/>
-          <w:lang w:val="en-US"/>
-        </w:rPr>
-        <w:t xml:space="preserve"> folder only</w:t>
+        <w:t>-all actual development done src folder only</w:t>
       </w:r>
     </w:p>
     <w:p>
@@ -3439,39 +2900,7 @@
           <w:rFonts w:cstheme="minorHAnsi"/>
           <w:lang w:val="en-US"/>
         </w:rPr>
-        <w:t xml:space="preserve">-write project </w:t>
-      </w:r>
-      <w:proofErr w:type="gramStart"/>
-      <w:r>
-        <w:rPr>
-          <w:rFonts w:cstheme="minorHAnsi"/>
-          <w:lang w:val="en-US"/>
-        </w:rPr>
-        <w:t>files .outside</w:t>
-      </w:r>
-      <w:proofErr w:type="gramEnd"/>
-      <w:r>
-        <w:rPr>
-          <w:rFonts w:cstheme="minorHAnsi"/>
-          <w:lang w:val="en-US"/>
-        </w:rPr>
-        <w:t xml:space="preserve"> of </w:t>
-      </w:r>
-      <w:proofErr w:type="spellStart"/>
-      <w:r>
-        <w:rPr>
-          <w:rFonts w:cstheme="minorHAnsi"/>
-          <w:lang w:val="en-US"/>
-        </w:rPr>
-        <w:t>src</w:t>
-      </w:r>
-      <w:proofErr w:type="spellEnd"/>
-      <w:r>
-        <w:rPr>
-          <w:rFonts w:cstheme="minorHAnsi"/>
-          <w:lang w:val="en-US"/>
-        </w:rPr>
-        <w:t xml:space="preserve">  can also work but not </w:t>
+        <w:t xml:space="preserve">-write project files .outside of src  can also work but not </w:t>
       </w:r>
       <w:r>
         <w:rPr>
@@ -3532,23 +2961,7 @@
           <w:rFonts w:cstheme="minorHAnsi"/>
           <w:lang w:val="en-US"/>
         </w:rPr>
-        <w:t xml:space="preserve">Can be same as assets folder in </w:t>
-      </w:r>
-      <w:proofErr w:type="spellStart"/>
-      <w:r>
-        <w:rPr>
-          <w:rFonts w:cstheme="minorHAnsi"/>
-          <w:lang w:val="en-US"/>
-        </w:rPr>
-        <w:t>src</w:t>
-      </w:r>
-      <w:proofErr w:type="spellEnd"/>
-      <w:r>
-        <w:rPr>
-          <w:rFonts w:cstheme="minorHAnsi"/>
-          <w:lang w:val="en-US"/>
-        </w:rPr>
-        <w:t xml:space="preserve"> folder</w:t>
+        <w:t>Can be same as assets folder in src folder</w:t>
       </w:r>
     </w:p>
     <w:p>
@@ -3590,21 +3003,12 @@
           <w:lang w:val="en-US"/>
         </w:rPr>
       </w:pPr>
-      <w:proofErr w:type="spellStart"/>
-      <w:r>
-        <w:rPr>
-          <w:rFonts w:cstheme="minorHAnsi"/>
-          <w:lang w:val="en-US"/>
-        </w:rPr>
-        <w:t>Node_module</w:t>
-      </w:r>
-      <w:proofErr w:type="spellEnd"/>
-      <w:r>
-        <w:rPr>
-          <w:rFonts w:cstheme="minorHAnsi"/>
-          <w:lang w:val="en-US"/>
-        </w:rPr>
-        <w:t xml:space="preserve"> folder</w:t>
+      <w:r>
+        <w:rPr>
+          <w:rFonts w:cstheme="minorHAnsi"/>
+          <w:lang w:val="en-US"/>
+        </w:rPr>
+        <w:t>Node_module folder</w:t>
       </w:r>
     </w:p>
     <w:p>
@@ -3638,39 +3042,7 @@
           <w:rFonts w:cstheme="minorHAnsi"/>
           <w:lang w:val="en-US"/>
         </w:rPr>
-        <w:t xml:space="preserve">-we </w:t>
-      </w:r>
-      <w:proofErr w:type="spellStart"/>
-      <w:r>
-        <w:rPr>
-          <w:rFonts w:cstheme="minorHAnsi"/>
-          <w:lang w:val="en-US"/>
-        </w:rPr>
-        <w:t>wont</w:t>
-      </w:r>
-      <w:proofErr w:type="spellEnd"/>
-      <w:r>
-        <w:rPr>
-          <w:rFonts w:cstheme="minorHAnsi"/>
-          <w:lang w:val="en-US"/>
-        </w:rPr>
-        <w:t xml:space="preserve"> push it on </w:t>
-      </w:r>
-      <w:proofErr w:type="spellStart"/>
-      <w:r>
-        <w:rPr>
-          <w:rFonts w:cstheme="minorHAnsi"/>
-          <w:lang w:val="en-US"/>
-        </w:rPr>
-        <w:t>git</w:t>
-      </w:r>
-      <w:proofErr w:type="spellEnd"/>
-      <w:r>
-        <w:rPr>
-          <w:rFonts w:cstheme="minorHAnsi"/>
-          <w:lang w:val="en-US"/>
-        </w:rPr>
-        <w:t xml:space="preserve"> because,</w:t>
+        <w:t>-we wont push it on git because,</w:t>
       </w:r>
     </w:p>
     <w:p>
@@ -3688,23 +3060,7 @@
           <w:lang w:val="en-US"/>
         </w:rPr>
         <w:tab/>
-        <w:t>-</w:t>
-      </w:r>
-      <w:proofErr w:type="spellStart"/>
-      <w:r>
-        <w:rPr>
-          <w:rFonts w:cstheme="minorHAnsi"/>
-          <w:lang w:val="en-US"/>
-        </w:rPr>
-        <w:t>its</w:t>
-      </w:r>
-      <w:proofErr w:type="spellEnd"/>
-      <w:r>
-        <w:rPr>
-          <w:rFonts w:cstheme="minorHAnsi"/>
-          <w:lang w:val="en-US"/>
-        </w:rPr>
-        <w:t xml:space="preserve"> too heavy, sometimes in GB</w:t>
+        <w:t>-its too heavy, sometimes in GB</w:t>
       </w:r>
     </w:p>
     <w:p>
@@ -3721,23 +3077,7 @@
           <w:rFonts w:cstheme="minorHAnsi"/>
           <w:lang w:val="en-US"/>
         </w:rPr>
-        <w:t xml:space="preserve">-when new developer </w:t>
-      </w:r>
-      <w:proofErr w:type="gramStart"/>
-      <w:r>
-        <w:rPr>
-          <w:rFonts w:cstheme="minorHAnsi"/>
-          <w:lang w:val="en-US"/>
-        </w:rPr>
-        <w:t>want</w:t>
-      </w:r>
-      <w:proofErr w:type="gramEnd"/>
-      <w:r>
-        <w:rPr>
-          <w:rFonts w:cstheme="minorHAnsi"/>
-          <w:lang w:val="en-US"/>
-        </w:rPr>
-        <w:t xml:space="preserve"> to install he need to execute</w:t>
+        <w:t>-when new developer want to install he need to execute</w:t>
       </w:r>
     </w:p>
     <w:p>
@@ -3755,22 +3095,7 @@
           <w:lang w:val="en-US"/>
         </w:rPr>
         <w:tab/>
-      </w:r>
-      <w:proofErr w:type="spellStart"/>
-      <w:r>
-        <w:rPr>
-          <w:rFonts w:cstheme="minorHAnsi"/>
-          <w:lang w:val="en-US"/>
-        </w:rPr>
-        <w:t>npm</w:t>
-      </w:r>
-      <w:proofErr w:type="spellEnd"/>
-      <w:r>
-        <w:rPr>
-          <w:rFonts w:cstheme="minorHAnsi"/>
-          <w:lang w:val="en-US"/>
-        </w:rPr>
-        <w:t xml:space="preserve"> install</w:t>
+        <w:t>npm install</w:t>
       </w:r>
     </w:p>
     <w:p>
@@ -4052,23 +3377,7 @@
           <w:rFonts w:cstheme="minorHAnsi"/>
           <w:lang w:val="en-US"/>
         </w:rPr>
-        <w:t xml:space="preserve">function app </w:t>
-      </w:r>
-      <w:proofErr w:type="gramStart"/>
-      <w:r>
-        <w:rPr>
-          <w:rFonts w:cstheme="minorHAnsi"/>
-          <w:lang w:val="en-US"/>
-        </w:rPr>
-        <w:t>(){</w:t>
-      </w:r>
-      <w:proofErr w:type="gramEnd"/>
-      <w:r>
-        <w:rPr>
-          <w:rFonts w:cstheme="minorHAnsi"/>
-          <w:lang w:val="en-US"/>
-        </w:rPr>
-        <w:t>}</w:t>
+        <w:t>function app (){}</w:t>
       </w:r>
     </w:p>
     <w:p>
@@ -4110,23 +3419,7 @@
           <w:lang w:val="en-US"/>
         </w:rPr>
         <w:tab/>
-        <w:t xml:space="preserve">function App </w:t>
-      </w:r>
-      <w:proofErr w:type="gramStart"/>
-      <w:r>
-        <w:rPr>
-          <w:rFonts w:cstheme="minorHAnsi"/>
-          <w:lang w:val="en-US"/>
-        </w:rPr>
-        <w:t>(){</w:t>
-      </w:r>
-      <w:proofErr w:type="gramEnd"/>
-      <w:r>
-        <w:rPr>
-          <w:rFonts w:cstheme="minorHAnsi"/>
-          <w:lang w:val="en-US"/>
-        </w:rPr>
-        <w:t>}</w:t>
+        <w:t>function App (){}</w:t>
       </w:r>
     </w:p>
     <w:p>
@@ -4150,23 +3443,7 @@
           <w:rFonts w:cstheme="minorHAnsi"/>
           <w:lang w:val="en-US"/>
         </w:rPr>
-        <w:t xml:space="preserve">component can </w:t>
-      </w:r>
-      <w:proofErr w:type="spellStart"/>
-      <w:r>
-        <w:rPr>
-          <w:rFonts w:cstheme="minorHAnsi"/>
-          <w:lang w:val="en-US"/>
-        </w:rPr>
-        <w:t>contatin</w:t>
-      </w:r>
-      <w:proofErr w:type="spellEnd"/>
-      <w:r>
-        <w:rPr>
-          <w:rFonts w:cstheme="minorHAnsi"/>
-          <w:lang w:val="en-US"/>
-        </w:rPr>
-        <w:t xml:space="preserve"> HTML code, JavaScript or JSX code as well</w:t>
+        <w:t>component can contatin HTML code, JavaScript or JSX code as well</w:t>
       </w:r>
       <w:r>
         <w:rPr>
@@ -4190,23 +3467,7 @@
           <w:rFonts w:cstheme="minorHAnsi"/>
           <w:lang w:val="en-US"/>
         </w:rPr>
-        <w:t xml:space="preserve">-function will contain only </w:t>
-      </w:r>
-      <w:proofErr w:type="spellStart"/>
-      <w:r>
-        <w:rPr>
-          <w:rFonts w:cstheme="minorHAnsi"/>
-          <w:lang w:val="en-US"/>
-        </w:rPr>
-        <w:t>javaScript</w:t>
-      </w:r>
-      <w:proofErr w:type="spellEnd"/>
-      <w:r>
-        <w:rPr>
-          <w:rFonts w:cstheme="minorHAnsi"/>
-          <w:lang w:val="en-US"/>
-        </w:rPr>
-        <w:t xml:space="preserve"> code</w:t>
+        <w:t>-function will contain only javaScript code</w:t>
       </w:r>
     </w:p>
     <w:p>
@@ -4264,23 +3525,7 @@
           <w:rFonts w:cstheme="minorHAnsi"/>
           <w:lang w:val="en-US"/>
         </w:rPr>
-        <w:t xml:space="preserve">Class based </w:t>
-      </w:r>
-      <w:proofErr w:type="gramStart"/>
-      <w:r>
-        <w:rPr>
-          <w:rFonts w:cstheme="minorHAnsi"/>
-          <w:lang w:val="en-US"/>
-        </w:rPr>
-        <w:t>component(</w:t>
-      </w:r>
-      <w:proofErr w:type="gramEnd"/>
-      <w:r>
-        <w:rPr>
-          <w:rFonts w:cstheme="minorHAnsi"/>
-          <w:lang w:val="en-US"/>
-        </w:rPr>
-        <w:t>which was used earlier)</w:t>
+        <w:t>Class based component(which was used earlier)</w:t>
       </w:r>
     </w:p>
     <w:p>
@@ -4494,23 +3739,7 @@
           <w:rFonts w:cstheme="minorHAnsi"/>
           <w:lang w:val="en-US"/>
         </w:rPr>
-        <w:t xml:space="preserve">We can export variable and constants as </w:t>
-      </w:r>
-      <w:proofErr w:type="gramStart"/>
-      <w:r>
-        <w:rPr>
-          <w:rFonts w:cstheme="minorHAnsi"/>
-          <w:lang w:val="en-US"/>
-        </w:rPr>
-        <w:t>well(</w:t>
-      </w:r>
-      <w:proofErr w:type="gramEnd"/>
-      <w:r>
-        <w:rPr>
-          <w:rFonts w:cstheme="minorHAnsi"/>
-          <w:lang w:val="en-US"/>
-        </w:rPr>
-        <w:t>Not just function)</w:t>
+        <w:t>We can export variable and constants as well(Not just function)</w:t>
       </w:r>
     </w:p>
     <w:p>
@@ -4755,6 +3984,55 @@
       <w:pPr>
         <w:rPr>
           <w:rFonts w:cstheme="minorHAnsi"/>
+          <w:b/>
+          <w:lang w:val="en-US"/>
+        </w:rPr>
+      </w:pPr>
+      <w:r>
+        <w:rPr>
+          <w:rFonts w:cstheme="minorHAnsi"/>
+          <w:b/>
+          <w:lang w:val="en-US"/>
+        </w:rPr>
+        <w:t>(Note:</w:t>
+      </w:r>
+      <w:r>
+        <w:rPr>
+          <w:rFonts w:cstheme="minorHAnsi"/>
+          <w:bCs/>
+          <w:lang w:val="en-US"/>
+        </w:rPr>
+        <w:t xml:space="preserve"> jar eka function same condition </w:t>
+      </w:r>
+      <w:r>
+        <w:rPr>
+          <w:rFonts w:cstheme="minorHAnsi"/>
+          <w:b/>
+          <w:lang w:val="en-US"/>
+        </w:rPr>
+        <w:t>if else or switch</w:t>
+      </w:r>
+      <w:r>
+        <w:rPr>
+          <w:rFonts w:cstheme="minorHAnsi"/>
+          <w:bCs/>
+          <w:lang w:val="en-US"/>
+        </w:rPr>
+        <w:t xml:space="preserve"> madhe check hot asel tr jo occurrence aadhi asel to execute hoto </w:t>
+      </w:r>
+      <w:r>
+        <w:rPr>
+          <w:rFonts w:cstheme="minorHAnsi"/>
+          <w:b/>
+          <w:lang w:val="en-US"/>
+        </w:rPr>
+        <w:t>)</w:t>
+      </w:r>
+    </w:p>
+    <w:p>
+      <w:pPr>
+        <w:rPr>
+          <w:rFonts w:cstheme="minorHAnsi"/>
           <w:lang w:val="en-US"/>
         </w:rPr>
       </w:pPr>
@@ -4780,15 +4058,33 @@
         </w:rPr>
         <w:t xml:space="preserve">We write </w:t>
       </w:r>
-      <w:proofErr w:type="gramStart"/>
-      <w:r>
-        <w:rPr>
-          <w:rFonts w:cstheme="minorHAnsi"/>
-          <w:lang w:val="en-US"/>
-        </w:rPr>
-        <w:t>1.variable</w:t>
-      </w:r>
-      <w:proofErr w:type="gramEnd"/>
+      <w:r>
+        <w:rPr>
+          <w:rFonts w:cstheme="minorHAnsi"/>
+          <w:lang w:val="en-US"/>
+        </w:rPr>
+        <w:t xml:space="preserve">below in curly braces </w:t>
+      </w:r>
+    </w:p>
+    <w:p>
+      <w:pPr>
+        <w:pStyle w:val="ListParagraph"/>
+        <w:numPr>
+          <w:ilvl w:val="0"/>
+          <w:numId w:val="7"/>
+        </w:numPr>
+        <w:rPr>
+          <w:rFonts w:cstheme="minorHAnsi"/>
+          <w:lang w:val="en-US"/>
+        </w:rPr>
+      </w:pPr>
+      <w:r>
+        <w:rPr>
+          <w:rFonts w:cstheme="minorHAnsi"/>
+          <w:lang w:val="en-US"/>
+        </w:rPr>
+        <w:t>Variable</w:t>
+      </w:r>
       <w:r>
         <w:rPr>
           <w:rFonts w:cstheme="minorHAnsi"/>
@@ -4814,7 +4110,7 @@
           <w:rFonts w:cstheme="minorHAnsi"/>
           <w:lang w:val="en-US"/>
         </w:rPr>
-        <w:t xml:space="preserve">condition, </w:t>
+        <w:t>Can perform two variable addition or such operation</w:t>
       </w:r>
     </w:p>
     <w:p>
@@ -4834,7 +4130,61 @@
           <w:rFonts w:cstheme="minorHAnsi"/>
           <w:lang w:val="en-US"/>
         </w:rPr>
-        <w:t>Use function,</w:t>
+        <w:t>Use function</w:t>
+      </w:r>
+      <w:r>
+        <w:rPr>
+          <w:rFonts w:cstheme="minorHAnsi"/>
+          <w:lang w:val="en-US"/>
+        </w:rPr>
+        <w:t xml:space="preserve">: </w:t>
+      </w:r>
+    </w:p>
+    <w:p>
+      <w:pPr>
+        <w:pStyle w:val="ListParagraph"/>
+        <w:numPr>
+          <w:ilvl w:val="1"/>
+          <w:numId w:val="4"/>
+        </w:numPr>
+        <w:rPr>
+          <w:rFonts w:cstheme="minorHAnsi"/>
+          <w:lang w:val="en-US"/>
+        </w:rPr>
+      </w:pPr>
+      <w:r>
+        <w:rPr>
+          <w:rFonts w:cstheme="minorHAnsi"/>
+          <w:lang w:val="en-US"/>
+        </w:rPr>
+        <w:t>Without parameter: you can simply write return statement to return</w:t>
+      </w:r>
+    </w:p>
+    <w:p>
+      <w:pPr>
+        <w:pStyle w:val="ListParagraph"/>
+        <w:numPr>
+          <w:ilvl w:val="1"/>
+          <w:numId w:val="4"/>
+        </w:numPr>
+        <w:rPr>
+          <w:rFonts w:cstheme="minorHAnsi"/>
+          <w:lang w:val="en-US"/>
+        </w:rPr>
+      </w:pPr>
+      <w:r>
+        <w:rPr>
+          <w:rFonts w:cstheme="minorHAnsi"/>
+          <w:lang w:val="en-US"/>
+        </w:rPr>
+        <w:t>with parameter:  you can pass parameter to function</w:t>
+      </w:r>
+      <w:r>
+        <w:rPr>
+          <w:rFonts w:cstheme="minorHAnsi"/>
+          <w:lang w:val="en-US"/>
+        </w:rPr>
+        <w:t xml:space="preserve"> and perform operation to inside function</w:t>
       </w:r>
     </w:p>
     <w:p>
@@ -4854,8 +4204,705 @@
           <w:rFonts w:cstheme="minorHAnsi"/>
           <w:lang w:val="en-US"/>
         </w:rPr>
-        <w:t xml:space="preserve">Operation inside JSX, </w:t>
-      </w:r>
+        <w:t>Object and array inside jsx</w:t>
+      </w:r>
+    </w:p>
+    <w:p>
+      <w:pPr>
+        <w:pStyle w:val="ListParagraph"/>
+        <w:shd w:val="clear" w:color="auto" w:fill="1F1F1F"/>
+        <w:spacing w:after="0" w:line="285" w:lineRule="atLeast"/>
+        <w:rPr>
+          <w:rFonts w:ascii="Consolas" w:eastAsia="Times New Roman" w:hAnsi="Consolas" w:cs="Times New Roman"/>
+          <w:color w:val="CCCCCC"/>
+          <w:sz w:val="21"/>
+          <w:szCs w:val="21"/>
+          <w:lang w:eastAsia="en-IN"/>
+        </w:rPr>
+      </w:pPr>
+      <w:r>
+        <w:rPr>
+          <w:rFonts w:ascii="Consolas" w:eastAsia="Times New Roman" w:hAnsi="Consolas" w:cs="Times New Roman"/>
+          <w:color w:val="CCCCCC"/>
+          <w:sz w:val="21"/>
+          <w:szCs w:val="21"/>
+          <w:lang w:eastAsia="en-IN"/>
+        </w:rPr>
+        <w:t xml:space="preserve">Check Object: </w:t>
+      </w:r>
+    </w:p>
+    <w:p>
+      <w:pPr>
+        <w:pStyle w:val="ListParagraph"/>
+        <w:shd w:val="clear" w:color="auto" w:fill="1F1F1F"/>
+        <w:spacing w:after="0" w:line="285" w:lineRule="atLeast"/>
+        <w:rPr>
+          <w:rFonts w:ascii="Consolas" w:eastAsia="Times New Roman" w:hAnsi="Consolas" w:cs="Times New Roman"/>
+          <w:color w:val="CCCCCC"/>
+          <w:sz w:val="21"/>
+          <w:szCs w:val="21"/>
+          <w:lang w:eastAsia="en-IN"/>
+        </w:rPr>
+      </w:pPr>
+      <w:r>
+        <w:rPr>
+          <w:rFonts w:ascii="Consolas" w:eastAsia="Times New Roman" w:hAnsi="Consolas" w:cs="Times New Roman"/>
+          <w:color w:val="808080"/>
+          <w:sz w:val="21"/>
+          <w:szCs w:val="21"/>
+          <w:lang w:eastAsia="en-IN"/>
+        </w:rPr>
+        <w:t>&lt;</w:t>
+      </w:r>
+      <w:r>
+        <w:rPr>
+          <w:rFonts w:ascii="Consolas" w:eastAsia="Times New Roman" w:hAnsi="Consolas" w:cs="Times New Roman"/>
+          <w:color w:val="569CD6"/>
+          <w:sz w:val="21"/>
+          <w:szCs w:val="21"/>
+          <w:lang w:eastAsia="en-IN"/>
+        </w:rPr>
+        <w:t>input</w:t>
+      </w:r>
+      <w:r>
+        <w:rPr>
+          <w:rFonts w:ascii="Consolas" w:eastAsia="Times New Roman" w:hAnsi="Consolas" w:cs="Times New Roman"/>
+          <w:color w:val="CCCCCC"/>
+          <w:sz w:val="21"/>
+          <w:szCs w:val="21"/>
+          <w:lang w:eastAsia="en-IN"/>
+        </w:rPr>
+        <w:t xml:space="preserve"> </w:t>
+      </w:r>
+      <w:r>
+        <w:rPr>
+          <w:rFonts w:ascii="Consolas" w:eastAsia="Times New Roman" w:hAnsi="Consolas" w:cs="Times New Roman"/>
+          <w:color w:val="9CDCFE"/>
+          <w:sz w:val="21"/>
+          <w:szCs w:val="21"/>
+          <w:lang w:eastAsia="en-IN"/>
+        </w:rPr>
+        <w:t>type</w:t>
+      </w:r>
+      <w:r>
+        <w:rPr>
+          <w:rFonts w:ascii="Consolas" w:eastAsia="Times New Roman" w:hAnsi="Consolas" w:cs="Times New Roman"/>
+          <w:color w:val="D4D4D4"/>
+          <w:sz w:val="21"/>
+          <w:szCs w:val="21"/>
+          <w:lang w:eastAsia="en-IN"/>
+        </w:rPr>
+        <w:t>=</w:t>
+      </w:r>
+      <w:r>
+        <w:rPr>
+          <w:rFonts w:ascii="Consolas" w:eastAsia="Times New Roman" w:hAnsi="Consolas" w:cs="Times New Roman"/>
+          <w:color w:val="CE9178"/>
+          <w:sz w:val="21"/>
+          <w:szCs w:val="21"/>
+          <w:lang w:eastAsia="en-IN"/>
+        </w:rPr>
+        <w:t>"text"</w:t>
+      </w:r>
+      <w:r>
+        <w:rPr>
+          <w:rFonts w:ascii="Consolas" w:eastAsia="Times New Roman" w:hAnsi="Consolas" w:cs="Times New Roman"/>
+          <w:color w:val="CCCCCC"/>
+          <w:sz w:val="21"/>
+          <w:szCs w:val="21"/>
+          <w:lang w:eastAsia="en-IN"/>
+        </w:rPr>
+        <w:t xml:space="preserve"> </w:t>
+      </w:r>
+      <w:r>
+        <w:rPr>
+          <w:rFonts w:ascii="Consolas" w:eastAsia="Times New Roman" w:hAnsi="Consolas" w:cs="Times New Roman"/>
+          <w:color w:val="9CDCFE"/>
+          <w:sz w:val="21"/>
+          <w:szCs w:val="21"/>
+          <w:lang w:eastAsia="en-IN"/>
+        </w:rPr>
+        <w:t>name</w:t>
+      </w:r>
+      <w:r>
+        <w:rPr>
+          <w:rFonts w:ascii="Consolas" w:eastAsia="Times New Roman" w:hAnsi="Consolas" w:cs="Times New Roman"/>
+          <w:color w:val="D4D4D4"/>
+          <w:sz w:val="21"/>
+          <w:szCs w:val="21"/>
+          <w:lang w:eastAsia="en-IN"/>
+        </w:rPr>
+        <w:t>=</w:t>
+      </w:r>
+      <w:r>
+        <w:rPr>
+          <w:rFonts w:ascii="Consolas" w:eastAsia="Times New Roman" w:hAnsi="Consolas" w:cs="Times New Roman"/>
+          <w:color w:val="569CD6"/>
+          <w:sz w:val="21"/>
+          <w:szCs w:val="21"/>
+          <w:lang w:eastAsia="en-IN"/>
+        </w:rPr>
+        <w:t>{</w:t>
+      </w:r>
+      <w:r>
+        <w:rPr>
+          <w:rFonts w:ascii="Consolas" w:eastAsia="Times New Roman" w:hAnsi="Consolas" w:cs="Times New Roman"/>
+          <w:color w:val="4FC1FF"/>
+          <w:sz w:val="21"/>
+          <w:szCs w:val="21"/>
+          <w:lang w:eastAsia="en-IN"/>
+        </w:rPr>
+        <w:t>userObj</w:t>
+      </w:r>
+      <w:r>
+        <w:rPr>
+          <w:rFonts w:ascii="Consolas" w:eastAsia="Times New Roman" w:hAnsi="Consolas" w:cs="Times New Roman"/>
+          <w:color w:val="D4D4D4"/>
+          <w:sz w:val="21"/>
+          <w:szCs w:val="21"/>
+          <w:lang w:eastAsia="en-IN"/>
+        </w:rPr>
+        <w:t>.</w:t>
+      </w:r>
+      <w:r>
+        <w:rPr>
+          <w:rFonts w:ascii="Consolas" w:eastAsia="Times New Roman" w:hAnsi="Consolas" w:cs="Times New Roman"/>
+          <w:color w:val="9CDCFE"/>
+          <w:sz w:val="21"/>
+          <w:szCs w:val="21"/>
+          <w:lang w:eastAsia="en-IN"/>
+        </w:rPr>
+        <w:t>name</w:t>
+      </w:r>
+      <w:r>
+        <w:rPr>
+          <w:rFonts w:ascii="Consolas" w:eastAsia="Times New Roman" w:hAnsi="Consolas" w:cs="Times New Roman"/>
+          <w:color w:val="569CD6"/>
+          <w:sz w:val="21"/>
+          <w:szCs w:val="21"/>
+          <w:lang w:eastAsia="en-IN"/>
+        </w:rPr>
+        <w:t>}</w:t>
+      </w:r>
+      <w:r>
+        <w:rPr>
+          <w:rFonts w:ascii="Consolas" w:eastAsia="Times New Roman" w:hAnsi="Consolas" w:cs="Times New Roman"/>
+          <w:color w:val="CCCCCC"/>
+          <w:sz w:val="21"/>
+          <w:szCs w:val="21"/>
+          <w:lang w:eastAsia="en-IN"/>
+        </w:rPr>
+        <w:t xml:space="preserve"> </w:t>
+      </w:r>
+      <w:r>
+        <w:rPr>
+          <w:rFonts w:ascii="Consolas" w:eastAsia="Times New Roman" w:hAnsi="Consolas" w:cs="Times New Roman"/>
+          <w:color w:val="9CDCFE"/>
+          <w:sz w:val="21"/>
+          <w:szCs w:val="21"/>
+          <w:lang w:eastAsia="en-IN"/>
+        </w:rPr>
+        <w:t>value</w:t>
+      </w:r>
+      <w:r>
+        <w:rPr>
+          <w:rFonts w:ascii="Consolas" w:eastAsia="Times New Roman" w:hAnsi="Consolas" w:cs="Times New Roman"/>
+          <w:color w:val="D4D4D4"/>
+          <w:sz w:val="21"/>
+          <w:szCs w:val="21"/>
+          <w:lang w:eastAsia="en-IN"/>
+        </w:rPr>
+        <w:t>=</w:t>
+      </w:r>
+      <w:r>
+        <w:rPr>
+          <w:rFonts w:ascii="Consolas" w:eastAsia="Times New Roman" w:hAnsi="Consolas" w:cs="Times New Roman"/>
+          <w:color w:val="569CD6"/>
+          <w:sz w:val="21"/>
+          <w:szCs w:val="21"/>
+          <w:lang w:eastAsia="en-IN"/>
+        </w:rPr>
+        <w:t>{</w:t>
+      </w:r>
+      <w:r>
+        <w:rPr>
+          <w:rFonts w:ascii="Consolas" w:eastAsia="Times New Roman" w:hAnsi="Consolas" w:cs="Times New Roman"/>
+          <w:color w:val="4FC1FF"/>
+          <w:sz w:val="21"/>
+          <w:szCs w:val="21"/>
+          <w:lang w:eastAsia="en-IN"/>
+        </w:rPr>
+        <w:t>userObj</w:t>
+      </w:r>
+      <w:r>
+        <w:rPr>
+          <w:rFonts w:ascii="Consolas" w:eastAsia="Times New Roman" w:hAnsi="Consolas" w:cs="Times New Roman"/>
+          <w:color w:val="D4D4D4"/>
+          <w:sz w:val="21"/>
+          <w:szCs w:val="21"/>
+          <w:lang w:eastAsia="en-IN"/>
+        </w:rPr>
+        <w:t>.</w:t>
+      </w:r>
+      <w:r>
+        <w:rPr>
+          <w:rFonts w:ascii="Consolas" w:eastAsia="Times New Roman" w:hAnsi="Consolas" w:cs="Times New Roman"/>
+          <w:color w:val="9CDCFE"/>
+          <w:sz w:val="21"/>
+          <w:szCs w:val="21"/>
+          <w:lang w:eastAsia="en-IN"/>
+        </w:rPr>
+        <w:t>subject</w:t>
+      </w:r>
+      <w:r>
+        <w:rPr>
+          <w:rFonts w:ascii="Consolas" w:eastAsia="Times New Roman" w:hAnsi="Consolas" w:cs="Times New Roman"/>
+          <w:color w:val="569CD6"/>
+          <w:sz w:val="21"/>
+          <w:szCs w:val="21"/>
+          <w:lang w:eastAsia="en-IN"/>
+        </w:rPr>
+        <w:t>}</w:t>
+      </w:r>
+      <w:r>
+        <w:rPr>
+          <w:rFonts w:ascii="Consolas" w:eastAsia="Times New Roman" w:hAnsi="Consolas" w:cs="Times New Roman"/>
+          <w:color w:val="CCCCCC"/>
+          <w:sz w:val="21"/>
+          <w:szCs w:val="21"/>
+          <w:lang w:eastAsia="en-IN"/>
+        </w:rPr>
+        <w:t xml:space="preserve"> </w:t>
+      </w:r>
+      <w:r>
+        <w:rPr>
+          <w:rFonts w:ascii="Consolas" w:eastAsia="Times New Roman" w:hAnsi="Consolas" w:cs="Times New Roman"/>
+          <w:color w:val="808080"/>
+          <w:sz w:val="21"/>
+          <w:szCs w:val="21"/>
+          <w:lang w:eastAsia="en-IN"/>
+        </w:rPr>
+        <w:t>/&gt;</w:t>
+      </w:r>
+    </w:p>
+    <w:p>
+      <w:pPr>
+        <w:pStyle w:val="ListParagraph"/>
+        <w:shd w:val="clear" w:color="auto" w:fill="1F1F1F"/>
+        <w:spacing w:after="0" w:line="285" w:lineRule="atLeast"/>
+        <w:rPr>
+          <w:rFonts w:ascii="Consolas" w:eastAsia="Times New Roman" w:hAnsi="Consolas" w:cs="Times New Roman"/>
+          <w:color w:val="CCCCCC"/>
+          <w:sz w:val="21"/>
+          <w:szCs w:val="21"/>
+          <w:lang w:eastAsia="en-IN"/>
+        </w:rPr>
+      </w:pPr>
+      <w:r>
+        <w:rPr>
+          <w:rFonts w:ascii="Consolas" w:eastAsia="Times New Roman" w:hAnsi="Consolas" w:cs="Times New Roman"/>
+          <w:color w:val="CCCCCC"/>
+          <w:sz w:val="21"/>
+          <w:szCs w:val="21"/>
+          <w:lang w:eastAsia="en-IN"/>
+        </w:rPr>
+        <w:t>       </w:t>
+      </w:r>
+    </w:p>
+    <w:p>
+      <w:pPr>
+        <w:pStyle w:val="ListParagraph"/>
+        <w:shd w:val="clear" w:color="auto" w:fill="1F1F1F"/>
+        <w:spacing w:after="0" w:line="285" w:lineRule="atLeast"/>
+        <w:rPr>
+          <w:rFonts w:ascii="Consolas" w:eastAsia="Times New Roman" w:hAnsi="Consolas" w:cs="Times New Roman"/>
+          <w:color w:val="CCCCCC"/>
+          <w:sz w:val="21"/>
+          <w:szCs w:val="21"/>
+          <w:lang w:eastAsia="en-IN"/>
+        </w:rPr>
+      </w:pPr>
+      <w:r>
+        <w:rPr>
+          <w:rFonts w:ascii="Consolas" w:eastAsia="Times New Roman" w:hAnsi="Consolas" w:cs="Times New Roman"/>
+          <w:color w:val="808080"/>
+          <w:sz w:val="21"/>
+          <w:szCs w:val="21"/>
+          <w:lang w:eastAsia="en-IN"/>
+        </w:rPr>
+        <w:t>&lt;</w:t>
+      </w:r>
+      <w:r>
+        <w:rPr>
+          <w:rFonts w:ascii="Consolas" w:eastAsia="Times New Roman" w:hAnsi="Consolas" w:cs="Times New Roman"/>
+          <w:color w:val="569CD6"/>
+          <w:sz w:val="21"/>
+          <w:szCs w:val="21"/>
+          <w:lang w:eastAsia="en-IN"/>
+        </w:rPr>
+        <w:t>br</w:t>
+      </w:r>
+      <w:r>
+        <w:rPr>
+          <w:rFonts w:ascii="Consolas" w:eastAsia="Times New Roman" w:hAnsi="Consolas" w:cs="Times New Roman"/>
+          <w:color w:val="808080"/>
+          <w:sz w:val="21"/>
+          <w:szCs w:val="21"/>
+          <w:lang w:eastAsia="en-IN"/>
+        </w:rPr>
+        <w:t>/&gt;&lt;</w:t>
+      </w:r>
+      <w:r>
+        <w:rPr>
+          <w:rFonts w:ascii="Consolas" w:eastAsia="Times New Roman" w:hAnsi="Consolas" w:cs="Times New Roman"/>
+          <w:color w:val="569CD6"/>
+          <w:sz w:val="21"/>
+          <w:szCs w:val="21"/>
+          <w:lang w:eastAsia="en-IN"/>
+        </w:rPr>
+        <w:t>br</w:t>
+      </w:r>
+      <w:r>
+        <w:rPr>
+          <w:rFonts w:ascii="Consolas" w:eastAsia="Times New Roman" w:hAnsi="Consolas" w:cs="Times New Roman"/>
+          <w:color w:val="808080"/>
+          <w:sz w:val="21"/>
+          <w:szCs w:val="21"/>
+          <w:lang w:eastAsia="en-IN"/>
+        </w:rPr>
+        <w:t>/&gt;</w:t>
+      </w:r>
+    </w:p>
+    <w:p>
+      <w:pPr>
+        <w:pStyle w:val="ListParagraph"/>
+        <w:shd w:val="clear" w:color="auto" w:fill="1F1F1F"/>
+        <w:spacing w:after="0" w:line="285" w:lineRule="atLeast"/>
+        <w:rPr>
+          <w:rFonts w:ascii="Consolas" w:eastAsia="Times New Roman" w:hAnsi="Consolas" w:cs="Times New Roman"/>
+          <w:color w:val="CCCCCC"/>
+          <w:sz w:val="21"/>
+          <w:szCs w:val="21"/>
+          <w:lang w:eastAsia="en-IN"/>
+        </w:rPr>
+      </w:pPr>
+      <w:r>
+        <w:rPr>
+          <w:rFonts w:ascii="Consolas" w:eastAsia="Times New Roman" w:hAnsi="Consolas" w:cs="Times New Roman"/>
+          <w:color w:val="CCCCCC"/>
+          <w:sz w:val="21"/>
+          <w:szCs w:val="21"/>
+          <w:lang w:eastAsia="en-IN"/>
+        </w:rPr>
+        <w:t>Ch</w:t>
+      </w:r>
+      <w:r>
+        <w:rPr>
+          <w:rFonts w:ascii="Consolas" w:eastAsia="Times New Roman" w:hAnsi="Consolas" w:cs="Times New Roman"/>
+          <w:color w:val="CCCCCC"/>
+          <w:sz w:val="21"/>
+          <w:szCs w:val="21"/>
+          <w:lang w:eastAsia="en-IN"/>
+        </w:rPr>
+        <w:t>e</w:t>
+      </w:r>
+      <w:r>
+        <w:rPr>
+          <w:rFonts w:ascii="Consolas" w:eastAsia="Times New Roman" w:hAnsi="Consolas" w:cs="Times New Roman"/>
+          <w:color w:val="CCCCCC"/>
+          <w:sz w:val="21"/>
+          <w:szCs w:val="21"/>
+          <w:lang w:eastAsia="en-IN"/>
+        </w:rPr>
+        <w:t xml:space="preserve">ck Array: </w:t>
+      </w:r>
+    </w:p>
+    <w:p>
+      <w:pPr>
+        <w:pStyle w:val="ListParagraph"/>
+        <w:shd w:val="clear" w:color="auto" w:fill="1F1F1F"/>
+        <w:spacing w:after="0" w:line="285" w:lineRule="atLeast"/>
+        <w:rPr>
+          <w:rFonts w:ascii="Consolas" w:eastAsia="Times New Roman" w:hAnsi="Consolas" w:cs="Times New Roman"/>
+          <w:color w:val="CCCCCC"/>
+          <w:sz w:val="21"/>
+          <w:szCs w:val="21"/>
+          <w:lang w:eastAsia="en-IN"/>
+        </w:rPr>
+      </w:pPr>
+      <w:r>
+        <w:rPr>
+          <w:rFonts w:ascii="Consolas" w:eastAsia="Times New Roman" w:hAnsi="Consolas" w:cs="Times New Roman"/>
+          <w:color w:val="808080"/>
+          <w:sz w:val="21"/>
+          <w:szCs w:val="21"/>
+          <w:lang w:eastAsia="en-IN"/>
+        </w:rPr>
+        <w:t>&lt;</w:t>
+      </w:r>
+      <w:r>
+        <w:rPr>
+          <w:rFonts w:ascii="Consolas" w:eastAsia="Times New Roman" w:hAnsi="Consolas" w:cs="Times New Roman"/>
+          <w:color w:val="569CD6"/>
+          <w:sz w:val="21"/>
+          <w:szCs w:val="21"/>
+          <w:lang w:eastAsia="en-IN"/>
+        </w:rPr>
+        <w:t>input</w:t>
+      </w:r>
+      <w:r>
+        <w:rPr>
+          <w:rFonts w:ascii="Consolas" w:eastAsia="Times New Roman" w:hAnsi="Consolas" w:cs="Times New Roman"/>
+          <w:color w:val="CCCCCC"/>
+          <w:sz w:val="21"/>
+          <w:szCs w:val="21"/>
+          <w:lang w:eastAsia="en-IN"/>
+        </w:rPr>
+        <w:t xml:space="preserve"> </w:t>
+      </w:r>
+      <w:r>
+        <w:rPr>
+          <w:rFonts w:ascii="Consolas" w:eastAsia="Times New Roman" w:hAnsi="Consolas" w:cs="Times New Roman"/>
+          <w:color w:val="9CDCFE"/>
+          <w:sz w:val="21"/>
+          <w:szCs w:val="21"/>
+          <w:lang w:eastAsia="en-IN"/>
+        </w:rPr>
+        <w:t>type</w:t>
+      </w:r>
+      <w:r>
+        <w:rPr>
+          <w:rFonts w:ascii="Consolas" w:eastAsia="Times New Roman" w:hAnsi="Consolas" w:cs="Times New Roman"/>
+          <w:color w:val="D4D4D4"/>
+          <w:sz w:val="21"/>
+          <w:szCs w:val="21"/>
+          <w:lang w:eastAsia="en-IN"/>
+        </w:rPr>
+        <w:t>=</w:t>
+      </w:r>
+      <w:r>
+        <w:rPr>
+          <w:rFonts w:ascii="Consolas" w:eastAsia="Times New Roman" w:hAnsi="Consolas" w:cs="Times New Roman"/>
+          <w:color w:val="CE9178"/>
+          <w:sz w:val="21"/>
+          <w:szCs w:val="21"/>
+          <w:lang w:eastAsia="en-IN"/>
+        </w:rPr>
+        <w:t>"text"</w:t>
+      </w:r>
+      <w:r>
+        <w:rPr>
+          <w:rFonts w:ascii="Consolas" w:eastAsia="Times New Roman" w:hAnsi="Consolas" w:cs="Times New Roman"/>
+          <w:color w:val="CCCCCC"/>
+          <w:sz w:val="21"/>
+          <w:szCs w:val="21"/>
+          <w:lang w:eastAsia="en-IN"/>
+        </w:rPr>
+        <w:t xml:space="preserve"> </w:t>
+      </w:r>
+      <w:r>
+        <w:rPr>
+          <w:rFonts w:ascii="Consolas" w:eastAsia="Times New Roman" w:hAnsi="Consolas" w:cs="Times New Roman"/>
+          <w:color w:val="9CDCFE"/>
+          <w:sz w:val="21"/>
+          <w:szCs w:val="21"/>
+          <w:lang w:eastAsia="en-IN"/>
+        </w:rPr>
+        <w:t>name</w:t>
+      </w:r>
+      <w:r>
+        <w:rPr>
+          <w:rFonts w:ascii="Consolas" w:eastAsia="Times New Roman" w:hAnsi="Consolas" w:cs="Times New Roman"/>
+          <w:color w:val="D4D4D4"/>
+          <w:sz w:val="21"/>
+          <w:szCs w:val="21"/>
+          <w:lang w:eastAsia="en-IN"/>
+        </w:rPr>
+        <w:t>=</w:t>
+      </w:r>
+      <w:r>
+        <w:rPr>
+          <w:rFonts w:ascii="Consolas" w:eastAsia="Times New Roman" w:hAnsi="Consolas" w:cs="Times New Roman"/>
+          <w:color w:val="569CD6"/>
+          <w:sz w:val="21"/>
+          <w:szCs w:val="21"/>
+          <w:lang w:eastAsia="en-IN"/>
+        </w:rPr>
+        <w:t>{</w:t>
+      </w:r>
+      <w:r>
+        <w:rPr>
+          <w:rFonts w:ascii="Consolas" w:eastAsia="Times New Roman" w:hAnsi="Consolas" w:cs="Times New Roman"/>
+          <w:color w:val="4FC1FF"/>
+          <w:sz w:val="21"/>
+          <w:szCs w:val="21"/>
+          <w:lang w:eastAsia="en-IN"/>
+        </w:rPr>
+        <w:t>SubArray</w:t>
+      </w:r>
+      <w:r>
+        <w:rPr>
+          <w:rFonts w:ascii="Consolas" w:eastAsia="Times New Roman" w:hAnsi="Consolas" w:cs="Times New Roman"/>
+          <w:color w:val="D4D4D4"/>
+          <w:sz w:val="21"/>
+          <w:szCs w:val="21"/>
+          <w:lang w:eastAsia="en-IN"/>
+        </w:rPr>
+        <w:t>[</w:t>
+      </w:r>
+      <w:r>
+        <w:rPr>
+          <w:rFonts w:ascii="Consolas" w:eastAsia="Times New Roman" w:hAnsi="Consolas" w:cs="Times New Roman"/>
+          <w:color w:val="B5CEA8"/>
+          <w:sz w:val="21"/>
+          <w:szCs w:val="21"/>
+          <w:lang w:eastAsia="en-IN"/>
+        </w:rPr>
+        <w:t>0</w:t>
+      </w:r>
+      <w:r>
+        <w:rPr>
+          <w:rFonts w:ascii="Consolas" w:eastAsia="Times New Roman" w:hAnsi="Consolas" w:cs="Times New Roman"/>
+          <w:color w:val="D4D4D4"/>
+          <w:sz w:val="21"/>
+          <w:szCs w:val="21"/>
+          <w:lang w:eastAsia="en-IN"/>
+        </w:rPr>
+        <w:t>]</w:t>
+      </w:r>
+      <w:r>
+        <w:rPr>
+          <w:rFonts w:ascii="Consolas" w:eastAsia="Times New Roman" w:hAnsi="Consolas" w:cs="Times New Roman"/>
+          <w:color w:val="569CD6"/>
+          <w:sz w:val="21"/>
+          <w:szCs w:val="21"/>
+          <w:lang w:eastAsia="en-IN"/>
+        </w:rPr>
+        <w:t>}</w:t>
+      </w:r>
+      <w:r>
+        <w:rPr>
+          <w:rFonts w:ascii="Consolas" w:eastAsia="Times New Roman" w:hAnsi="Consolas" w:cs="Times New Roman"/>
+          <w:color w:val="CCCCCC"/>
+          <w:sz w:val="21"/>
+          <w:szCs w:val="21"/>
+          <w:lang w:eastAsia="en-IN"/>
+        </w:rPr>
+        <w:t xml:space="preserve"> </w:t>
+      </w:r>
+      <w:r>
+        <w:rPr>
+          <w:rFonts w:ascii="Consolas" w:eastAsia="Times New Roman" w:hAnsi="Consolas" w:cs="Times New Roman"/>
+          <w:color w:val="9CDCFE"/>
+          <w:sz w:val="21"/>
+          <w:szCs w:val="21"/>
+          <w:lang w:eastAsia="en-IN"/>
+        </w:rPr>
+        <w:t>value</w:t>
+      </w:r>
+      <w:r>
+        <w:rPr>
+          <w:rFonts w:ascii="Consolas" w:eastAsia="Times New Roman" w:hAnsi="Consolas" w:cs="Times New Roman"/>
+          <w:color w:val="D4D4D4"/>
+          <w:sz w:val="21"/>
+          <w:szCs w:val="21"/>
+          <w:lang w:eastAsia="en-IN"/>
+        </w:rPr>
+        <w:t>=</w:t>
+      </w:r>
+      <w:r>
+        <w:rPr>
+          <w:rFonts w:ascii="Consolas" w:eastAsia="Times New Roman" w:hAnsi="Consolas" w:cs="Times New Roman"/>
+          <w:color w:val="569CD6"/>
+          <w:sz w:val="21"/>
+          <w:szCs w:val="21"/>
+          <w:lang w:eastAsia="en-IN"/>
+        </w:rPr>
+        <w:t>{</w:t>
+      </w:r>
+      <w:r>
+        <w:rPr>
+          <w:rFonts w:ascii="Consolas" w:eastAsia="Times New Roman" w:hAnsi="Consolas" w:cs="Times New Roman"/>
+          <w:color w:val="4FC1FF"/>
+          <w:sz w:val="21"/>
+          <w:szCs w:val="21"/>
+          <w:lang w:eastAsia="en-IN"/>
+        </w:rPr>
+        <w:t>SubArray</w:t>
+      </w:r>
+      <w:r>
+        <w:rPr>
+          <w:rFonts w:ascii="Consolas" w:eastAsia="Times New Roman" w:hAnsi="Consolas" w:cs="Times New Roman"/>
+          <w:color w:val="D4D4D4"/>
+          <w:sz w:val="21"/>
+          <w:szCs w:val="21"/>
+          <w:lang w:eastAsia="en-IN"/>
+        </w:rPr>
+        <w:t>[</w:t>
+      </w:r>
+      <w:r>
+        <w:rPr>
+          <w:rFonts w:ascii="Consolas" w:eastAsia="Times New Roman" w:hAnsi="Consolas" w:cs="Times New Roman"/>
+          <w:color w:val="B5CEA8"/>
+          <w:sz w:val="21"/>
+          <w:szCs w:val="21"/>
+          <w:lang w:eastAsia="en-IN"/>
+        </w:rPr>
+        <w:t>1</w:t>
+      </w:r>
+      <w:r>
+        <w:rPr>
+          <w:rFonts w:ascii="Consolas" w:eastAsia="Times New Roman" w:hAnsi="Consolas" w:cs="Times New Roman"/>
+          <w:color w:val="D4D4D4"/>
+          <w:sz w:val="21"/>
+          <w:szCs w:val="21"/>
+          <w:lang w:eastAsia="en-IN"/>
+        </w:rPr>
+        <w:t>]</w:t>
+      </w:r>
+      <w:r>
+        <w:rPr>
+          <w:rFonts w:ascii="Consolas" w:eastAsia="Times New Roman" w:hAnsi="Consolas" w:cs="Times New Roman"/>
+          <w:color w:val="569CD6"/>
+          <w:sz w:val="21"/>
+          <w:szCs w:val="21"/>
+          <w:lang w:eastAsia="en-IN"/>
+        </w:rPr>
+        <w:t>}</w:t>
+      </w:r>
+      <w:r>
+        <w:rPr>
+          <w:rFonts w:ascii="Consolas" w:eastAsia="Times New Roman" w:hAnsi="Consolas" w:cs="Times New Roman"/>
+          <w:color w:val="CCCCCC"/>
+          <w:sz w:val="21"/>
+          <w:szCs w:val="21"/>
+          <w:lang w:eastAsia="en-IN"/>
+        </w:rPr>
+        <w:t xml:space="preserve"> </w:t>
+      </w:r>
+      <w:r>
+        <w:rPr>
+          <w:rFonts w:ascii="Consolas" w:eastAsia="Times New Roman" w:hAnsi="Consolas" w:cs="Times New Roman"/>
+          <w:color w:val="808080"/>
+          <w:sz w:val="21"/>
+          <w:szCs w:val="21"/>
+          <w:lang w:eastAsia="en-IN"/>
+        </w:rPr>
+        <w:t>/&gt;</w:t>
+      </w:r>
+    </w:p>
+    <w:p>
+      <w:pPr>
+        <w:pStyle w:val="ListParagraph"/>
+        <w:numPr>
+          <w:ilvl w:val="1"/>
+          <w:numId w:val="4"/>
+        </w:numPr>
+        <w:rPr>
+          <w:rFonts w:cstheme="minorHAnsi"/>
+          <w:lang w:val="en-US"/>
+        </w:rPr>
+      </w:pPr>
     </w:p>
     <w:p>
       <w:pPr>
@@ -4874,37 +4921,795 @@
           <w:rFonts w:cstheme="minorHAnsi"/>
           <w:lang w:val="en-US"/>
         </w:rPr>
-        <w:t xml:space="preserve">Object and array inside </w:t>
-      </w:r>
-      <w:proofErr w:type="spellStart"/>
-      <w:r>
-        <w:rPr>
-          <w:rFonts w:cstheme="minorHAnsi"/>
-          <w:lang w:val="en-US"/>
-        </w:rPr>
-        <w:t>jsx</w:t>
-      </w:r>
-      <w:proofErr w:type="spellEnd"/>
+        <w:t>HTML tags property with jsx</w:t>
+      </w:r>
+      <w:r>
+        <w:rPr>
+          <w:rFonts w:cstheme="minorHAnsi"/>
+          <w:lang w:val="en-US"/>
+        </w:rPr>
+        <w:t>: here in img tag src, height and width are passed in curly braces</w:t>
+      </w:r>
+    </w:p>
+    <w:p>
+      <w:pPr>
+        <w:pStyle w:val="ListParagraph"/>
+        <w:numPr>
+          <w:ilvl w:val="1"/>
+          <w:numId w:val="4"/>
+        </w:numPr>
+        <w:rPr>
+          <w:rFonts w:ascii="Consolas" w:eastAsia="Times New Roman" w:hAnsi="Consolas" w:cs="Times New Roman"/>
+          <w:color w:val="808080"/>
+          <w:sz w:val="21"/>
+          <w:szCs w:val="21"/>
+          <w:lang w:eastAsia="en-IN"/>
+        </w:rPr>
+      </w:pPr>
+      <w:r>
+        <w:rPr>
+          <w:rFonts w:ascii="Consolas" w:eastAsia="Times New Roman" w:hAnsi="Consolas" w:cs="Times New Roman"/>
+          <w:color w:val="CCCCCC"/>
+          <w:sz w:val="21"/>
+          <w:szCs w:val="21"/>
+          <w:lang w:eastAsia="en-IN"/>
+        </w:rPr>
+        <w:t> </w:t>
+      </w:r>
+      <w:r>
+        <w:rPr>
+          <w:rFonts w:ascii="Consolas" w:eastAsia="Times New Roman" w:hAnsi="Consolas" w:cs="Times New Roman"/>
+          <w:color w:val="808080"/>
+          <w:sz w:val="21"/>
+          <w:szCs w:val="21"/>
+          <w:lang w:eastAsia="en-IN"/>
+        </w:rPr>
+        <w:t>&lt;img src={iamgePath} height={200} width={600}&gt;&lt;/img&gt;</w:t>
+      </w:r>
+    </w:p>
+    <w:p>
+      <w:pPr>
+        <w:ind w:left="1080"/>
+        <w:rPr>
+          <w:rFonts w:cstheme="minorHAnsi"/>
+          <w:lang w:val="en-US"/>
+        </w:rPr>
+      </w:pPr>
+    </w:p>
+    <w:p>
+      <w:pPr>
+        <w:rPr>
+          <w:rFonts w:cstheme="minorHAnsi"/>
+          <w:b/>
+          <w:lang w:val="en-US"/>
+        </w:rPr>
+      </w:pPr>
+      <w:r>
+        <w:rPr>
+          <w:rFonts w:cstheme="minorHAnsi"/>
+          <w:b/>
+          <w:lang w:val="en-US"/>
+        </w:rPr>
+        <w:t>C</w:t>
+      </w:r>
+      <w:r>
+        <w:rPr>
+          <w:rFonts w:cstheme="minorHAnsi"/>
+          <w:b/>
+          <w:lang w:val="en-US"/>
+        </w:rPr>
+        <w:t>lick event and Functional call</w:t>
+      </w:r>
+      <w:r>
+        <w:rPr>
+          <w:rFonts w:cstheme="minorHAnsi"/>
+          <w:b/>
+          <w:lang w:val="en-US"/>
+        </w:rPr>
+        <w:t>:</w:t>
+      </w:r>
     </w:p>
     <w:p>
       <w:pPr>
         <w:pStyle w:val="ListParagraph"/>
         <w:numPr>
           <w:ilvl w:val="0"/>
-          <w:numId w:val="4"/>
+          <w:numId w:val="8"/>
         </w:numPr>
         <w:rPr>
           <w:rFonts w:cstheme="minorHAnsi"/>
-          <w:lang w:val="en-US"/>
-        </w:rPr>
-      </w:pPr>
-      <w:r>
-        <w:rPr>
-          <w:rFonts w:cstheme="minorHAnsi"/>
-          <w:lang w:val="en-US"/>
-        </w:rPr>
-        <w:t>HTML tags property with jsx</w:t>
-      </w:r>
+          <w:bCs/>
+          <w:lang w:val="en-US"/>
+        </w:rPr>
+      </w:pPr>
+      <w:r>
+        <w:rPr>
+          <w:rFonts w:cstheme="minorHAnsi"/>
+          <w:bCs/>
+          <w:lang w:val="en-US"/>
+        </w:rPr>
+        <w:t>Differ between js function call and react call</w:t>
+      </w:r>
+    </w:p>
+    <w:p>
+      <w:pPr>
+        <w:pStyle w:val="ListParagraph"/>
+        <w:numPr>
+          <w:ilvl w:val="0"/>
+          <w:numId w:val="8"/>
+        </w:numPr>
+        <w:rPr>
+          <w:rFonts w:cstheme="minorHAnsi"/>
+          <w:bCs/>
+          <w:lang w:val="en-US"/>
+        </w:rPr>
+      </w:pPr>
+      <w:r>
+        <w:rPr>
+          <w:rFonts w:cstheme="minorHAnsi"/>
+          <w:bCs/>
+          <w:lang w:val="en-US"/>
+        </w:rPr>
+        <w:t>Make function</w:t>
+      </w:r>
+    </w:p>
+    <w:p>
+      <w:pPr>
+        <w:pStyle w:val="ListParagraph"/>
+        <w:numPr>
+          <w:ilvl w:val="0"/>
+          <w:numId w:val="8"/>
+        </w:numPr>
+        <w:rPr>
+          <w:rFonts w:cstheme="minorHAnsi"/>
+          <w:bCs/>
+          <w:lang w:val="en-US"/>
+        </w:rPr>
+      </w:pPr>
+      <w:r>
+        <w:rPr>
+          <w:rFonts w:cstheme="minorHAnsi"/>
+          <w:bCs/>
+          <w:lang w:val="en-US"/>
+        </w:rPr>
+        <w:t>Make button and onclick event</w:t>
+      </w:r>
+    </w:p>
+    <w:p>
+      <w:pPr>
+        <w:pStyle w:val="ListParagraph"/>
+        <w:numPr>
+          <w:ilvl w:val="0"/>
+          <w:numId w:val="8"/>
+        </w:numPr>
+        <w:rPr>
+          <w:rFonts w:cstheme="minorHAnsi"/>
+          <w:bCs/>
+          <w:lang w:val="en-US"/>
+        </w:rPr>
+      </w:pPr>
+      <w:r>
+        <w:rPr>
+          <w:rFonts w:cstheme="minorHAnsi"/>
+          <w:bCs/>
+          <w:lang w:val="en-US"/>
+        </w:rPr>
+        <w:t>Call function onClick event</w:t>
+      </w:r>
+    </w:p>
+    <w:p>
+      <w:pPr>
+        <w:pStyle w:val="ListParagraph"/>
+        <w:numPr>
+          <w:ilvl w:val="0"/>
+          <w:numId w:val="8"/>
+        </w:numPr>
+        <w:rPr>
+          <w:rFonts w:cstheme="minorHAnsi"/>
+          <w:bCs/>
+          <w:lang w:val="en-US"/>
+        </w:rPr>
+      </w:pPr>
+      <w:r>
+        <w:rPr>
+          <w:rFonts w:cstheme="minorHAnsi"/>
+          <w:bCs/>
+          <w:lang w:val="en-US"/>
+        </w:rPr>
+        <w:t>Call arrow function</w:t>
+      </w:r>
+    </w:p>
+    <w:p>
+      <w:pPr>
+        <w:pStyle w:val="ListParagraph"/>
+        <w:numPr>
+          <w:ilvl w:val="0"/>
+          <w:numId w:val="8"/>
+        </w:numPr>
+        <w:rPr>
+          <w:rFonts w:cstheme="minorHAnsi"/>
+          <w:bCs/>
+          <w:lang w:val="en-US"/>
+        </w:rPr>
+      </w:pPr>
+      <w:r>
+        <w:rPr>
+          <w:rFonts w:cstheme="minorHAnsi"/>
+          <w:bCs/>
+          <w:lang w:val="en-US"/>
+        </w:rPr>
+        <w:t>Pass Params with function call</w:t>
+      </w:r>
+    </w:p>
+    <w:p>
+      <w:pPr>
+        <w:rPr>
+          <w:rFonts w:cstheme="minorHAnsi"/>
+          <w:bCs/>
+          <w:highlight w:val="magenta"/>
+          <w:lang w:val="en-US"/>
+        </w:rPr>
+      </w:pPr>
+      <w:r>
+        <w:rPr>
+          <w:rFonts w:cstheme="minorHAnsi"/>
+          <w:bCs/>
+          <w:highlight w:val="magenta"/>
+          <w:lang w:val="en-US"/>
+        </w:rPr>
+        <w:t>Q: 2 functions, 1 inside component 1 out side , which one get called</w:t>
+      </w:r>
+    </w:p>
+    <w:p>
+      <w:pPr>
+        <w:rPr>
+          <w:rFonts w:cstheme="minorHAnsi"/>
+          <w:bCs/>
+          <w:lang w:val="en-US"/>
+        </w:rPr>
+      </w:pPr>
+      <w:r>
+        <w:rPr>
+          <w:rFonts w:cstheme="minorHAnsi"/>
+          <w:bCs/>
+          <w:highlight w:val="magenta"/>
+          <w:lang w:val="en-US"/>
+        </w:rPr>
+        <w:t>Q. if no inside component function, can outside fun get called or we will get error</w:t>
+      </w:r>
+    </w:p>
+    <w:p>
+      <w:pPr>
+        <w:rPr>
+          <w:rFonts w:cstheme="minorHAnsi"/>
+          <w:lang w:val="en-US"/>
+        </w:rPr>
+      </w:pPr>
+    </w:p>
+    <w:p>
+      <w:pPr>
+        <w:rPr>
+          <w:rFonts w:cstheme="minorHAnsi"/>
+          <w:b/>
+          <w:lang w:val="en-US"/>
+        </w:rPr>
+      </w:pPr>
+      <w:r>
+        <w:rPr>
+          <w:rFonts w:cstheme="minorHAnsi"/>
+          <w:b/>
+          <w:lang w:val="en-US"/>
+        </w:rPr>
+        <w:t>Upgrade and version check of react:</w:t>
+      </w:r>
+    </w:p>
+    <w:p>
+      <w:pPr>
+        <w:pStyle w:val="ListParagraph"/>
+        <w:numPr>
+          <w:ilvl w:val="0"/>
+          <w:numId w:val="9"/>
+        </w:numPr>
+        <w:rPr>
+          <w:rFonts w:cstheme="minorHAnsi"/>
+          <w:bCs/>
+          <w:lang w:val="en-US"/>
+        </w:rPr>
+      </w:pPr>
+      <w:r>
+        <w:rPr>
+          <w:rFonts w:cstheme="minorHAnsi"/>
+          <w:bCs/>
+          <w:lang w:val="en-US"/>
+        </w:rPr>
+        <w:t>Version get checked in package.json</w:t>
+      </w:r>
+    </w:p>
+    <w:p>
+      <w:pPr>
+        <w:pStyle w:val="ListParagraph"/>
+        <w:shd w:val="clear" w:color="auto" w:fill="1F1F1F"/>
+        <w:spacing w:after="0" w:line="285" w:lineRule="atLeast"/>
+        <w:rPr>
+          <w:rFonts w:ascii="Consolas" w:eastAsia="Times New Roman" w:hAnsi="Consolas" w:cs="Times New Roman"/>
+          <w:color w:val="CCCCCC"/>
+          <w:sz w:val="21"/>
+          <w:szCs w:val="21"/>
+          <w:lang w:eastAsia="en-IN"/>
+        </w:rPr>
+      </w:pPr>
+      <w:r>
+        <w:rPr>
+          <w:rFonts w:ascii="Consolas" w:eastAsia="Times New Roman" w:hAnsi="Consolas" w:cs="Times New Roman"/>
+          <w:color w:val="9CDCFE"/>
+          <w:sz w:val="21"/>
+          <w:szCs w:val="21"/>
+          <w:lang w:eastAsia="en-IN"/>
+        </w:rPr>
+        <w:t>"dependencies"</w:t>
+      </w:r>
+      <w:r>
+        <w:rPr>
+          <w:rFonts w:ascii="Consolas" w:eastAsia="Times New Roman" w:hAnsi="Consolas" w:cs="Times New Roman"/>
+          <w:color w:val="CCCCCC"/>
+          <w:sz w:val="21"/>
+          <w:szCs w:val="21"/>
+          <w:lang w:eastAsia="en-IN"/>
+        </w:rPr>
+        <w:t>: {</w:t>
+      </w:r>
+    </w:p>
+    <w:p>
+      <w:pPr>
+        <w:pStyle w:val="ListParagraph"/>
+        <w:shd w:val="clear" w:color="auto" w:fill="1F1F1F"/>
+        <w:spacing w:after="0" w:line="285" w:lineRule="atLeast"/>
+        <w:rPr>
+          <w:rFonts w:ascii="Consolas" w:eastAsia="Times New Roman" w:hAnsi="Consolas" w:cs="Times New Roman"/>
+          <w:color w:val="CCCCCC"/>
+          <w:sz w:val="21"/>
+          <w:szCs w:val="21"/>
+          <w:lang w:eastAsia="en-IN"/>
+        </w:rPr>
+      </w:pPr>
+      <w:r>
+        <w:rPr>
+          <w:rFonts w:ascii="Consolas" w:eastAsia="Times New Roman" w:hAnsi="Consolas" w:cs="Times New Roman"/>
+          <w:color w:val="CCCCCC"/>
+          <w:sz w:val="21"/>
+          <w:szCs w:val="21"/>
+          <w:lang w:eastAsia="en-IN"/>
+        </w:rPr>
+        <w:t xml:space="preserve">    </w:t>
+      </w:r>
+      <w:r>
+        <w:rPr>
+          <w:rFonts w:ascii="Consolas" w:eastAsia="Times New Roman" w:hAnsi="Consolas" w:cs="Times New Roman"/>
+          <w:color w:val="9CDCFE"/>
+          <w:sz w:val="21"/>
+          <w:szCs w:val="21"/>
+          <w:lang w:eastAsia="en-IN"/>
+        </w:rPr>
+        <w:t>"react"</w:t>
+      </w:r>
+      <w:r>
+        <w:rPr>
+          <w:rFonts w:ascii="Consolas" w:eastAsia="Times New Roman" w:hAnsi="Consolas" w:cs="Times New Roman"/>
+          <w:color w:val="CCCCCC"/>
+          <w:sz w:val="21"/>
+          <w:szCs w:val="21"/>
+          <w:lang w:eastAsia="en-IN"/>
+        </w:rPr>
+        <w:t xml:space="preserve">: </w:t>
+      </w:r>
+      <w:r>
+        <w:rPr>
+          <w:rFonts w:ascii="Consolas" w:eastAsia="Times New Roman" w:hAnsi="Consolas" w:cs="Times New Roman"/>
+          <w:color w:val="CE9178"/>
+          <w:sz w:val="21"/>
+          <w:szCs w:val="21"/>
+          <w:lang w:eastAsia="en-IN"/>
+        </w:rPr>
+        <w:t>"^19.2.0"</w:t>
+      </w:r>
+      <w:r>
+        <w:rPr>
+          <w:rFonts w:ascii="Consolas" w:eastAsia="Times New Roman" w:hAnsi="Consolas" w:cs="Times New Roman"/>
+          <w:color w:val="CCCCCC"/>
+          <w:sz w:val="21"/>
+          <w:szCs w:val="21"/>
+          <w:lang w:eastAsia="en-IN"/>
+        </w:rPr>
+        <w:t>,</w:t>
+      </w:r>
+    </w:p>
+    <w:p>
+      <w:pPr>
+        <w:pStyle w:val="ListParagraph"/>
+        <w:shd w:val="clear" w:color="auto" w:fill="1F1F1F"/>
+        <w:spacing w:after="0" w:line="285" w:lineRule="atLeast"/>
+        <w:rPr>
+          <w:rFonts w:ascii="Consolas" w:eastAsia="Times New Roman" w:hAnsi="Consolas" w:cs="Times New Roman"/>
+          <w:color w:val="CCCCCC"/>
+          <w:sz w:val="21"/>
+          <w:szCs w:val="21"/>
+          <w:lang w:eastAsia="en-IN"/>
+        </w:rPr>
+      </w:pPr>
+      <w:r>
+        <w:rPr>
+          <w:rFonts w:ascii="Consolas" w:eastAsia="Times New Roman" w:hAnsi="Consolas" w:cs="Times New Roman"/>
+          <w:color w:val="CCCCCC"/>
+          <w:sz w:val="21"/>
+          <w:szCs w:val="21"/>
+          <w:lang w:eastAsia="en-IN"/>
+        </w:rPr>
+        <w:t xml:space="preserve">    </w:t>
+      </w:r>
+      <w:r>
+        <w:rPr>
+          <w:rFonts w:ascii="Consolas" w:eastAsia="Times New Roman" w:hAnsi="Consolas" w:cs="Times New Roman"/>
+          <w:color w:val="9CDCFE"/>
+          <w:sz w:val="21"/>
+          <w:szCs w:val="21"/>
+          <w:lang w:eastAsia="en-IN"/>
+        </w:rPr>
+        <w:t>"react-dom"</w:t>
+      </w:r>
+      <w:r>
+        <w:rPr>
+          <w:rFonts w:ascii="Consolas" w:eastAsia="Times New Roman" w:hAnsi="Consolas" w:cs="Times New Roman"/>
+          <w:color w:val="CCCCCC"/>
+          <w:sz w:val="21"/>
+          <w:szCs w:val="21"/>
+          <w:lang w:eastAsia="en-IN"/>
+        </w:rPr>
+        <w:t xml:space="preserve">: </w:t>
+      </w:r>
+      <w:r>
+        <w:rPr>
+          <w:rFonts w:ascii="Consolas" w:eastAsia="Times New Roman" w:hAnsi="Consolas" w:cs="Times New Roman"/>
+          <w:color w:val="CE9178"/>
+          <w:sz w:val="21"/>
+          <w:szCs w:val="21"/>
+          <w:lang w:eastAsia="en-IN"/>
+        </w:rPr>
+        <w:t>"^19.2.0"</w:t>
+      </w:r>
+    </w:p>
+    <w:p>
+      <w:pPr>
+        <w:pStyle w:val="ListParagraph"/>
+        <w:shd w:val="clear" w:color="auto" w:fill="1F1F1F"/>
+        <w:spacing w:after="0" w:line="285" w:lineRule="atLeast"/>
+        <w:rPr>
+          <w:rFonts w:ascii="Consolas" w:eastAsia="Times New Roman" w:hAnsi="Consolas" w:cs="Times New Roman"/>
+          <w:color w:val="CCCCCC"/>
+          <w:sz w:val="21"/>
+          <w:szCs w:val="21"/>
+          <w:lang w:eastAsia="en-IN"/>
+        </w:rPr>
+      </w:pPr>
+      <w:r>
+        <w:rPr>
+          <w:rFonts w:ascii="Consolas" w:eastAsia="Times New Roman" w:hAnsi="Consolas" w:cs="Times New Roman"/>
+          <w:color w:val="CCCCCC"/>
+          <w:sz w:val="21"/>
+          <w:szCs w:val="21"/>
+          <w:lang w:eastAsia="en-IN"/>
+        </w:rPr>
+        <w:t>  }</w:t>
+      </w:r>
+    </w:p>
+    <w:p>
+      <w:pPr>
+        <w:pStyle w:val="ListParagraph"/>
+        <w:numPr>
+          <w:ilvl w:val="0"/>
+          <w:numId w:val="9"/>
+        </w:numPr>
+        <w:rPr>
+          <w:rFonts w:cstheme="minorHAnsi"/>
+          <w:bCs/>
+          <w:lang w:val="en-US"/>
+        </w:rPr>
+      </w:pPr>
+      <w:r>
+        <w:rPr>
+          <w:rFonts w:cstheme="minorHAnsi"/>
+          <w:bCs/>
+          <w:lang w:val="en-US"/>
+        </w:rPr>
+        <w:lastRenderedPageBreak/>
+        <w:t>Upgrade and Downgrade react version</w:t>
+      </w:r>
+    </w:p>
+    <w:p>
+      <w:pPr>
+        <w:pStyle w:val="ListParagraph"/>
+        <w:rPr>
+          <w:rFonts w:cstheme="minorHAnsi"/>
+          <w:bCs/>
+          <w:lang w:val="en-US"/>
+        </w:rPr>
+      </w:pPr>
+      <w:r>
+        <w:rPr>
+          <w:rFonts w:cstheme="minorHAnsi"/>
+          <w:bCs/>
+          <w:lang w:val="en-US"/>
+        </w:rPr>
+        <w:t xml:space="preserve">To upgrade and downgrade version, type version number in package.json then run </w:t>
+      </w:r>
+    </w:p>
+    <w:p>
+      <w:pPr>
+        <w:pStyle w:val="ListParagraph"/>
+        <w:rPr>
+          <w:rFonts w:cstheme="minorHAnsi"/>
+          <w:bCs/>
+          <w:lang w:val="en-US"/>
+        </w:rPr>
+      </w:pPr>
+      <w:r>
+        <w:rPr>
+          <w:rFonts w:cstheme="minorHAnsi"/>
+          <w:b/>
+          <w:lang w:val="en-US"/>
+        </w:rPr>
+        <w:t>npm install</w:t>
+      </w:r>
+      <w:r>
+        <w:rPr>
+          <w:rFonts w:cstheme="minorHAnsi"/>
+          <w:bCs/>
+          <w:lang w:val="en-US"/>
+        </w:rPr>
+        <w:t xml:space="preserve"> command in terminal</w:t>
+      </w:r>
+    </w:p>
+    <w:p>
+      <w:pPr>
+        <w:pStyle w:val="ListParagraph"/>
+        <w:rPr>
+          <w:rFonts w:cstheme="minorHAnsi"/>
+          <w:bCs/>
+          <w:lang w:val="en-US"/>
+        </w:rPr>
+      </w:pPr>
+      <w:r>
+        <w:rPr>
+          <w:rFonts w:cstheme="minorHAnsi"/>
+          <w:bCs/>
+          <w:lang w:val="en-US"/>
+        </w:rPr>
+        <w:t xml:space="preserve"> </w:t>
+      </w:r>
+    </w:p>
+    <w:p>
+      <w:pPr>
+        <w:rPr>
+          <w:rFonts w:cstheme="minorHAnsi"/>
+          <w:b/>
+          <w:lang w:val="en-US"/>
+        </w:rPr>
+      </w:pPr>
+      <w:r>
+        <w:rPr>
+          <w:rFonts w:cstheme="minorHAnsi"/>
+          <w:b/>
+          <w:lang w:val="en-US"/>
+        </w:rPr>
+        <w:t>State and Hooks</w:t>
+      </w:r>
+      <w:r>
+        <w:rPr>
+          <w:rFonts w:cstheme="minorHAnsi"/>
+          <w:b/>
+          <w:lang w:val="en-US"/>
+        </w:rPr>
+        <w:t>:</w:t>
+      </w:r>
+    </w:p>
+    <w:p>
+      <w:pPr>
+        <w:pStyle w:val="ListParagraph"/>
+        <w:numPr>
+          <w:ilvl w:val="0"/>
+          <w:numId w:val="10"/>
+        </w:numPr>
+        <w:rPr>
+          <w:rFonts w:cstheme="minorHAnsi"/>
+          <w:bCs/>
+          <w:lang w:val="en-US"/>
+        </w:rPr>
+      </w:pPr>
+      <w:r>
+        <w:rPr>
+          <w:rFonts w:cstheme="minorHAnsi"/>
+          <w:bCs/>
+          <w:lang w:val="en-US"/>
+        </w:rPr>
+        <w:t>Why state is required</w:t>
+      </w:r>
+    </w:p>
+    <w:p>
+      <w:pPr>
+        <w:pStyle w:val="ListParagraph"/>
+        <w:numPr>
+          <w:ilvl w:val="0"/>
+          <w:numId w:val="10"/>
+        </w:numPr>
+        <w:rPr>
+          <w:rFonts w:cstheme="minorHAnsi"/>
+          <w:bCs/>
+          <w:lang w:val="en-US"/>
+        </w:rPr>
+      </w:pPr>
+      <w:r>
+        <w:rPr>
+          <w:rFonts w:cstheme="minorHAnsi"/>
+          <w:bCs/>
+          <w:lang w:val="en-US"/>
+        </w:rPr>
+        <w:t>What is state</w:t>
+      </w:r>
+    </w:p>
+    <w:p>
+      <w:pPr>
+        <w:pStyle w:val="ListParagraph"/>
+        <w:numPr>
+          <w:ilvl w:val="0"/>
+          <w:numId w:val="10"/>
+        </w:numPr>
+        <w:rPr>
+          <w:rFonts w:cstheme="minorHAnsi"/>
+          <w:bCs/>
+          <w:lang w:val="en-US"/>
+        </w:rPr>
+      </w:pPr>
+      <w:r>
+        <w:rPr>
+          <w:rFonts w:cstheme="minorHAnsi"/>
+          <w:bCs/>
+          <w:lang w:val="en-US"/>
+        </w:rPr>
+        <w:t>What are hooks</w:t>
+      </w:r>
+    </w:p>
+    <w:p>
+      <w:pPr>
+        <w:pStyle w:val="ListParagraph"/>
+        <w:numPr>
+          <w:ilvl w:val="0"/>
+          <w:numId w:val="10"/>
+        </w:numPr>
+        <w:rPr>
+          <w:rFonts w:cstheme="minorHAnsi"/>
+          <w:bCs/>
+          <w:lang w:val="en-US"/>
+        </w:rPr>
+      </w:pPr>
+      <w:r>
+        <w:rPr>
+          <w:rFonts w:cstheme="minorHAnsi"/>
+          <w:bCs/>
+          <w:lang w:val="en-US"/>
+        </w:rPr>
+        <w:t>Use state with example</w:t>
+      </w:r>
+    </w:p>
+    <w:p>
+      <w:pPr>
+        <w:pStyle w:val="ListParagraph"/>
+        <w:numPr>
+          <w:ilvl w:val="0"/>
+          <w:numId w:val="10"/>
+        </w:numPr>
+        <w:rPr>
+          <w:rFonts w:cstheme="minorHAnsi"/>
+          <w:bCs/>
+          <w:lang w:val="en-US"/>
+        </w:rPr>
+      </w:pPr>
+      <w:r>
+        <w:rPr>
+          <w:rFonts w:cstheme="minorHAnsi"/>
+          <w:bCs/>
+          <w:lang w:val="en-US"/>
+        </w:rPr>
+        <w:t>State in different component</w:t>
+      </w:r>
+    </w:p>
+    <w:p>
+      <w:pPr>
+        <w:pStyle w:val="ListParagraph"/>
+        <w:numPr>
+          <w:ilvl w:val="0"/>
+          <w:numId w:val="10"/>
+        </w:numPr>
+        <w:rPr>
+          <w:rFonts w:cstheme="minorHAnsi"/>
+          <w:bCs/>
+          <w:lang w:val="en-US"/>
+        </w:rPr>
+      </w:pPr>
+      <w:r>
+        <w:rPr>
+          <w:rFonts w:cstheme="minorHAnsi"/>
+          <w:bCs/>
+          <w:lang w:val="en-US"/>
+        </w:rPr>
+        <w:t>Multiple states</w:t>
+      </w:r>
+    </w:p>
+    <w:p>
+      <w:pPr>
+        <w:rPr>
+          <w:rFonts w:cstheme="minorHAnsi"/>
+          <w:bCs/>
+          <w:lang w:val="en-US"/>
+        </w:rPr>
+      </w:pPr>
+    </w:p>
+    <w:p>
+      <w:pPr>
+        <w:pStyle w:val="ListParagraph"/>
+        <w:rPr>
+          <w:rFonts w:cstheme="minorHAnsi"/>
+          <w:bCs/>
+          <w:lang w:val="en-US"/>
+        </w:rPr>
+      </w:pPr>
+    </w:p>
+    <w:p>
+      <w:pPr>
+        <w:pStyle w:val="ListParagraph"/>
+        <w:rPr>
+          <w:rFonts w:cstheme="minorHAnsi"/>
+          <w:bCs/>
+          <w:lang w:val="en-US"/>
+        </w:rPr>
+      </w:pPr>
+    </w:p>
+    <w:p>
+      <w:pPr>
+        <w:pStyle w:val="ListParagraph"/>
+        <w:rPr>
+          <w:rFonts w:cstheme="minorHAnsi"/>
+          <w:bCs/>
+          <w:lang w:val="en-US"/>
+        </w:rPr>
+      </w:pPr>
+    </w:p>
+    <w:p>
+      <w:pPr>
+        <w:pStyle w:val="ListParagraph"/>
+        <w:rPr>
+          <w:rFonts w:cstheme="minorHAnsi"/>
+          <w:bCs/>
+          <w:lang w:val="en-US"/>
+        </w:rPr>
+      </w:pPr>
+    </w:p>
+    <w:p>
+      <w:pPr>
+        <w:pStyle w:val="ListParagraph"/>
+        <w:rPr>
+          <w:rFonts w:cstheme="minorHAnsi"/>
+          <w:bCs/>
+          <w:lang w:val="en-US"/>
+        </w:rPr>
+      </w:pPr>
+    </w:p>
+    <w:p>
+      <w:pPr>
+        <w:ind w:left="1080"/>
+        <w:rPr>
+          <w:rFonts w:cstheme="minorHAnsi"/>
+          <w:lang w:val="en-US"/>
+        </w:rPr>
+      </w:pPr>
     </w:p>
     <w:p>
       <w:pPr>
@@ -4997,8 +5802,186 @@
 </file>
 
 <file path=word/numbering.xml><?xml version="1.0" encoding="utf-8"?>
-<w:numbering xmlns:wpc="http://schemas.microsoft.com/office/word/2010/wordprocessingCanvas" xmlns:cx="http://schemas.microsoft.com/office/drawing/2014/chartex" xmlns:cx1="http://schemas.microsoft.com/office/drawing/2015/9/8/chartex" xmlns:mc="http://schemas.openxmlformats.org/markup-compatibility/2006" xmlns:o="urn:schemas-microsoft-com:office:office" xmlns:r="http://schemas.openxmlformats.org/officeDocument/2006/relationships" xmlns:m="http://schemas.openxmlformats.org/officeDocument/2006/math" xmlns:v="urn:schemas-microsoft-com:vml" xmlns:wp14="http://schemas.microsoft.com/office/word/2010/wordprocessingDrawing" xmlns:wp="http://schemas.openxmlformats.org/drawingml/2006/wordprocessingDrawing" xmlns:w10="urn:schemas-microsoft-com:office:word" xmlns:w="http://schemas.openxmlformats.org/wordprocessingml/2006/main" xmlns:w14="http://schemas.microsoft.com/office/word/2010/wordml" xmlns:w15="http://schemas.microsoft.com/office/word/2012/wordml" xmlns:w16se="http://schemas.microsoft.com/office/word/2015/wordml/symex" xmlns:wpg="http://schemas.microsoft.com/office/word/2010/wordprocessingGroup" xmlns:wpi="http://schemas.microsoft.com/office/word/2010/wordprocessingInk" xmlns:wne="http://schemas.microsoft.com/office/word/2006/wordml" xmlns:wps="http://schemas.microsoft.com/office/word/2010/wordprocessingShape" mc:Ignorable="w14 w15 w16se wp14">
+<w:numbering xmlns:wpc="http://schemas.microsoft.com/office/word/2010/wordprocessingCanvas" xmlns:cx="http://schemas.microsoft.com/office/drawing/2014/chartex" xmlns:cx1="http://schemas.microsoft.com/office/drawing/2015/9/8/chartex" xmlns:cx2="http://schemas.microsoft.com/office/drawing/2015/10/21/chartex" xmlns:cx3="http://schemas.microsoft.com/office/drawing/2016/5/9/chartex" xmlns:cx4="http://schemas.microsoft.com/office/drawing/2016/5/10/chartex" xmlns:cx5="http://schemas.microsoft.com/office/drawing/2016/5/11/chartex" xmlns:cx6="http://schemas.microsoft.com/office/drawing/2016/5/12/chartex" xmlns:cx7="http://schemas.microsoft.com/office/drawing/2016/5/13/chartex" xmlns:cx8="http://schemas.microsoft.com/office/drawing/2016/5/14/chartex" xmlns:mc="http://schemas.openxmlformats.org/markup-compatibility/2006" xmlns:aink="http://schemas.microsoft.com/office/drawing/2016/ink" xmlns:am3d="http://schemas.microsoft.com/office/drawing/2017/model3d" xmlns:o="urn:schemas-microsoft-com:office:office" xmlns:oel="http://schemas.microsoft.com/office/2019/extlst" xmlns:r="http://schemas.openxmlformats.org/officeDocument/2006/relationships" xmlns:m="http://schemas.openxmlformats.org/officeDocument/2006/math" xmlns:v="urn:schemas-microsoft-com:vml" xmlns:wp14="http://schemas.microsoft.com/office/word/2010/wordprocessingDrawing" xmlns:wp="http://schemas.openxmlformats.org/drawingml/2006/wordprocessingDrawing" xmlns:w10="urn:schemas-microsoft-com:office:word" xmlns:w="http://schemas.openxmlformats.org/wordprocessingml/2006/main" xmlns:w14="http://schemas.microsoft.com/office/word/2010/wordml" xmlns:w15="http://schemas.microsoft.com/office/word/2012/wordml" xmlns:w16cex="http://schemas.microsoft.com/office/word/2018/wordml/cex" xmlns:w16cid="http://schemas.microsoft.com/office/word/2016/wordml/cid" xmlns:w16="http://schemas.microsoft.com/office/word/2018/wordml" xmlns:w16du="http://schemas.microsoft.com/office/word/2023/wordml/word16du" xmlns:w16sdtdh="http://schemas.microsoft.com/office/word/2020/wordml/sdtdatahash" xmlns:w16sdtfl="http://schemas.microsoft.com/office/word/2024/wordml/sdtformatlock" xmlns:w16se="http://schemas.microsoft.com/office/word/2015/wordml/symex" xmlns:wpg="http://schemas.microsoft.com/office/word/2010/wordprocessingGroup" xmlns:wpi="http://schemas.microsoft.com/office/word/2010/wordprocessingInk" xmlns:wne="http://schemas.microsoft.com/office/word/2006/wordml" xmlns:wps="http://schemas.microsoft.com/office/word/2010/wordprocessingShape" mc:Ignorable="w14 w15 w16se w16cid w16 w16cex w16sdtdh w16sdtfl w16du wp14">
   <w:abstractNum w:abstractNumId="0" w15:restartNumberingAfterBreak="0">
+    <w:nsid w:val="004165C2"/>
+    <w:multiLevelType w:val="hybridMultilevel"/>
+    <w:tmpl w:val="110E858C"/>
+    <w:lvl w:ilvl="0" w:tplc="4009000F">
+      <w:start w:val="1"/>
+      <w:numFmt w:val="decimal"/>
+      <w:lvlText w:val="%1."/>
+      <w:lvlJc w:val="left"/>
+      <w:pPr>
+        <w:ind w:left="720" w:hanging="360"/>
+      </w:pPr>
+      <w:rPr>
+        <w:rFonts w:hint="default"/>
+      </w:rPr>
+    </w:lvl>
+    <w:lvl w:ilvl="1" w:tplc="40090019" w:tentative="1">
+      <w:start w:val="1"/>
+      <w:numFmt w:val="lowerLetter"/>
+      <w:lvlText w:val="%2."/>
+      <w:lvlJc w:val="left"/>
+      <w:pPr>
+        <w:ind w:left="1440" w:hanging="360"/>
+      </w:pPr>
+    </w:lvl>
+    <w:lvl w:ilvl="2" w:tplc="4009001B" w:tentative="1">
+      <w:start w:val="1"/>
+      <w:numFmt w:val="lowerRoman"/>
+      <w:lvlText w:val="%3."/>
+      <w:lvlJc w:val="right"/>
+      <w:pPr>
+        <w:ind w:left="2160" w:hanging="180"/>
+      </w:pPr>
+    </w:lvl>
+    <w:lvl w:ilvl="3" w:tplc="4009000F" w:tentative="1">
+      <w:start w:val="1"/>
+      <w:numFmt w:val="decimal"/>
+      <w:lvlText w:val="%4."/>
+      <w:lvlJc w:val="left"/>
+      <w:pPr>
+        <w:ind w:left="2880" w:hanging="360"/>
+      </w:pPr>
+    </w:lvl>
+    <w:lvl w:ilvl="4" w:tplc="40090019" w:tentative="1">
+      <w:start w:val="1"/>
+      <w:numFmt w:val="lowerLetter"/>
+      <w:lvlText w:val="%5."/>
+      <w:lvlJc w:val="left"/>
+      <w:pPr>
+        <w:ind w:left="3600" w:hanging="360"/>
+      </w:pPr>
+    </w:lvl>
+    <w:lvl w:ilvl="5" w:tplc="4009001B" w:tentative="1">
+      <w:start w:val="1"/>
+      <w:numFmt w:val="lowerRoman"/>
+      <w:lvlText w:val="%6."/>
+      <w:lvlJc w:val="right"/>
+      <w:pPr>
+        <w:ind w:left="4320" w:hanging="180"/>
+      </w:pPr>
+    </w:lvl>
+    <w:lvl w:ilvl="6" w:tplc="4009000F" w:tentative="1">
+      <w:start w:val="1"/>
+      <w:numFmt w:val="decimal"/>
+      <w:lvlText w:val="%7."/>
+      <w:lvlJc w:val="left"/>
+      <w:pPr>
+        <w:ind w:left="5040" w:hanging="360"/>
+      </w:pPr>
+    </w:lvl>
+    <w:lvl w:ilvl="7" w:tplc="40090019" w:tentative="1">
+      <w:start w:val="1"/>
+      <w:numFmt w:val="lowerLetter"/>
+      <w:lvlText w:val="%8."/>
+      <w:lvlJc w:val="left"/>
+      <w:pPr>
+        <w:ind w:left="5760" w:hanging="360"/>
+      </w:pPr>
+    </w:lvl>
+    <w:lvl w:ilvl="8" w:tplc="4009001B" w:tentative="1">
+      <w:start w:val="1"/>
+      <w:numFmt w:val="lowerRoman"/>
+      <w:lvlText w:val="%9."/>
+      <w:lvlJc w:val="right"/>
+      <w:pPr>
+        <w:ind w:left="6480" w:hanging="180"/>
+      </w:pPr>
+    </w:lvl>
+  </w:abstractNum>
+  <w:abstractNum w:abstractNumId="1" w15:restartNumberingAfterBreak="0">
+    <w:nsid w:val="021A503C"/>
+    <w:multiLevelType w:val="hybridMultilevel"/>
+    <w:tmpl w:val="93B2C16A"/>
+    <w:lvl w:ilvl="0" w:tplc="4009000F">
+      <w:start w:val="1"/>
+      <w:numFmt w:val="decimal"/>
+      <w:lvlText w:val="%1."/>
+      <w:lvlJc w:val="left"/>
+      <w:pPr>
+        <w:ind w:left="720" w:hanging="360"/>
+      </w:pPr>
+      <w:rPr>
+        <w:rFonts w:hint="default"/>
+      </w:rPr>
+    </w:lvl>
+    <w:lvl w:ilvl="1" w:tplc="40090019" w:tentative="1">
+      <w:start w:val="1"/>
+      <w:numFmt w:val="lowerLetter"/>
+      <w:lvlText w:val="%2."/>
+      <w:lvlJc w:val="left"/>
+      <w:pPr>
+        <w:ind w:left="1440" w:hanging="360"/>
+      </w:pPr>
+    </w:lvl>
+    <w:lvl w:ilvl="2" w:tplc="4009001B" w:tentative="1">
+      <w:start w:val="1"/>
+      <w:numFmt w:val="lowerRoman"/>
+      <w:lvlText w:val="%3."/>
+      <w:lvlJc w:val="right"/>
+      <w:pPr>
+        <w:ind w:left="2160" w:hanging="180"/>
+      </w:pPr>
+    </w:lvl>
+    <w:lvl w:ilvl="3" w:tplc="4009000F" w:tentative="1">
+      <w:start w:val="1"/>
+      <w:numFmt w:val="decimal"/>
+      <w:lvlText w:val="%4."/>
+      <w:lvlJc w:val="left"/>
+      <w:pPr>
+        <w:ind w:left="2880" w:hanging="360"/>
+      </w:pPr>
+    </w:lvl>
+    <w:lvl w:ilvl="4" w:tplc="40090019" w:tentative="1">
+      <w:start w:val="1"/>
+      <w:numFmt w:val="lowerLetter"/>
+      <w:lvlText w:val="%5."/>
+      <w:lvlJc w:val="left"/>
+      <w:pPr>
+        <w:ind w:left="3600" w:hanging="360"/>
+      </w:pPr>
+    </w:lvl>
+    <w:lvl w:ilvl="5" w:tplc="4009001B" w:tentative="1">
+      <w:start w:val="1"/>
+      <w:numFmt w:val="lowerRoman"/>
+      <w:lvlText w:val="%6."/>
+      <w:lvlJc w:val="right"/>
+      <w:pPr>
+        <w:ind w:left="4320" w:hanging="180"/>
+      </w:pPr>
+    </w:lvl>
+    <w:lvl w:ilvl="6" w:tplc="4009000F" w:tentative="1">
+      <w:start w:val="1"/>
+      <w:numFmt w:val="decimal"/>
+      <w:lvlText w:val="%7."/>
+      <w:lvlJc w:val="left"/>
+      <w:pPr>
+        <w:ind w:left="5040" w:hanging="360"/>
+      </w:pPr>
+    </w:lvl>
+    <w:lvl w:ilvl="7" w:tplc="40090019" w:tentative="1">
+      <w:start w:val="1"/>
+      <w:numFmt w:val="lowerLetter"/>
+      <w:lvlText w:val="%8."/>
+      <w:lvlJc w:val="left"/>
+      <w:pPr>
+        <w:ind w:left="5760" w:hanging="360"/>
+      </w:pPr>
+    </w:lvl>
+    <w:lvl w:ilvl="8" w:tplc="4009001B" w:tentative="1">
+      <w:start w:val="1"/>
+      <w:numFmt w:val="lowerRoman"/>
+      <w:lvlText w:val="%9."/>
+      <w:lvlJc w:val="right"/>
+      <w:pPr>
+        <w:ind w:left="6480" w:hanging="180"/>
+      </w:pPr>
+    </w:lvl>
+  </w:abstractNum>
+  <w:abstractNum w:abstractNumId="2" w15:restartNumberingAfterBreak="0">
     <w:nsid w:val="04991D19"/>
     <w:multiLevelType w:val="hybridMultilevel"/>
     <w:tmpl w:val="F26CA086"/>
@@ -5087,7 +6070,7 @@
       </w:pPr>
     </w:lvl>
   </w:abstractNum>
-  <w:abstractNum w:abstractNumId="1" w15:restartNumberingAfterBreak="0">
+  <w:abstractNum w:abstractNumId="3" w15:restartNumberingAfterBreak="0">
     <w:nsid w:val="0B415BDF"/>
     <w:multiLevelType w:val="hybridMultilevel"/>
     <w:tmpl w:val="82881586"/>
@@ -5176,7 +6159,7 @@
       </w:pPr>
     </w:lvl>
   </w:abstractNum>
-  <w:abstractNum w:abstractNumId="2" w15:restartNumberingAfterBreak="0">
+  <w:abstractNum w:abstractNumId="4" w15:restartNumberingAfterBreak="0">
     <w:nsid w:val="17BD560B"/>
     <w:multiLevelType w:val="hybridMultilevel"/>
     <w:tmpl w:val="F7620A24"/>
@@ -5192,7 +6175,7 @@
         <w:rFonts w:hint="default"/>
       </w:rPr>
     </w:lvl>
-    <w:lvl w:ilvl="1" w:tplc="40090019" w:tentative="1">
+    <w:lvl w:ilvl="1" w:tplc="40090019">
       <w:start w:val="1"/>
       <w:numFmt w:val="lowerLetter"/>
       <w:lvlText w:val="%2."/>
@@ -5265,7 +6248,96 @@
       </w:pPr>
     </w:lvl>
   </w:abstractNum>
-  <w:abstractNum w:abstractNumId="3" w15:restartNumberingAfterBreak="0">
+  <w:abstractNum w:abstractNumId="5" w15:restartNumberingAfterBreak="0">
+    <w:nsid w:val="1D395BA5"/>
+    <w:multiLevelType w:val="hybridMultilevel"/>
+    <w:tmpl w:val="84CAD162"/>
+    <w:lvl w:ilvl="0" w:tplc="4009000F">
+      <w:start w:val="1"/>
+      <w:numFmt w:val="decimal"/>
+      <w:lvlText w:val="%1."/>
+      <w:lvlJc w:val="left"/>
+      <w:pPr>
+        <w:ind w:left="720" w:hanging="360"/>
+      </w:pPr>
+      <w:rPr>
+        <w:rFonts w:hint="default"/>
+      </w:rPr>
+    </w:lvl>
+    <w:lvl w:ilvl="1" w:tplc="40090019" w:tentative="1">
+      <w:start w:val="1"/>
+      <w:numFmt w:val="lowerLetter"/>
+      <w:lvlText w:val="%2."/>
+      <w:lvlJc w:val="left"/>
+      <w:pPr>
+        <w:ind w:left="1440" w:hanging="360"/>
+      </w:pPr>
+    </w:lvl>
+    <w:lvl w:ilvl="2" w:tplc="4009001B" w:tentative="1">
+      <w:start w:val="1"/>
+      <w:numFmt w:val="lowerRoman"/>
+      <w:lvlText w:val="%3."/>
+      <w:lvlJc w:val="right"/>
+      <w:pPr>
+        <w:ind w:left="2160" w:hanging="180"/>
+      </w:pPr>
+    </w:lvl>
+    <w:lvl w:ilvl="3" w:tplc="4009000F" w:tentative="1">
+      <w:start w:val="1"/>
+      <w:numFmt w:val="decimal"/>
+      <w:lvlText w:val="%4."/>
+      <w:lvlJc w:val="left"/>
+      <w:pPr>
+        <w:ind w:left="2880" w:hanging="360"/>
+      </w:pPr>
+    </w:lvl>
+    <w:lvl w:ilvl="4" w:tplc="40090019" w:tentative="1">
+      <w:start w:val="1"/>
+      <w:numFmt w:val="lowerLetter"/>
+      <w:lvlText w:val="%5."/>
+      <w:lvlJc w:val="left"/>
+      <w:pPr>
+        <w:ind w:left="3600" w:hanging="360"/>
+      </w:pPr>
+    </w:lvl>
+    <w:lvl w:ilvl="5" w:tplc="4009001B" w:tentative="1">
+      <w:start w:val="1"/>
+      <w:numFmt w:val="lowerRoman"/>
+      <w:lvlText w:val="%6."/>
+      <w:lvlJc w:val="right"/>
+      <w:pPr>
+        <w:ind w:left="4320" w:hanging="180"/>
+      </w:pPr>
+    </w:lvl>
+    <w:lvl w:ilvl="6" w:tplc="4009000F" w:tentative="1">
+      <w:start w:val="1"/>
+      <w:numFmt w:val="decimal"/>
+      <w:lvlText w:val="%7."/>
+      <w:lvlJc w:val="left"/>
+      <w:pPr>
+        <w:ind w:left="5040" w:hanging="360"/>
+      </w:pPr>
+    </w:lvl>
+    <w:lvl w:ilvl="7" w:tplc="40090019" w:tentative="1">
+      <w:start w:val="1"/>
+      <w:numFmt w:val="lowerLetter"/>
+      <w:lvlText w:val="%8."/>
+      <w:lvlJc w:val="left"/>
+      <w:pPr>
+        <w:ind w:left="5760" w:hanging="360"/>
+      </w:pPr>
+    </w:lvl>
+    <w:lvl w:ilvl="8" w:tplc="4009001B" w:tentative="1">
+      <w:start w:val="1"/>
+      <w:numFmt w:val="lowerRoman"/>
+      <w:lvlText w:val="%9."/>
+      <w:lvlJc w:val="right"/>
+      <w:pPr>
+        <w:ind w:left="6480" w:hanging="180"/>
+      </w:pPr>
+    </w:lvl>
+  </w:abstractNum>
+  <w:abstractNum w:abstractNumId="6" w15:restartNumberingAfterBreak="0">
     <w:nsid w:val="248370ED"/>
     <w:multiLevelType w:val="hybridMultilevel"/>
     <w:tmpl w:val="375AD3BC"/>
@@ -5354,7 +6426,96 @@
       </w:pPr>
     </w:lvl>
   </w:abstractNum>
-  <w:abstractNum w:abstractNumId="4" w15:restartNumberingAfterBreak="0">
+  <w:abstractNum w:abstractNumId="7" w15:restartNumberingAfterBreak="0">
+    <w:nsid w:val="53047E40"/>
+    <w:multiLevelType w:val="hybridMultilevel"/>
+    <w:tmpl w:val="A5ECE01A"/>
+    <w:lvl w:ilvl="0" w:tplc="4009000F">
+      <w:start w:val="1"/>
+      <w:numFmt w:val="decimal"/>
+      <w:lvlText w:val="%1."/>
+      <w:lvlJc w:val="left"/>
+      <w:pPr>
+        <w:ind w:left="720" w:hanging="360"/>
+      </w:pPr>
+      <w:rPr>
+        <w:rFonts w:hint="default"/>
+      </w:rPr>
+    </w:lvl>
+    <w:lvl w:ilvl="1" w:tplc="40090019" w:tentative="1">
+      <w:start w:val="1"/>
+      <w:numFmt w:val="lowerLetter"/>
+      <w:lvlText w:val="%2."/>
+      <w:lvlJc w:val="left"/>
+      <w:pPr>
+        <w:ind w:left="1440" w:hanging="360"/>
+      </w:pPr>
+    </w:lvl>
+    <w:lvl w:ilvl="2" w:tplc="4009001B" w:tentative="1">
+      <w:start w:val="1"/>
+      <w:numFmt w:val="lowerRoman"/>
+      <w:lvlText w:val="%3."/>
+      <w:lvlJc w:val="right"/>
+      <w:pPr>
+        <w:ind w:left="2160" w:hanging="180"/>
+      </w:pPr>
+    </w:lvl>
+    <w:lvl w:ilvl="3" w:tplc="4009000F" w:tentative="1">
+      <w:start w:val="1"/>
+      <w:numFmt w:val="decimal"/>
+      <w:lvlText w:val="%4."/>
+      <w:lvlJc w:val="left"/>
+      <w:pPr>
+        <w:ind w:left="2880" w:hanging="360"/>
+      </w:pPr>
+    </w:lvl>
+    <w:lvl w:ilvl="4" w:tplc="40090019" w:tentative="1">
+      <w:start w:val="1"/>
+      <w:numFmt w:val="lowerLetter"/>
+      <w:lvlText w:val="%5."/>
+      <w:lvlJc w:val="left"/>
+      <w:pPr>
+        <w:ind w:left="3600" w:hanging="360"/>
+      </w:pPr>
+    </w:lvl>
+    <w:lvl w:ilvl="5" w:tplc="4009001B" w:tentative="1">
+      <w:start w:val="1"/>
+      <w:numFmt w:val="lowerRoman"/>
+      <w:lvlText w:val="%6."/>
+      <w:lvlJc w:val="right"/>
+      <w:pPr>
+        <w:ind w:left="4320" w:hanging="180"/>
+      </w:pPr>
+    </w:lvl>
+    <w:lvl w:ilvl="6" w:tplc="4009000F" w:tentative="1">
+      <w:start w:val="1"/>
+      <w:numFmt w:val="decimal"/>
+      <w:lvlText w:val="%7."/>
+      <w:lvlJc w:val="left"/>
+      <w:pPr>
+        <w:ind w:left="5040" w:hanging="360"/>
+      </w:pPr>
+    </w:lvl>
+    <w:lvl w:ilvl="7" w:tplc="40090019" w:tentative="1">
+      <w:start w:val="1"/>
+      <w:numFmt w:val="lowerLetter"/>
+      <w:lvlText w:val="%8."/>
+      <w:lvlJc w:val="left"/>
+      <w:pPr>
+        <w:ind w:left="5760" w:hanging="360"/>
+      </w:pPr>
+    </w:lvl>
+    <w:lvl w:ilvl="8" w:tplc="4009001B" w:tentative="1">
+      <w:start w:val="1"/>
+      <w:numFmt w:val="lowerRoman"/>
+      <w:lvlText w:val="%9."/>
+      <w:lvlJc w:val="right"/>
+      <w:pPr>
+        <w:ind w:left="6480" w:hanging="180"/>
+      </w:pPr>
+    </w:lvl>
+  </w:abstractNum>
+  <w:abstractNum w:abstractNumId="8" w15:restartNumberingAfterBreak="0">
     <w:nsid w:val="5D18332F"/>
     <w:multiLevelType w:val="hybridMultilevel"/>
     <w:tmpl w:val="C69CEA7E"/>
@@ -5443,7 +6604,7 @@
       </w:pPr>
     </w:lvl>
   </w:abstractNum>
-  <w:abstractNum w:abstractNumId="5" w15:restartNumberingAfterBreak="0">
+  <w:abstractNum w:abstractNumId="9" w15:restartNumberingAfterBreak="0">
     <w:nsid w:val="6FC65B00"/>
     <w:multiLevelType w:val="hybridMultilevel"/>
     <w:tmpl w:val="A25C266A"/>
@@ -5532,29 +6693,41 @@
       </w:pPr>
     </w:lvl>
   </w:abstractNum>
-  <w:num w:numId="1">
+  <w:num w:numId="1" w16cid:durableId="731074360">
+    <w:abstractNumId w:val="9"/>
+  </w:num>
+  <w:num w:numId="2" w16cid:durableId="854273859">
+    <w:abstractNumId w:val="3"/>
+  </w:num>
+  <w:num w:numId="3" w16cid:durableId="917786259">
+    <w:abstractNumId w:val="2"/>
+  </w:num>
+  <w:num w:numId="4" w16cid:durableId="1820029549">
+    <w:abstractNumId w:val="4"/>
+  </w:num>
+  <w:num w:numId="5" w16cid:durableId="150028847">
+    <w:abstractNumId w:val="8"/>
+  </w:num>
+  <w:num w:numId="6" w16cid:durableId="1875776695">
+    <w:abstractNumId w:val="6"/>
+  </w:num>
+  <w:num w:numId="7" w16cid:durableId="1591769801">
+    <w:abstractNumId w:val="7"/>
+  </w:num>
+  <w:num w:numId="8" w16cid:durableId="620577607">
     <w:abstractNumId w:val="5"/>
   </w:num>
-  <w:num w:numId="2">
-    <w:abstractNumId w:val="1"/>
-  </w:num>
-  <w:num w:numId="3">
+  <w:num w:numId="9" w16cid:durableId="1629360318">
     <w:abstractNumId w:val="0"/>
   </w:num>
-  <w:num w:numId="4">
-    <w:abstractNumId w:val="2"/>
-  </w:num>
-  <w:num w:numId="5">
-    <w:abstractNumId w:val="4"/>
-  </w:num>
-  <w:num w:numId="6">
-    <w:abstractNumId w:val="3"/>
+  <w:num w:numId="10" w16cid:durableId="1661076017">
+    <w:abstractNumId w:val="1"/>
   </w:num>
 </w:numbering>
 </file>
 
 <file path=word/styles.xml><?xml version="1.0" encoding="utf-8"?>
-<w:styles xmlns:mc="http://schemas.openxmlformats.org/markup-compatibility/2006" xmlns:r="http://schemas.openxmlformats.org/officeDocument/2006/relationships" xmlns:w="http://schemas.openxmlformats.org/wordprocessingml/2006/main" xmlns:w14="http://schemas.microsoft.com/office/word/2010/wordml" xmlns:w15="http://schemas.microsoft.com/office/word/2012/wordml" xmlns:w16se="http://schemas.microsoft.com/office/word/2015/wordml/symex" mc:Ignorable="w14 w15 w16se">
+<w:styles xmlns:mc="http://schemas.openxmlformats.org/markup-compatibility/2006" xmlns:r="http://schemas.openxmlformats.org/officeDocument/2006/relationships" xmlns:w="http://schemas.openxmlformats.org/wordprocessingml/2006/main" xmlns:w14="http://schemas.microsoft.com/office/word/2010/wordml" xmlns:w15="http://schemas.microsoft.com/office/word/2012/wordml" xmlns:w16cex="http://schemas.microsoft.com/office/word/2018/wordml/cex" xmlns:w16cid="http://schemas.microsoft.com/office/word/2016/wordml/cid" xmlns:w16="http://schemas.microsoft.com/office/word/2018/wordml" xmlns:w16du="http://schemas.microsoft.com/office/word/2023/wordml/word16du" xmlns:w16sdtdh="http://schemas.microsoft.com/office/word/2020/wordml/sdtdatahash" xmlns:w16sdtfl="http://schemas.microsoft.com/office/word/2024/wordml/sdtformatlock" xmlns:w16se="http://schemas.microsoft.com/office/word/2015/wordml/symex" mc:Ignorable="w14 w15 w16se w16cid w16 w16cex w16sdtdh w16sdtfl w16du">
   <w:docDefaults>
     <w:rPrDefault>
       <w:rPr>
@@ -5570,7 +6743,7 @@
       </w:pPr>
     </w:pPrDefault>
   </w:docDefaults>
-  <w:latentStyles w:defLockedState="0" w:defUIPriority="99" w:defSemiHidden="0" w:defUnhideWhenUsed="0" w:defQFormat="0" w:count="371">
+  <w:latentStyles w:defLockedState="0" w:defUIPriority="99" w:defSemiHidden="0" w:defUnhideWhenUsed="0" w:defQFormat="0" w:count="376">
     <w:lsdException w:name="Normal" w:uiPriority="0" w:qFormat="1"/>
     <w:lsdException w:name="heading 1" w:uiPriority="9" w:qFormat="1"/>
     <w:lsdException w:name="heading 2" w:semiHidden="1" w:uiPriority="9" w:unhideWhenUsed="1" w:qFormat="1"/>
@@ -5942,6 +7115,11 @@
     <w:lsdException w:name="List Table 5 Dark Accent 6" w:uiPriority="50"/>
     <w:lsdException w:name="List Table 6 Colorful Accent 6" w:uiPriority="51"/>
     <w:lsdException w:name="List Table 7 Colorful Accent 6" w:uiPriority="52"/>
+    <w:lsdException w:name="Mention" w:semiHidden="1" w:unhideWhenUsed="1"/>
+    <w:lsdException w:name="Smart Hyperlink" w:semiHidden="1" w:unhideWhenUsed="1"/>
+    <w:lsdException w:name="Hashtag" w:semiHidden="1" w:unhideWhenUsed="1"/>
+    <w:lsdException w:name="Unresolved Mention" w:semiHidden="1" w:unhideWhenUsed="1"/>
+    <w:lsdException w:name="Smart Link" w:semiHidden="1" w:unhideWhenUsed="1"/>
   </w:latentStyles>
   <w:style w:type="paragraph" w:default="1" w:styleId="Normal">
     <w:name w:val="Normal"/>

</xml_diff>